<commit_message>
Add Gemini AI to filter chat messages for inappropriate content
Integrates Gemini AI via the google-genai SDK to moderate chat messages, with fallback to pass-through mode if the API key is not set or the API call fails. Updates project documentation and setup instructions accordingly.

Replit-Commit-Author: Agent
Replit-Commit-Session-Id: 641331f1-7209-4bb4-a5dd-564b2ee3a54a
Replit-Commit-Checkpoint-Type: full_checkpoint
Replit-Commit-Event-Id: 6c36d532-41d9-4695-a7eb-611d78655a12
Replit-Helium-Checkpoint-Created: true
</commit_message>
<xml_diff>
--- a/blackjack/תיק_פרויקט.docx
+++ b/blackjack/תיק_פרויקט.docx
@@ -11093,6 +11093,652 @@
     <w:p>
       <w:pPr>
         <w:bidi w:val="1"/>
+        <w:pStyle w:val="Heading3"/>
+        <w:jc w:val="right"/>
+        <w:spacing w:before="100" w:after="40"/>
+      </w:pPr>
+      <w:r>
+        <w:rPr>
+          <w:rFonts w:ascii="Arial" w:hAnsi="Arial"/>
+          <w:rtl w:val="1"/>
+          <w:cs/>
+        </w:rPr>
+        <w:t>2.4.5 סינון צ'אט בזמן אמת באמצעות Gemini AI</w:t>
+      </w:r>
+    </w:p>
+    <w:p>
+      <w:pPr>
+        <w:bidi w:val="1"/>
+        <w:jc w:val="right"/>
+        <w:spacing w:before="20" w:after="60" w:line="276" w:lineRule="auto"/>
+      </w:pPr>
+      <w:r>
+        <w:rPr>
+          <w:rFonts w:ascii="Arial" w:hAnsi="Arial"/>
+          <w:b/>
+          <w:color w:val="0A4D1F"/>
+          <w:sz w:val="22"/>
+          <w:rtl w:val="1"/>
+          <w:cs/>
+        </w:rPr>
+        <w:t>הבעיה:</w:t>
+      </w:r>
+      <w:r>
+        <w:rPr>
+          <w:rFonts w:ascii="Arial" w:hAnsi="Arial"/>
+          <w:sz w:val="22"/>
+          <w:rtl w:val="1"/>
+          <w:cs/>
+        </w:rPr>
+        <w:t xml:space="preserve"> שחקנים בסביבה מרובת משתתפים עלולים לשלוח הודעות פוגעניות, גסות או שנאתיות בצ'אט. סינון מבוסס רשימות מילים שחורות קשיח ולא מספיק — הוא מחמיץ ניסוחים יצירתיים ומייצר חיובי כוזב על מילים תמימות.</w:t>
+      </w:r>
+    </w:p>
+    <w:p>
+      <w:pPr>
+        <w:bidi w:val="1"/>
+        <w:jc w:val="right"/>
+        <w:spacing w:before="20" w:after="60" w:line="276" w:lineRule="auto"/>
+      </w:pPr>
+      <w:r>
+        <w:rPr>
+          <w:rFonts w:ascii="Arial" w:hAnsi="Arial"/>
+          <w:b/>
+          <w:color w:val="0A4D1F"/>
+          <w:sz w:val="22"/>
+          <w:rtl w:val="1"/>
+          <w:cs/>
+        </w:rPr>
+        <w:t>פתרונות קיימים:</w:t>
+      </w:r>
+    </w:p>
+    <w:p>
+      <w:pPr>
+        <w:bidi w:val="1"/>
+        <w:pStyle w:val="ListBullet"/>
+        <w:jc w:val="right"/>
+        <w:spacing w:before="20" w:after="20" w:line="252" w:lineRule="auto"/>
+      </w:pPr>
+      <w:r>
+        <w:rPr>
+          <w:rFonts w:ascii="Arial" w:hAnsi="Arial"/>
+          <w:sz w:val="22"/>
+          <w:rtl w:val="1"/>
+          <w:cs/>
+        </w:rPr>
+        <w:t>רשימת מילים שחורות (blocklist) — פשוטה, אך בקלות עוקפת; אינה מבינה הקשר.</w:t>
+      </w:r>
+    </w:p>
+    <w:p>
+      <w:pPr>
+        <w:bidi w:val="1"/>
+        <w:pStyle w:val="ListBullet"/>
+        <w:jc w:val="right"/>
+        <w:spacing w:before="20" w:after="20" w:line="252" w:lineRule="auto"/>
+      </w:pPr>
+      <w:r>
+        <w:rPr>
+          <w:rFonts w:ascii="Arial" w:hAnsi="Arial"/>
+          <w:sz w:val="22"/>
+          <w:rtl w:val="1"/>
+          <w:cs/>
+        </w:rPr>
+        <w:t>מודל NLP ייעודי לסיווג תוכן (למשל Perspective API) — מדויק, אך דורש אינטגרציה נפרדת ומפתח API נוסף.</w:t>
+      </w:r>
+    </w:p>
+    <w:p>
+      <w:pPr>
+        <w:bidi w:val="1"/>
+        <w:pStyle w:val="ListBullet"/>
+        <w:jc w:val="right"/>
+        <w:spacing w:before="20" w:after="20" w:line="252" w:lineRule="auto"/>
+      </w:pPr>
+      <w:r>
+        <w:rPr>
+          <w:rFonts w:ascii="Arial" w:hAnsi="Arial"/>
+          <w:sz w:val="22"/>
+          <w:rtl w:val="1"/>
+          <w:cs/>
+        </w:rPr>
+        <w:t>מודל שפה כללי (LLM) — מבין הקשר, ניבים, עברית ואנגלית גם יחד.</w:t>
+      </w:r>
+    </w:p>
+    <w:p>
+      <w:pPr>
+        <w:bidi w:val="1"/>
+        <w:jc w:val="right"/>
+        <w:spacing w:before="20" w:after="60" w:line="276" w:lineRule="auto"/>
+      </w:pPr>
+      <w:r>
+        <w:rPr>
+          <w:rFonts w:ascii="Arial" w:hAnsi="Arial"/>
+          <w:b/>
+          <w:color w:val="0A4D1F"/>
+          <w:sz w:val="22"/>
+          <w:rtl w:val="1"/>
+          <w:cs/>
+        </w:rPr>
+        <w:t>הפתרון שנבחר:</w:t>
+      </w:r>
+      <w:r>
+        <w:rPr>
+          <w:rFonts w:ascii="Arial" w:hAnsi="Arial"/>
+          <w:sz w:val="22"/>
+          <w:rtl w:val="1"/>
+          <w:cs/>
+        </w:rPr>
+        <w:t xml:space="preserve"> </w:t>
+      </w:r>
+      <w:r>
+        <w:rPr>
+          <w:rFonts w:ascii="Arial" w:hAnsi="Arial"/>
+          <w:b/>
+          <w:color w:val="0A4D1F"/>
+          <w:sz w:val="22"/>
+          <w:rtl w:val="1"/>
+          <w:cs/>
+        </w:rPr>
+        <w:t>Gemini 2.0 Flash</w:t>
+      </w:r>
+      <w:r>
+        <w:rPr>
+          <w:rFonts w:ascii="Arial" w:hAnsi="Arial"/>
+          <w:sz w:val="22"/>
+          <w:rtl w:val="1"/>
+          <w:cs/>
+        </w:rPr>
+        <w:t xml:space="preserve"> דרך ה‑SDK הרשמי של Google (</w:t>
+      </w:r>
+      <w:r>
+        <w:rPr>
+          <w:rFonts w:ascii="Courier New" w:hAnsi="Courier New"/>
+          <w:color w:val="1A331F"/>
+          <w:sz w:val="19"/>
+          <w:rtl w:val="1"/>
+          <w:cs/>
+        </w:rPr>
+        <w:t>google-genai</w:t>
+      </w:r>
+      <w:r>
+        <w:rPr>
+          <w:rFonts w:ascii="Arial" w:hAnsi="Arial"/>
+          <w:sz w:val="22"/>
+          <w:rtl w:val="1"/>
+          <w:cs/>
+        </w:rPr>
+        <w:t>). הבחירה ב‑Flash (ולא ב‑Pro) מטעמי מהירות ועלות: מדובר בבקשה קצרה (שאלת סיווג בינארית) שצריכה תשובה מהירה כדי לא לעכב את הצ'אט. השרת שולח את הודעת הצ'אט עם ה‑system prompt הבא:</w:t>
+      </w:r>
+    </w:p>
+    <w:p>
+      <w:pPr>
+        <w:bidi w:val="1"/>
+        <w:jc w:val="right"/>
+        <w:shd w:val="clear" w:color="auto" w:fill="EDF8F1"/>
+        <w:ind w:right="360" w:left="360"/>
+        <w:spacing w:before="60" w:after="60"/>
+      </w:pPr>
+      <w:r>
+        <w:rPr>
+          <w:rFonts w:ascii="Arial" w:hAnsi="Arial"/>
+          <w:i/>
+          <w:color w:val="0A4D1F"/>
+          <w:sz w:val="20"/>
+          <w:rtl w:val="1"/>
+          <w:cs/>
+        </w:rPr>
+        <w:t>❝  *"You are a strict content moderation assistant for an online multiplayer card game. Your only task is to decide whether a player chat message contains vulgar, hateful, sexually explicit, racist, threatening, or otherwise offensive content. Reply with exactly one word: ALLOW or BLOCK."*</w:t>
+      </w:r>
+    </w:p>
+    <w:p>
+      <w:pPr>
+        <w:bidi w:val="1"/>
+        <w:jc w:val="right"/>
+        <w:spacing w:before="20" w:after="60" w:line="276" w:lineRule="auto"/>
+      </w:pPr>
+      <w:r>
+        <w:rPr>
+          <w:rFonts w:ascii="Arial" w:hAnsi="Arial"/>
+          <w:sz w:val="22"/>
+          <w:rtl w:val="1"/>
+          <w:cs/>
+        </w:rPr>
+        <w:t xml:space="preserve">Gemini מחזיר </w:t>
+      </w:r>
+      <w:r>
+        <w:rPr>
+          <w:rFonts w:ascii="Courier New" w:hAnsi="Courier New"/>
+          <w:color w:val="1A331F"/>
+          <w:sz w:val="19"/>
+          <w:rtl w:val="1"/>
+          <w:cs/>
+        </w:rPr>
+        <w:t>ALLOW</w:t>
+      </w:r>
+      <w:r>
+        <w:rPr>
+          <w:rFonts w:ascii="Arial" w:hAnsi="Arial"/>
+          <w:sz w:val="22"/>
+          <w:rtl w:val="1"/>
+          <w:cs/>
+        </w:rPr>
+        <w:t xml:space="preserve"> או </w:t>
+      </w:r>
+      <w:r>
+        <w:rPr>
+          <w:rFonts w:ascii="Courier New" w:hAnsi="Courier New"/>
+          <w:color w:val="1A331F"/>
+          <w:sz w:val="19"/>
+          <w:rtl w:val="1"/>
+          <w:cs/>
+        </w:rPr>
+        <w:t>BLOCK</w:t>
+      </w:r>
+      <w:r>
+        <w:rPr>
+          <w:rFonts w:ascii="Arial" w:hAnsi="Arial"/>
+          <w:sz w:val="22"/>
+          <w:rtl w:val="1"/>
+          <w:cs/>
+        </w:rPr>
+        <w:t xml:space="preserve">. אם הוחזר </w:t>
+      </w:r>
+      <w:r>
+        <w:rPr>
+          <w:rFonts w:ascii="Courier New" w:hAnsi="Courier New"/>
+          <w:color w:val="1A331F"/>
+          <w:sz w:val="19"/>
+          <w:rtl w:val="1"/>
+          <w:cs/>
+        </w:rPr>
+        <w:t>BLOCK</w:t>
+      </w:r>
+      <w:r>
+        <w:rPr>
+          <w:rFonts w:ascii="Arial" w:hAnsi="Arial"/>
+          <w:sz w:val="22"/>
+          <w:rtl w:val="1"/>
+          <w:cs/>
+        </w:rPr>
+        <w:t xml:space="preserve"> — השרת שולח הודעת שגיאה </w:t>
+      </w:r>
+      <w:r>
+        <w:rPr>
+          <w:rFonts w:ascii="Arial" w:hAnsi="Arial"/>
+          <w:b/>
+          <w:color w:val="0A4D1F"/>
+          <w:sz w:val="22"/>
+          <w:rtl w:val="1"/>
+          <w:cs/>
+        </w:rPr>
+        <w:t>רק לשולח</w:t>
+      </w:r>
+      <w:r>
+        <w:rPr>
+          <w:rFonts w:ascii="Arial" w:hAnsi="Arial"/>
+          <w:sz w:val="22"/>
+          <w:rtl w:val="1"/>
+          <w:cs/>
+        </w:rPr>
+        <w:t xml:space="preserve"> ("הודעתך נחסמה בשל תוכן פוגעני") ואינו משדר את ההודעה לשאר השחקנים.</w:t>
+      </w:r>
+    </w:p>
+    <w:p>
+      <w:pPr>
+        <w:bidi w:val="1"/>
+        <w:jc w:val="right"/>
+        <w:spacing w:before="20" w:after="60" w:line="276" w:lineRule="auto"/>
+      </w:pPr>
+      <w:r>
+        <w:rPr>
+          <w:rFonts w:ascii="Arial" w:hAnsi="Arial"/>
+          <w:b/>
+          <w:color w:val="0A4D1F"/>
+          <w:sz w:val="22"/>
+          <w:rtl w:val="1"/>
+          <w:cs/>
+        </w:rPr>
+        <w:t>עמידות לכשלים:</w:t>
+      </w:r>
+      <w:r>
+        <w:rPr>
+          <w:rFonts w:ascii="Arial" w:hAnsi="Arial"/>
+          <w:sz w:val="22"/>
+          <w:rtl w:val="1"/>
+          <w:cs/>
+        </w:rPr>
+        <w:t xml:space="preserve"> אם מפתח ה‑API אינו מוגדר, או אם קריאת ה‑API נכשלת (שגיאת רשת, חריגת מכסה וכו'), ה‑</w:t>
+      </w:r>
+      <w:r>
+        <w:rPr>
+          <w:rFonts w:ascii="Courier New" w:hAnsi="Courier New"/>
+          <w:color w:val="1A331F"/>
+          <w:sz w:val="19"/>
+          <w:rtl w:val="1"/>
+          <w:cs/>
+        </w:rPr>
+        <w:t>ChatModerator</w:t>
+      </w:r>
+      <w:r>
+        <w:rPr>
+          <w:rFonts w:ascii="Arial" w:hAnsi="Arial"/>
+          <w:sz w:val="22"/>
+          <w:rtl w:val="1"/>
+          <w:cs/>
+        </w:rPr>
+        <w:t xml:space="preserve"> עובר אוטומטית ל‑</w:t>
+      </w:r>
+      <w:r>
+        <w:rPr>
+          <w:rFonts w:ascii="Arial" w:hAnsi="Arial"/>
+          <w:b/>
+          <w:color w:val="0A4D1F"/>
+          <w:sz w:val="22"/>
+          <w:rtl w:val="1"/>
+          <w:cs/>
+        </w:rPr>
+        <w:t>pass-through mode</w:t>
+      </w:r>
+      <w:r>
+        <w:rPr>
+          <w:rFonts w:ascii="Arial" w:hAnsi="Arial"/>
+          <w:sz w:val="22"/>
+          <w:rtl w:val="1"/>
+          <w:cs/>
+        </w:rPr>
+        <w:t xml:space="preserve"> — ההודעה עוברת כרגיל ורישום אזהרה מופיע בלוג השרת. כך המשחק נשאר פעיל גם ללא חיבור ל‑Gemini.</w:t>
+      </w:r>
+    </w:p>
+    <w:p>
+      <w:pPr>
+        <w:bidi w:val="1"/>
+        <w:jc w:val="right"/>
+        <w:spacing w:before="20" w:after="60" w:line="276" w:lineRule="auto"/>
+      </w:pPr>
+      <w:r>
+        <w:rPr>
+          <w:rFonts w:ascii="Arial" w:hAnsi="Arial"/>
+          <w:b/>
+          <w:color w:val="0A4D1F"/>
+          <w:sz w:val="22"/>
+          <w:rtl w:val="1"/>
+          <w:cs/>
+        </w:rPr>
+        <w:t>קובץ:</w:t>
+      </w:r>
+      <w:r>
+        <w:rPr>
+          <w:rFonts w:ascii="Arial" w:hAnsi="Arial"/>
+          <w:sz w:val="22"/>
+          <w:rtl w:val="1"/>
+          <w:cs/>
+        </w:rPr>
+        <w:t xml:space="preserve"> </w:t>
+      </w:r>
+      <w:r>
+        <w:rPr>
+          <w:rFonts w:ascii="Courier New" w:hAnsi="Courier New"/>
+          <w:color w:val="1A331F"/>
+          <w:sz w:val="19"/>
+          <w:rtl w:val="1"/>
+          <w:cs/>
+        </w:rPr>
+        <w:t>server/chat_moderator.py</w:t>
+      </w:r>
+      <w:r>
+        <w:rPr>
+          <w:rFonts w:ascii="Arial" w:hAnsi="Arial"/>
+          <w:sz w:val="22"/>
+          <w:rtl w:val="1"/>
+          <w:cs/>
+        </w:rPr>
+        <w:t xml:space="preserve"> → מחלקה </w:t>
+      </w:r>
+      <w:r>
+        <w:rPr>
+          <w:rFonts w:ascii="Courier New" w:hAnsi="Courier New"/>
+          <w:color w:val="1A331F"/>
+          <w:sz w:val="19"/>
+          <w:rtl w:val="1"/>
+          <w:cs/>
+        </w:rPr>
+        <w:t>ChatModerator</w:t>
+      </w:r>
+      <w:r>
+        <w:rPr>
+          <w:rFonts w:ascii="Arial" w:hAnsi="Arial"/>
+          <w:sz w:val="22"/>
+          <w:rtl w:val="1"/>
+          <w:cs/>
+        </w:rPr>
+        <w:t xml:space="preserve">, מתודה </w:t>
+      </w:r>
+      <w:r>
+        <w:rPr>
+          <w:rFonts w:ascii="Courier New" w:hAnsi="Courier New"/>
+          <w:color w:val="1A331F"/>
+          <w:sz w:val="19"/>
+          <w:rtl w:val="1"/>
+          <w:cs/>
+        </w:rPr>
+        <w:t>check(message) -&gt; (allowed, reason)</w:t>
+      </w:r>
+      <w:r>
+        <w:rPr>
+          <w:rFonts w:ascii="Arial" w:hAnsi="Arial"/>
+          <w:sz w:val="22"/>
+          <w:rtl w:val="1"/>
+          <w:cs/>
+        </w:rPr>
+        <w:t>.</w:t>
+      </w:r>
+    </w:p>
+    <w:p>
+      <w:pPr>
+        <w:bidi w:val="1"/>
+        <w:jc w:val="right"/>
+        <w:spacing w:before="20" w:after="60" w:line="276" w:lineRule="auto"/>
+      </w:pPr>
+      <w:r>
+        <w:rPr>
+          <w:rFonts w:ascii="Arial" w:hAnsi="Arial"/>
+          <w:b/>
+          <w:color w:val="0A4D1F"/>
+          <w:sz w:val="22"/>
+          <w:rtl w:val="1"/>
+          <w:cs/>
+        </w:rPr>
+        <w:t>אינטגרציה ב‑`server/client_handler.py`:</w:t>
+      </w:r>
+    </w:p>
+    <w:tbl>
+      <w:tblPr>
+        <w:tblStyle w:val="TableGrid"/>
+        <w:tblW w:type="auto" w:w="0"/>
+        <w:jc w:val="center"/>
+        <w:tblLook w:firstColumn="1" w:firstRow="1" w:lastColumn="0" w:lastRow="0" w:noHBand="0" w:noVBand="1" w:val="04A0"/>
+      </w:tblPr>
+      <w:tblGrid>
+        <w:gridCol w:w="9072"/>
+      </w:tblGrid>
+      <w:tr>
+        <w:tc>
+          <w:tcPr>
+            <w:tcW w:type="dxa" w:w="9638"/>
+            <w:shd w:val="clear" w:color="auto" w:fill="F0F4F1"/>
+          </w:tcPr>
+          <w:p>
+            <w:pPr>
+              <w:jc w:val="left"/>
+              <w:spacing w:before="0" w:after="0" w:line="220" w:lineRule="auto"/>
+            </w:pPr>
+            <w:r>
+              <w:rPr>
+                <w:rFonts w:ascii="Courier New" w:hAnsi="Courier New"/>
+                <w:color w:val="1A331F"/>
+                <w:sz w:val="17"/>
+              </w:rPr>
+              <w:t>allowed, reason = _moderator.check(text)</w:t>
+            </w:r>
+          </w:p>
+        </w:tc>
+      </w:tr>
+      <w:tr>
+        <w:tc>
+          <w:tcPr>
+            <w:tcW w:type="dxa" w:w="9638"/>
+            <w:shd w:val="clear" w:color="auto" w:fill="F0F4F1"/>
+          </w:tcPr>
+          <w:p>
+            <w:pPr>
+              <w:jc w:val="left"/>
+              <w:spacing w:before="0" w:after="0" w:line="220" w:lineRule="auto"/>
+            </w:pPr>
+            <w:r>
+              <w:rPr>
+                <w:rFonts w:ascii="Courier New" w:hAnsi="Courier New"/>
+                <w:color w:val="1A331F"/>
+                <w:sz w:val="17"/>
+              </w:rPr>
+              <w:t>if not allowed:</w:t>
+            </w:r>
+          </w:p>
+        </w:tc>
+      </w:tr>
+      <w:tr>
+        <w:tc>
+          <w:tcPr>
+            <w:tcW w:type="dxa" w:w="9638"/>
+            <w:shd w:val="clear" w:color="auto" w:fill="F0F4F1"/>
+          </w:tcPr>
+          <w:p>
+            <w:pPr>
+              <w:jc w:val="left"/>
+              <w:spacing w:before="0" w:after="0" w:line="220" w:lineRule="auto"/>
+            </w:pPr>
+            <w:r>
+              <w:rPr>
+                <w:rFonts w:ascii="Courier New" w:hAnsi="Courier New"/>
+                <w:color w:val="1A331F"/>
+                <w:sz w:val="17"/>
+              </w:rPr>
+              <w:t xml:space="preserve">    self.send("error", {"message": reason})</w:t>
+            </w:r>
+          </w:p>
+        </w:tc>
+      </w:tr>
+      <w:tr>
+        <w:tc>
+          <w:tcPr>
+            <w:tcW w:type="dxa" w:w="9638"/>
+            <w:shd w:val="clear" w:color="auto" w:fill="F0F4F1"/>
+          </w:tcPr>
+          <w:p>
+            <w:pPr>
+              <w:jc w:val="left"/>
+              <w:spacing w:before="0" w:after="0" w:line="220" w:lineRule="auto"/>
+            </w:pPr>
+            <w:r>
+              <w:rPr>
+                <w:rFonts w:ascii="Courier New" w:hAnsi="Courier New"/>
+                <w:color w:val="1A331F"/>
+                <w:sz w:val="17"/>
+              </w:rPr>
+              <w:t>else:</w:t>
+            </w:r>
+          </w:p>
+        </w:tc>
+      </w:tr>
+      <w:tr>
+        <w:tc>
+          <w:tcPr>
+            <w:tcW w:type="dxa" w:w="9638"/>
+            <w:shd w:val="clear" w:color="auto" w:fill="F0F4F1"/>
+          </w:tcPr>
+          <w:p>
+            <w:pPr>
+              <w:jc w:val="left"/>
+              <w:spacing w:before="0" w:after="0" w:line="220" w:lineRule="auto"/>
+            </w:pPr>
+            <w:r>
+              <w:rPr>
+                <w:rFonts w:ascii="Courier New" w:hAnsi="Courier New"/>
+                <w:color w:val="1A331F"/>
+                <w:sz w:val="17"/>
+              </w:rPr>
+              <w:t xml:space="preserve">    self._server.handle_chat(self, text)</w:t>
+            </w:r>
+          </w:p>
+        </w:tc>
+      </w:tr>
+    </w:tbl>
+    <w:p/>
+    <w:p>
+      <w:pPr>
+        <w:bidi w:val="1"/>
+        <w:jc w:val="right"/>
+        <w:spacing w:before="20" w:after="60" w:line="276" w:lineRule="auto"/>
+      </w:pPr>
+      <w:r>
+        <w:rPr>
+          <w:rFonts w:ascii="Arial" w:hAnsi="Arial"/>
+          <w:b/>
+          <w:color w:val="0A4D1F"/>
+          <w:sz w:val="22"/>
+          <w:rtl w:val="1"/>
+          <w:cs/>
+        </w:rPr>
+        <w:t>משתנה סביבה נדרש:</w:t>
+      </w:r>
+      <w:r>
+        <w:rPr>
+          <w:rFonts w:ascii="Arial" w:hAnsi="Arial"/>
+          <w:sz w:val="22"/>
+          <w:rtl w:val="1"/>
+          <w:cs/>
+        </w:rPr>
+        <w:t xml:space="preserve"> </w:t>
+      </w:r>
+      <w:r>
+        <w:rPr>
+          <w:rFonts w:ascii="Courier New" w:hAnsi="Courier New"/>
+          <w:color w:val="1A331F"/>
+          <w:sz w:val="19"/>
+          <w:rtl w:val="1"/>
+          <w:cs/>
+        </w:rPr>
+        <w:t>GEMINI_API_KEY</w:t>
+      </w:r>
+      <w:r>
+        <w:rPr>
+          <w:rFonts w:ascii="Arial" w:hAnsi="Arial"/>
+          <w:sz w:val="22"/>
+          <w:rtl w:val="1"/>
+          <w:cs/>
+        </w:rPr>
+        <w:t xml:space="preserve"> — ראה </w:t>
+      </w:r>
+      <w:r>
+        <w:rPr>
+          <w:rFonts w:ascii="Courier New" w:hAnsi="Courier New"/>
+          <w:color w:val="1A331F"/>
+          <w:sz w:val="19"/>
+          <w:rtl w:val="1"/>
+          <w:cs/>
+        </w:rPr>
+        <w:t>GEMINI_SETUP.md</w:t>
+      </w:r>
+      <w:r>
+        <w:rPr>
+          <w:rFonts w:ascii="Arial" w:hAnsi="Arial"/>
+          <w:sz w:val="22"/>
+          <w:rtl w:val="1"/>
+          <w:cs/>
+        </w:rPr>
+        <w:t xml:space="preserve"> להוראות קבלת מפתח.</w:t>
+      </w:r>
+    </w:p>
+    <w:p>
+      <w:pPr>
+        <w:bidi w:val="1"/>
         <w:pStyle w:val="Heading2"/>
         <w:jc w:val="right"/>
         <w:pBdr>
@@ -11215,7 +11861,7 @@
           <w:rtl w:val="1"/>
           <w:cs/>
         </w:rPr>
-        <w:t xml:space="preserve">חבילה חיצונית בודדת: </w:t>
+        <w:t xml:space="preserve">חבילות חיצוניות: </w:t>
       </w:r>
       <w:r>
         <w:rPr>
@@ -11233,7 +11879,25 @@
           <w:rtl w:val="1"/>
           <w:cs/>
         </w:rPr>
-        <w:t>.</w:t>
+        <w:t xml:space="preserve"> (הצפנה), </w:t>
+      </w:r>
+      <w:r>
+        <w:rPr>
+          <w:rFonts w:ascii="Arial" w:hAnsi="Arial"/>
+          <w:sz w:val="22"/>
+          <w:rtl w:val="1"/>
+          <w:cs/>
+        </w:rPr>
+        <w:t>google-genai</w:t>
+      </w:r>
+      <w:r>
+        <w:rPr>
+          <w:rFonts w:ascii="Arial" w:hAnsi="Arial"/>
+          <w:sz w:val="22"/>
+          <w:rtl w:val="1"/>
+          <w:cs/>
+        </w:rPr>
+        <w:t xml:space="preserve"> (סינון צ'אט בינה מלאכותית).</w:t>
       </w:r>
     </w:p>
     <w:p>
@@ -13178,7 +13842,7 @@
                 <w:rtl w:val="1"/>
                 <w:cs/>
               </w:rPr>
-              <w:t>sender: str, message: str (≤200 תווים)</w:t>
+              <w:t>sender: str, message: str (≤200 תווים); עובר סינון Gemini AI לפני שידור</w:t>
             </w:r>
           </w:p>
         </w:tc>

</xml_diff>

<commit_message>
Update project documentation with new features and security enhancements
Add AI chat moderation, an admin dashboard, and enhance security protocols in the project documentation and code.

Replit-Commit-Author: Agent
Replit-Commit-Session-Id: 641331f1-7209-4bb4-a5dd-564b2ee3a54a
Replit-Commit-Checkpoint-Type: full_checkpoint
Replit-Commit-Event-Id: dee27795-1ea4-48a2-aee2-1fa455b176f4
Replit-Helium-Checkpoint-Created: true
</commit_message>
<xml_diff>
--- a/blackjack/תיק_פרויקט.docx
+++ b/blackjack/תיק_פרויקט.docx
@@ -1096,7 +1096,7 @@
           <w:rtl w:val="1"/>
           <w:cs/>
         </w:rPr>
-        <w:t xml:space="preserve"> הרץ ברקע, מקבל חיבורים, מנהל את חוקי המשחק, את הקופה ואת פרופילי השחקנים, ושומר את הנתונים על הדיסק.</w:t>
+        <w:t xml:space="preserve"> שמקבל חיבורים, מנהל את חוקי המשחק, את הקופה ואת פרופילי השחקנים, ושומר נתונים על הדיסק.</w:t>
       </w:r>
     </w:p>
     <w:p>
@@ -1124,7 +1124,7 @@
           <w:rtl w:val="1"/>
           <w:cs/>
         </w:rPr>
-        <w:t xml:space="preserve"> המוצג על מסך השחקן עם מסך התחברות / הרשמה, שולחן בלאק‑ג'ק עם הקלפים, כפתורי פעולה (Hit / Stand / Double), שדה הימור, סרגל פרופיל ומסך צ'אט.</w:t>
+        <w:t xml:space="preserve"> עם מסך התחברות / הרשמה, שולחן בלאק‑ג'ק עם קלפים, כפתורי Hit / Stand / Double, שדה הימור, סרגל פרופיל וצ'אט בזמן אמת.</w:t>
       </w:r>
     </w:p>
     <w:p>
@@ -1143,16 +1143,16 @@
           <w:rtl w:val="1"/>
           <w:cs/>
         </w:rPr>
-        <w:t>שכבת אבטחה</w:t>
-      </w:r>
-      <w:r>
-        <w:rPr>
-          <w:rFonts w:ascii="Arial" w:hAnsi="Arial"/>
-          <w:sz w:val="22"/>
-          <w:rtl w:val="1"/>
-          <w:cs/>
-        </w:rPr>
-        <w:t xml:space="preserve"> – לחיצת יד מוצפנת בין הלקוח לשרת והצפנה סימטרית של כל הודעה לאחר מכן, כך שאף מאזין ברשת לא יוכל לקרוא את התוכן או לשלוח הודעות מזויפות.</w:t>
+        <w:t>לוח בקרה גרפי לאדמין (ServerApp)</w:t>
+      </w:r>
+      <w:r>
+        <w:rPr>
+          <w:rFonts w:ascii="Arial" w:hAnsi="Arial"/>
+          <w:sz w:val="22"/>
+          <w:rtl w:val="1"/>
+          <w:cs/>
+        </w:rPr>
+        <w:t xml:space="preserve"> – חלון נפרד שנפתח על מחשב השרת, מציג שחקנים מחוברים, מאפשר לבעוט שחקן (Kick), מציג לוג צבעוני ומונה הודעות צ'אט שנבדקו / נחסמו.</w:t>
       </w:r>
     </w:p>
     <w:p>
@@ -1171,6 +1171,62 @@
           <w:rtl w:val="1"/>
           <w:cs/>
         </w:rPr>
+        <w:t>סינון צ'אט בינה מלאכותית (ChatModerator)</w:t>
+      </w:r>
+      <w:r>
+        <w:rPr>
+          <w:rFonts w:ascii="Arial" w:hAnsi="Arial"/>
+          <w:sz w:val="22"/>
+          <w:rtl w:val="1"/>
+          <w:cs/>
+        </w:rPr>
+        <w:t xml:space="preserve"> – ממשק ל‑Gemini 2.0 Flash שבודק כל הודעת צ'אט לפני שידורה. אם מפתח ה‑API לא מוגדר המשחק ממשיך לעבוד רגיל.</w:t>
+      </w:r>
+    </w:p>
+    <w:p>
+      <w:pPr>
+        <w:bidi w:val="1"/>
+        <w:pStyle w:val="ListBullet"/>
+        <w:jc w:val="right"/>
+        <w:spacing w:before="20" w:after="20" w:line="252" w:lineRule="auto"/>
+      </w:pPr>
+      <w:r>
+        <w:rPr>
+          <w:rFonts w:ascii="Arial" w:hAnsi="Arial"/>
+          <w:b/>
+          <w:color w:val="0A4D1F"/>
+          <w:sz w:val="22"/>
+          <w:rtl w:val="1"/>
+          <w:cs/>
+        </w:rPr>
+        <w:t>שכבת אבטחה</w:t>
+      </w:r>
+      <w:r>
+        <w:rPr>
+          <w:rFonts w:ascii="Arial" w:hAnsi="Arial"/>
+          <w:sz w:val="22"/>
+          <w:rtl w:val="1"/>
+          <w:cs/>
+        </w:rPr>
+        <w:t xml:space="preserve"> – לחיצת יד מוצפנת (RSA + Fernet) בין הלקוח לשרת; כל הודעה מוצפנת ומאומתת, כך שמאזין ברשת לא יוכל לקרוא את התוכן ולא לשלוח הודעות מזויפות.</w:t>
+      </w:r>
+    </w:p>
+    <w:p>
+      <w:pPr>
+        <w:bidi w:val="1"/>
+        <w:pStyle w:val="ListBullet"/>
+        <w:jc w:val="right"/>
+        <w:spacing w:before="20" w:after="20" w:line="252" w:lineRule="auto"/>
+      </w:pPr>
+      <w:r>
+        <w:rPr>
+          <w:rFonts w:ascii="Arial" w:hAnsi="Arial"/>
+          <w:b/>
+          <w:color w:val="0A4D1F"/>
+          <w:sz w:val="22"/>
+          <w:rtl w:val="1"/>
+          <w:cs/>
+        </w:rPr>
         <w:t>שכבת הרשאות</w:t>
       </w:r>
       <w:r>
@@ -1180,7 +1236,7 @@
           <w:rtl w:val="1"/>
           <w:cs/>
         </w:rPr>
-        <w:t xml:space="preserve"> – משתמשים נרשמים עם שם משתמש וסיסמה, סיסמאותיהם נשמרות בצורה מגובבת בלבד, וכל פעולה במשחק מחייבת הזדהות מול השרת.</w:t>
+        <w:t xml:space="preserve"> – סיסמאות נשמרות מגובבות בלבד (PBKDF2), כל פעולה במשחק מחייבת הזדהות מול השרת.</w:t>
       </w:r>
     </w:p>
     <w:p>
@@ -2115,7 +2171,7 @@
           <w:rtl w:val="1"/>
           <w:cs/>
         </w:rPr>
-        <w:t xml:space="preserve">. הספריות בהן נעזרתי הן ספריות סטנדרטיות (socket, threading, json, struct, secrets, hmac, hashlib, tkinter, dataclasses, enum, logging) למעט ספריית </w:t>
+        <w:t xml:space="preserve">. רוב הספריות הן סטנדרטיות (socket, threading, json, struct, secrets, hmac, hashlib, tkinter, dataclasses, enum, logging), למעט שתי ספריות חיצוניות: </w:t>
       </w:r>
       <w:r>
         <w:rPr>
@@ -2135,7 +2191,27 @@
           <w:rtl w:val="1"/>
           <w:cs/>
         </w:rPr>
-        <w:t xml:space="preserve"> של Python Cryptographic Authority – ספריית הצפנה שעברה ביקורת ביטחונית והיא תקן דה‑פקטו בעולם הפייתון.</w:t>
+        <w:t xml:space="preserve"> (הצפנה RSA + Fernet) ו‑</w:t>
+      </w:r>
+      <w:r>
+        <w:rPr>
+          <w:rFonts w:ascii="Arial" w:hAnsi="Arial"/>
+          <w:b/>
+          <w:color w:val="0A4D1F"/>
+          <w:sz w:val="22"/>
+          <w:rtl w:val="1"/>
+          <w:cs/>
+        </w:rPr>
+        <w:t>`google-genai`</w:t>
+      </w:r>
+      <w:r>
+        <w:rPr>
+          <w:rFonts w:ascii="Arial" w:hAnsi="Arial"/>
+          <w:sz w:val="22"/>
+          <w:rtl w:val="1"/>
+          <w:cs/>
+        </w:rPr>
+        <w:t xml:space="preserve"> (ממשק ל‑Gemini AI לסינון צ'אט).</w:t>
       </w:r>
     </w:p>
     <w:p>
@@ -2151,7 +2227,7 @@
           <w:rtl w:val="1"/>
           <w:cs/>
         </w:rPr>
-        <w:t>אין כאן טכנולוגיה אקזוטית: TCP sockets, threads ו‑Tkinter קיימים בפייתון מאז ומעולם. עם זאת, בחירה זו מקלה על קריאה והבנה של הקוד מבלי להסתבך עם פריימוורקים גדולים.</w:t>
+        <w:t>הבחירה בספריות פשוטות ומוכרות מקלה על קריאת הקוד והבנתו מבלי להסתבך בפריימוורקים גדולים.</w:t>
       </w:r>
     </w:p>
     <w:p>
@@ -6493,6 +6569,422 @@
           <w:cs/>
         </w:rPr>
         <w:t>record_result</w:t>
+      </w:r>
+      <w:r>
+        <w:rPr>
+          <w:rFonts w:ascii="Arial" w:hAnsi="Arial"/>
+          <w:sz w:val="22"/>
+          <w:rtl w:val="1"/>
+          <w:cs/>
+        </w:rPr>
+        <w:t>.</w:t>
+      </w:r>
+    </w:p>
+    <w:p>
+      <w:pPr>
+        <w:bidi w:val="1"/>
+        <w:pStyle w:val="Heading4"/>
+        <w:jc w:val="right"/>
+        <w:spacing w:before="80" w:after="20"/>
+      </w:pPr>
+      <w:r>
+        <w:rPr>
+          <w:rFonts w:ascii="Arial" w:hAnsi="Arial"/>
+          <w:rtl w:val="1"/>
+          <w:cs/>
+        </w:rPr>
+        <w:t>יכולת: סינון הודעות צ'אט (Gemini AI)</w:t>
+      </w:r>
+    </w:p>
+    <w:p>
+      <w:pPr>
+        <w:bidi w:val="1"/>
+        <w:pStyle w:val="ListBullet"/>
+        <w:jc w:val="right"/>
+        <w:spacing w:before="20" w:after="20" w:line="252" w:lineRule="auto"/>
+      </w:pPr>
+      <w:r>
+        <w:rPr>
+          <w:rFonts w:ascii="Arial" w:hAnsi="Arial"/>
+          <w:b/>
+          <w:color w:val="0A4D1F"/>
+          <w:sz w:val="22"/>
+          <w:rtl w:val="1"/>
+          <w:cs/>
+        </w:rPr>
+        <w:t>מהות:</w:t>
+      </w:r>
+      <w:r>
+        <w:rPr>
+          <w:rFonts w:ascii="Arial" w:hAnsi="Arial"/>
+          <w:sz w:val="22"/>
+          <w:rtl w:val="1"/>
+          <w:cs/>
+        </w:rPr>
+        <w:t xml:space="preserve"> לפני שהשרת משדר הודעת צ'אט לכל השחקנים, הוא שולח אותה ל‑Gemini 2.0 Flash ומקבל תשובה — ALLOW או BLOCK. אם ההודעה חסומה, רק השולח מקבל הודעת שגיאה. אם מפתח ה‑API חסר או אם הקריאה נכשלת, ההודעה עוברת בכל מקרה כדי שהמשחק ימשיך לעבוד.</w:t>
+      </w:r>
+    </w:p>
+    <w:p>
+      <w:pPr>
+        <w:bidi w:val="1"/>
+        <w:pStyle w:val="ListBullet"/>
+        <w:jc w:val="right"/>
+        <w:spacing w:before="20" w:after="20" w:line="252" w:lineRule="auto"/>
+      </w:pPr>
+      <w:r>
+        <w:rPr>
+          <w:rFonts w:ascii="Arial" w:hAnsi="Arial"/>
+          <w:b/>
+          <w:color w:val="0A4D1F"/>
+          <w:sz w:val="22"/>
+          <w:rtl w:val="1"/>
+          <w:cs/>
+        </w:rPr>
+        <w:t>פעולות נדרשות:</w:t>
+      </w:r>
+      <w:r>
+        <w:rPr>
+          <w:rFonts w:ascii="Arial" w:hAnsi="Arial"/>
+          <w:sz w:val="22"/>
+          <w:rtl w:val="1"/>
+          <w:cs/>
+        </w:rPr>
+        <w:t xml:space="preserve"> בדיקת </w:t>
+      </w:r>
+      <w:r>
+        <w:rPr>
+          <w:rFonts w:ascii="Arial" w:hAnsi="Arial"/>
+          <w:sz w:val="22"/>
+          <w:rtl w:val="1"/>
+          <w:cs/>
+        </w:rPr>
+        <w:t>GEMINI_API_KEY</w:t>
+      </w:r>
+      <w:r>
+        <w:rPr>
+          <w:rFonts w:ascii="Arial" w:hAnsi="Arial"/>
+          <w:sz w:val="22"/>
+          <w:rtl w:val="1"/>
+          <w:cs/>
+        </w:rPr>
+        <w:t xml:space="preserve"> בסביבה, קריאת </w:t>
+      </w:r>
+      <w:r>
+        <w:rPr>
+          <w:rFonts w:ascii="Arial" w:hAnsi="Arial"/>
+          <w:sz w:val="22"/>
+          <w:rtl w:val="1"/>
+          <w:cs/>
+        </w:rPr>
+        <w:t>google.genai</w:t>
+      </w:r>
+      <w:r>
+        <w:rPr>
+          <w:rFonts w:ascii="Arial" w:hAnsi="Arial"/>
+          <w:sz w:val="22"/>
+          <w:rtl w:val="1"/>
+          <w:cs/>
+        </w:rPr>
+        <w:t>, שליחת הודעה עם system prompt, פרשנות התוצאה, שליחת שגיאה לשולח אם נחסמה.</w:t>
+      </w:r>
+    </w:p>
+    <w:p>
+      <w:pPr>
+        <w:bidi w:val="1"/>
+        <w:pStyle w:val="ListBullet"/>
+        <w:jc w:val="right"/>
+        <w:spacing w:before="20" w:after="20" w:line="252" w:lineRule="auto"/>
+      </w:pPr>
+      <w:r>
+        <w:rPr>
+          <w:rFonts w:ascii="Arial" w:hAnsi="Arial"/>
+          <w:b/>
+          <w:color w:val="0A4D1F"/>
+          <w:sz w:val="22"/>
+          <w:rtl w:val="1"/>
+          <w:cs/>
+        </w:rPr>
+        <w:t>אובייקטים נחוצים:</w:t>
+      </w:r>
+      <w:r>
+        <w:rPr>
+          <w:rFonts w:ascii="Arial" w:hAnsi="Arial"/>
+          <w:sz w:val="22"/>
+          <w:rtl w:val="1"/>
+          <w:cs/>
+        </w:rPr>
+        <w:t xml:space="preserve"> </w:t>
+      </w:r>
+      <w:r>
+        <w:rPr>
+          <w:rFonts w:ascii="Arial" w:hAnsi="Arial"/>
+          <w:sz w:val="22"/>
+          <w:rtl w:val="1"/>
+          <w:cs/>
+        </w:rPr>
+        <w:t>ChatModerator</w:t>
+      </w:r>
+      <w:r>
+        <w:rPr>
+          <w:rFonts w:ascii="Arial" w:hAnsi="Arial"/>
+          <w:sz w:val="22"/>
+          <w:rtl w:val="1"/>
+          <w:cs/>
+        </w:rPr>
+        <w:t xml:space="preserve">, </w:t>
+      </w:r>
+      <w:r>
+        <w:rPr>
+          <w:rFonts w:ascii="Arial" w:hAnsi="Arial"/>
+          <w:sz w:val="22"/>
+          <w:rtl w:val="1"/>
+          <w:cs/>
+        </w:rPr>
+        <w:t>ClientHandler</w:t>
+      </w:r>
+      <w:r>
+        <w:rPr>
+          <w:rFonts w:ascii="Arial" w:hAnsi="Arial"/>
+          <w:sz w:val="22"/>
+          <w:rtl w:val="1"/>
+          <w:cs/>
+        </w:rPr>
+        <w:t>.</w:t>
+      </w:r>
+    </w:p>
+    <w:p>
+      <w:pPr>
+        <w:bidi w:val="1"/>
+        <w:pStyle w:val="Heading4"/>
+        <w:jc w:val="right"/>
+        <w:spacing w:before="80" w:after="20"/>
+      </w:pPr>
+      <w:r>
+        <w:rPr>
+          <w:rFonts w:ascii="Arial" w:hAnsi="Arial"/>
+          <w:rtl w:val="1"/>
+          <w:cs/>
+        </w:rPr>
+        <w:t>יכולת: לוח בקרה גרפי לשרת</w:t>
+      </w:r>
+    </w:p>
+    <w:p>
+      <w:pPr>
+        <w:bidi w:val="1"/>
+        <w:pStyle w:val="ListBullet"/>
+        <w:jc w:val="right"/>
+        <w:spacing w:before="20" w:after="20" w:line="252" w:lineRule="auto"/>
+      </w:pPr>
+      <w:r>
+        <w:rPr>
+          <w:rFonts w:ascii="Arial" w:hAnsi="Arial"/>
+          <w:b/>
+          <w:color w:val="0A4D1F"/>
+          <w:sz w:val="22"/>
+          <w:rtl w:val="1"/>
+          <w:cs/>
+        </w:rPr>
+        <w:t>מהות:</w:t>
+      </w:r>
+      <w:r>
+        <w:rPr>
+          <w:rFonts w:ascii="Arial" w:hAnsi="Arial"/>
+          <w:sz w:val="22"/>
+          <w:rtl w:val="1"/>
+          <w:cs/>
+        </w:rPr>
+        <w:t xml:space="preserve"> חלון Tkinter שנפתח במקום בלוג הטרמינל. הממשק מציג בזמן אמת: כתובת IP / host / פורט לחיבור לקוחות, רשימת שחקנים עם קרדיטים ואחוז ניצחונות, כפתור Kick לכל שחקן, שלב המשחק הנוכחי, כמות הקלפים שנותרה בחבילה, מונה הודעות צ'אט שנבדקו / נחסמו, לוג צבעוני, וכפתור עצירת שרת.</w:t>
+      </w:r>
+    </w:p>
+    <w:p>
+      <w:pPr>
+        <w:bidi w:val="1"/>
+        <w:pStyle w:val="ListBullet"/>
+        <w:jc w:val="right"/>
+        <w:spacing w:before="20" w:after="20" w:line="252" w:lineRule="auto"/>
+      </w:pPr>
+      <w:r>
+        <w:rPr>
+          <w:rFonts w:ascii="Arial" w:hAnsi="Arial"/>
+          <w:b/>
+          <w:color w:val="0A4D1F"/>
+          <w:sz w:val="22"/>
+          <w:rtl w:val="1"/>
+          <w:cs/>
+        </w:rPr>
+        <w:t>פעולות נדרשות:</w:t>
+      </w:r>
+      <w:r>
+        <w:rPr>
+          <w:rFonts w:ascii="Arial" w:hAnsi="Arial"/>
+          <w:sz w:val="22"/>
+          <w:rtl w:val="1"/>
+          <w:cs/>
+        </w:rPr>
+        <w:t xml:space="preserve"> יצירת חלון Tk, רענון נתונים כל 400ms עם </w:t>
+      </w:r>
+      <w:r>
+        <w:rPr>
+          <w:rFonts w:ascii="Arial" w:hAnsi="Arial"/>
+          <w:sz w:val="22"/>
+          <w:rtl w:val="1"/>
+          <w:cs/>
+        </w:rPr>
+        <w:t>root.after()</w:t>
+      </w:r>
+      <w:r>
+        <w:rPr>
+          <w:rFonts w:ascii="Arial" w:hAnsi="Arial"/>
+          <w:sz w:val="22"/>
+          <w:rtl w:val="1"/>
+          <w:cs/>
+        </w:rPr>
+        <w:t>, מיזוג נתוני הפרופיל, גישה ל‑</w:t>
+      </w:r>
+      <w:r>
+        <w:rPr>
+          <w:rFonts w:ascii="Arial" w:hAnsi="Arial"/>
+          <w:sz w:val="22"/>
+          <w:rtl w:val="1"/>
+          <w:cs/>
+        </w:rPr>
+        <w:t>_online_usernames</w:t>
+      </w:r>
+      <w:r>
+        <w:rPr>
+          <w:rFonts w:ascii="Arial" w:hAnsi="Arial"/>
+          <w:sz w:val="22"/>
+          <w:rtl w:val="1"/>
+          <w:cs/>
+        </w:rPr>
+        <w:t xml:space="preserve"> תחת </w:t>
+      </w:r>
+      <w:r>
+        <w:rPr>
+          <w:rFonts w:ascii="Arial" w:hAnsi="Arial"/>
+          <w:sz w:val="22"/>
+          <w:rtl w:val="1"/>
+          <w:cs/>
+        </w:rPr>
+        <w:t>_clients_lock</w:t>
+      </w:r>
+      <w:r>
+        <w:rPr>
+          <w:rFonts w:ascii="Arial" w:hAnsi="Arial"/>
+          <w:sz w:val="22"/>
+          <w:rtl w:val="1"/>
+          <w:cs/>
+        </w:rPr>
+        <w:t xml:space="preserve">, עטיפת </w:t>
+      </w:r>
+      <w:r>
+        <w:rPr>
+          <w:rFonts w:ascii="Arial" w:hAnsi="Arial"/>
+          <w:sz w:val="22"/>
+          <w:rtl w:val="1"/>
+          <w:cs/>
+        </w:rPr>
+        <w:t>ChatModerator.check</w:t>
+      </w:r>
+      <w:r>
+        <w:rPr>
+          <w:rFonts w:ascii="Arial" w:hAnsi="Arial"/>
+          <w:sz w:val="22"/>
+          <w:rtl w:val="1"/>
+          <w:cs/>
+        </w:rPr>
+        <w:t xml:space="preserve"> לספירת הודעות.</w:t>
+      </w:r>
+    </w:p>
+    <w:p>
+      <w:pPr>
+        <w:bidi w:val="1"/>
+        <w:pStyle w:val="ListBullet"/>
+        <w:jc w:val="right"/>
+        <w:spacing w:before="20" w:after="20" w:line="252" w:lineRule="auto"/>
+      </w:pPr>
+      <w:r>
+        <w:rPr>
+          <w:rFonts w:ascii="Arial" w:hAnsi="Arial"/>
+          <w:b/>
+          <w:color w:val="0A4D1F"/>
+          <w:sz w:val="22"/>
+          <w:rtl w:val="1"/>
+          <w:cs/>
+        </w:rPr>
+        <w:t>אובייקטים נחוצים:</w:t>
+      </w:r>
+      <w:r>
+        <w:rPr>
+          <w:rFonts w:ascii="Arial" w:hAnsi="Arial"/>
+          <w:sz w:val="22"/>
+          <w:rtl w:val="1"/>
+          <w:cs/>
+        </w:rPr>
+        <w:t xml:space="preserve"> </w:t>
+      </w:r>
+      <w:r>
+        <w:rPr>
+          <w:rFonts w:ascii="Arial" w:hAnsi="Arial"/>
+          <w:sz w:val="22"/>
+          <w:rtl w:val="1"/>
+          <w:cs/>
+        </w:rPr>
+        <w:t>ServerApp</w:t>
+      </w:r>
+      <w:r>
+        <w:rPr>
+          <w:rFonts w:ascii="Arial" w:hAnsi="Arial"/>
+          <w:sz w:val="22"/>
+          <w:rtl w:val="1"/>
+          <w:cs/>
+        </w:rPr>
+        <w:t xml:space="preserve">, </w:t>
+      </w:r>
+      <w:r>
+        <w:rPr>
+          <w:rFonts w:ascii="Arial" w:hAnsi="Arial"/>
+          <w:sz w:val="22"/>
+          <w:rtl w:val="1"/>
+          <w:cs/>
+        </w:rPr>
+        <w:t>_PlayerRow</w:t>
+      </w:r>
+      <w:r>
+        <w:rPr>
+          <w:rFonts w:ascii="Arial" w:hAnsi="Arial"/>
+          <w:sz w:val="22"/>
+          <w:rtl w:val="1"/>
+          <w:cs/>
+        </w:rPr>
+        <w:t xml:space="preserve">, </w:t>
+      </w:r>
+      <w:r>
+        <w:rPr>
+          <w:rFonts w:ascii="Arial" w:hAnsi="Arial"/>
+          <w:sz w:val="22"/>
+          <w:rtl w:val="1"/>
+          <w:cs/>
+        </w:rPr>
+        <w:t>BlackjackServer</w:t>
+      </w:r>
+      <w:r>
+        <w:rPr>
+          <w:rFonts w:ascii="Arial" w:hAnsi="Arial"/>
+          <w:sz w:val="22"/>
+          <w:rtl w:val="1"/>
+          <w:cs/>
+        </w:rPr>
+        <w:t xml:space="preserve">, </w:t>
+      </w:r>
+      <w:r>
+        <w:rPr>
+          <w:rFonts w:ascii="Arial" w:hAnsi="Arial"/>
+          <w:sz w:val="22"/>
+          <w:rtl w:val="1"/>
+          <w:cs/>
+        </w:rPr>
+        <w:t>ProfileManager</w:t>
       </w:r>
       <w:r>
         <w:rPr>
@@ -14578,7 +15070,305 @@
           <w:rtl w:val="1"/>
           <w:cs/>
         </w:rPr>
-        <w:t>2.7.4 תרשים מסכים (Screen Flow)</w:t>
+        <w:t>2.7.4 מסך לוח הבקרה של השרת</w:t>
+      </w:r>
+    </w:p>
+    <w:p>
+      <w:pPr>
+        <w:bidi w:val="1"/>
+        <w:pStyle w:val="ListBullet"/>
+        <w:jc w:val="right"/>
+        <w:spacing w:before="20" w:after="20" w:line="252" w:lineRule="auto"/>
+      </w:pPr>
+      <w:r>
+        <w:rPr>
+          <w:rFonts w:ascii="Arial" w:hAnsi="Arial"/>
+          <w:b/>
+          <w:color w:val="0A4D1F"/>
+          <w:sz w:val="22"/>
+          <w:rtl w:val="1"/>
+          <w:cs/>
+        </w:rPr>
+        <w:t>תפקיד:</w:t>
+      </w:r>
+      <w:r>
+        <w:rPr>
+          <w:rFonts w:ascii="Arial" w:hAnsi="Arial"/>
+          <w:sz w:val="22"/>
+          <w:rtl w:val="1"/>
+          <w:cs/>
+        </w:rPr>
+        <w:t xml:space="preserve"> מסך ניהול לאדמין בלבד — מוצג כשמפעילים </w:t>
+      </w:r>
+      <w:r>
+        <w:rPr>
+          <w:rFonts w:ascii="Arial" w:hAnsi="Arial"/>
+          <w:sz w:val="22"/>
+          <w:rtl w:val="1"/>
+          <w:cs/>
+        </w:rPr>
+        <w:t>run_server_gui.py</w:t>
+      </w:r>
+      <w:r>
+        <w:rPr>
+          <w:rFonts w:ascii="Arial" w:hAnsi="Arial"/>
+          <w:sz w:val="22"/>
+          <w:rtl w:val="1"/>
+          <w:cs/>
+        </w:rPr>
+        <w:t xml:space="preserve"> במקום </w:t>
+      </w:r>
+      <w:r>
+        <w:rPr>
+          <w:rFonts w:ascii="Arial" w:hAnsi="Arial"/>
+          <w:sz w:val="22"/>
+          <w:rtl w:val="1"/>
+          <w:cs/>
+        </w:rPr>
+        <w:t>run_server.py</w:t>
+      </w:r>
+      <w:r>
+        <w:rPr>
+          <w:rFonts w:ascii="Arial" w:hAnsi="Arial"/>
+          <w:sz w:val="22"/>
+          <w:rtl w:val="1"/>
+          <w:cs/>
+        </w:rPr>
+        <w:t>.</w:t>
+      </w:r>
+    </w:p>
+    <w:p>
+      <w:pPr>
+        <w:bidi w:val="1"/>
+        <w:pStyle w:val="ListBullet"/>
+        <w:jc w:val="right"/>
+        <w:spacing w:before="20" w:after="20" w:line="252" w:lineRule="auto"/>
+      </w:pPr>
+      <w:r>
+        <w:rPr>
+          <w:rFonts w:ascii="Arial" w:hAnsi="Arial"/>
+          <w:b/>
+          <w:color w:val="0A4D1F"/>
+          <w:sz w:val="22"/>
+          <w:rtl w:val="1"/>
+          <w:cs/>
+        </w:rPr>
+        <w:t>תיאור:</w:t>
+      </w:r>
+      <w:r>
+        <w:rPr>
+          <w:rFonts w:ascii="Arial" w:hAnsi="Arial"/>
+          <w:sz w:val="22"/>
+          <w:rtl w:val="1"/>
+          <w:cs/>
+        </w:rPr>
+        <w:t xml:space="preserve"> חלון מחולק לשלושה אזורים —</w:t>
+      </w:r>
+    </w:p>
+    <w:p>
+      <w:pPr>
+        <w:bidi w:val="1"/>
+        <w:pStyle w:val="ListBullet"/>
+        <w:jc w:val="right"/>
+        <w:ind w:right="360" w:left="0"/>
+        <w:spacing w:before="20" w:after="20" w:line="252" w:lineRule="auto"/>
+      </w:pPr>
+      <w:r>
+        <w:rPr>
+          <w:rFonts w:ascii="Arial" w:hAnsi="Arial"/>
+          <w:b/>
+          <w:color w:val="0A4D1F"/>
+          <w:sz w:val="22"/>
+          <w:rtl w:val="1"/>
+          <w:cs/>
+        </w:rPr>
+        <w:t>כותרת:</w:t>
+      </w:r>
+      <w:r>
+        <w:rPr>
+          <w:rFonts w:ascii="Arial" w:hAnsi="Arial"/>
+          <w:sz w:val="22"/>
+          <w:rtl w:val="1"/>
+          <w:cs/>
+        </w:rPr>
+        <w:t xml:space="preserve"> שם "BLACKJACK" בזהב, ולצדה Host / IP / Port כדי שהאדמין ידע מה לתת לשחקנים.</w:t>
+      </w:r>
+    </w:p>
+    <w:p>
+      <w:pPr>
+        <w:bidi w:val="1"/>
+        <w:pStyle w:val="ListBullet"/>
+        <w:jc w:val="right"/>
+        <w:ind w:right="360" w:left="0"/>
+        <w:spacing w:before="20" w:after="20" w:line="252" w:lineRule="auto"/>
+      </w:pPr>
+      <w:r>
+        <w:rPr>
+          <w:rFonts w:ascii="Arial" w:hAnsi="Arial"/>
+          <w:b/>
+          <w:color w:val="0A4D1F"/>
+          <w:sz w:val="22"/>
+          <w:rtl w:val="1"/>
+          <w:cs/>
+        </w:rPr>
+        <w:t>אזור שמאל — שחקנים:</w:t>
+      </w:r>
+      <w:r>
+        <w:rPr>
+          <w:rFonts w:ascii="Arial" w:hAnsi="Arial"/>
+          <w:sz w:val="22"/>
+          <w:rtl w:val="1"/>
+          <w:cs/>
+        </w:rPr>
+        <w:t xml:space="preserve"> רשימה של כל המחוברים כרגע. לכל שחקן: שם משתמש, קרדיטים, אחוז ניצחונות (wins / (wins+losses+pushes) × 100%), וכפתור </w:t>
+      </w:r>
+      <w:r>
+        <w:rPr>
+          <w:rFonts w:ascii="Arial" w:hAnsi="Arial"/>
+          <w:sz w:val="22"/>
+          <w:rtl w:val="1"/>
+          <w:cs/>
+        </w:rPr>
+        <w:t>Kick</w:t>
+      </w:r>
+      <w:r>
+        <w:rPr>
+          <w:rFonts w:ascii="Arial" w:hAnsi="Arial"/>
+          <w:sz w:val="22"/>
+          <w:rtl w:val="1"/>
+          <w:cs/>
+        </w:rPr>
+        <w:t xml:space="preserve"> עם חלון אישור.</w:t>
+      </w:r>
+    </w:p>
+    <w:p>
+      <w:pPr>
+        <w:bidi w:val="1"/>
+        <w:pStyle w:val="ListBullet"/>
+        <w:jc w:val="right"/>
+        <w:ind w:right="360" w:left="0"/>
+        <w:spacing w:before="20" w:after="20" w:line="252" w:lineRule="auto"/>
+      </w:pPr>
+      <w:r>
+        <w:rPr>
+          <w:rFonts w:ascii="Arial" w:hAnsi="Arial"/>
+          <w:b/>
+          <w:color w:val="0A4D1F"/>
+          <w:sz w:val="22"/>
+          <w:rtl w:val="1"/>
+          <w:cs/>
+        </w:rPr>
+        <w:t>אזור ימין — לוג:</w:t>
+      </w:r>
+      <w:r>
+        <w:rPr>
+          <w:rFonts w:ascii="Arial" w:hAnsi="Arial"/>
+          <w:sz w:val="22"/>
+          <w:rtl w:val="1"/>
+          <w:cs/>
+        </w:rPr>
+        <w:t xml:space="preserve"> כל הודעת לוג מהשרת מוצגת עם צבע לפי רמת חומרה (לבן = INFO, זהב = WARNING, אדום = ERROR). הלוג גולל לתחתית אוטומטית.</w:t>
+      </w:r>
+    </w:p>
+    <w:p>
+      <w:pPr>
+        <w:bidi w:val="1"/>
+        <w:pStyle w:val="ListBullet"/>
+        <w:jc w:val="right"/>
+        <w:ind w:right="360" w:left="0"/>
+        <w:spacing w:before="20" w:after="20" w:line="252" w:lineRule="auto"/>
+      </w:pPr>
+      <w:r>
+        <w:rPr>
+          <w:rFonts w:ascii="Arial" w:hAnsi="Arial"/>
+          <w:b/>
+          <w:color w:val="0A4D1F"/>
+          <w:sz w:val="22"/>
+          <w:rtl w:val="1"/>
+          <w:cs/>
+        </w:rPr>
+        <w:t>שורת סטטוס תחתונה:</w:t>
+      </w:r>
+      <w:r>
+        <w:rPr>
+          <w:rFonts w:ascii="Arial" w:hAnsi="Arial"/>
+          <w:sz w:val="22"/>
+          <w:rtl w:val="1"/>
+          <w:cs/>
+        </w:rPr>
+        <w:t xml:space="preserve"> שלב המשחק הנוכחי (WAITING / BETTING / PLAYING / DEALER / RESULTS), כמות קלפים שנותרה בחבילה, מונה Gemini (✓ n הודעות שעברו, ✗ n שנחסמו), וכפתור </w:t>
+      </w:r>
+      <w:r>
+        <w:rPr>
+          <w:rFonts w:ascii="Arial" w:hAnsi="Arial"/>
+          <w:sz w:val="22"/>
+          <w:rtl w:val="1"/>
+          <w:cs/>
+        </w:rPr>
+        <w:t>Stop Server</w:t>
+      </w:r>
+      <w:r>
+        <w:rPr>
+          <w:rFonts w:ascii="Arial" w:hAnsi="Arial"/>
+          <w:sz w:val="22"/>
+          <w:rtl w:val="1"/>
+          <w:cs/>
+        </w:rPr>
+        <w:t xml:space="preserve"> אדום.</w:t>
+      </w:r>
+    </w:p>
+    <w:p>
+      <w:pPr>
+        <w:bidi w:val="1"/>
+        <w:pStyle w:val="ListBullet"/>
+        <w:jc w:val="right"/>
+        <w:spacing w:before="20" w:after="20" w:line="252" w:lineRule="auto"/>
+      </w:pPr>
+      <w:r>
+        <w:rPr>
+          <w:rFonts w:ascii="Arial" w:hAnsi="Arial"/>
+          <w:b/>
+          <w:color w:val="0A4D1F"/>
+          <w:sz w:val="22"/>
+          <w:rtl w:val="1"/>
+          <w:cs/>
+        </w:rPr>
+        <w:t>תמונת מסך:</w:t>
+      </w:r>
+      <w:r>
+        <w:rPr>
+          <w:rFonts w:ascii="Arial" w:hAnsi="Arial"/>
+          <w:sz w:val="22"/>
+          <w:rtl w:val="1"/>
+          <w:cs/>
+        </w:rPr>
+        <w:t xml:space="preserve"> </w:t>
+      </w:r>
+      <w:r>
+        <w:rPr>
+          <w:rFonts w:ascii="Arial" w:hAnsi="Arial"/>
+          <w:i/>
+          <w:sz w:val="22"/>
+          <w:rtl w:val="1"/>
+          <w:cs/>
+        </w:rPr>
+        <w:t>(להוסיף בגרסה הסופית)</w:t>
+      </w:r>
+    </w:p>
+    <w:p>
+      <w:pPr>
+        <w:bidi w:val="1"/>
+        <w:pStyle w:val="Heading3"/>
+        <w:jc w:val="right"/>
+        <w:spacing w:before="100" w:after="40"/>
+      </w:pPr>
+      <w:r>
+        <w:rPr>
+          <w:rFonts w:ascii="Arial" w:hAnsi="Arial"/>
+          <w:rtl w:val="1"/>
+          <w:cs/>
+        </w:rPr>
+        <w:t>2.7.5 תרשים מסכים (Screen Flow)</w:t>
       </w:r>
     </w:p>
     <w:tbl>
@@ -14608,7 +15398,7 @@
                 <w:color w:val="1A331F"/>
                 <w:sz w:val="17"/>
               </w:rPr>
-              <w:t xml:space="preserve">   +----------------+   login OK    +-----------------+</w:t>
+              <w:t xml:space="preserve">   +------------------+   login OK    +-----------------+</w:t>
             </w:r>
           </w:p>
         </w:tc>
@@ -14630,7 +15420,7 @@
                 <w:color w:val="1A331F"/>
                 <w:sz w:val="17"/>
               </w:rPr>
-              <w:t xml:space="preserve">   |  LoginFrame    |--------------&gt;|   TableFrame    |</w:t>
+              <w:t xml:space="preserve">   |  LoginFrame      |--------------&gt;|   TableFrame    |</w:t>
             </w:r>
           </w:p>
         </w:tc>
@@ -14652,7 +15442,7 @@
                 <w:color w:val="1A331F"/>
                 <w:sz w:val="17"/>
               </w:rPr>
-              <w:t xml:space="preserve">   +----------------+               +-----------------+</w:t>
+              <w:t xml:space="preserve">   |  (client GUI)    |               | (client GUI)    |</w:t>
             </w:r>
           </w:p>
         </w:tc>
@@ -14674,7 +15464,7 @@
                 <w:color w:val="1A331F"/>
                 <w:sz w:val="17"/>
               </w:rPr>
-              <w:t xml:space="preserve">        ^   ^                              |</w:t>
+              <w:t xml:space="preserve">   +------------------+               +-----------------+</w:t>
             </w:r>
           </w:p>
         </w:tc>
@@ -14696,7 +15486,7 @@
                 <w:color w:val="1A331F"/>
                 <w:sz w:val="17"/>
               </w:rPr>
-              <w:t xml:space="preserve">        |   |  disconnect / logout         |</w:t>
+              <w:t xml:space="preserve">        ^   ^                                |</w:t>
             </w:r>
           </w:p>
         </w:tc>
@@ -14718,7 +15508,7 @@
                 <w:color w:val="1A331F"/>
                 <w:sz w:val="17"/>
               </w:rPr>
-              <w:t xml:space="preserve">        |   +------------------------------+</w:t>
+              <w:t xml:space="preserve">        |   |  disconnect / logout           |</w:t>
             </w:r>
           </w:p>
         </w:tc>
@@ -14740,7 +15530,7 @@
                 <w:color w:val="1A331F"/>
                 <w:sz w:val="17"/>
               </w:rPr>
-              <w:t xml:space="preserve">        |</w:t>
+              <w:t xml:space="preserve">        |   +--------------------------------+</w:t>
             </w:r>
           </w:p>
         </w:tc>
@@ -14762,7 +15552,7 @@
                 <w:color w:val="1A331F"/>
                 <w:sz w:val="17"/>
               </w:rPr>
-              <w:t xml:space="preserve">        |  register OK  (auto‑login)</w:t>
+              <w:t xml:space="preserve">        |</w:t>
             </w:r>
           </w:p>
         </w:tc>
@@ -14784,7 +15574,205 @@
                 <w:color w:val="1A331F"/>
                 <w:sz w:val="17"/>
               </w:rPr>
+              <w:t xml:space="preserve">        |  register OK  (auto‑login)</w:t>
+            </w:r>
+          </w:p>
+        </w:tc>
+      </w:tr>
+      <w:tr>
+        <w:tc>
+          <w:tcPr>
+            <w:tcW w:type="dxa" w:w="9638"/>
+            <w:shd w:val="clear" w:color="auto" w:fill="F0F4F1"/>
+          </w:tcPr>
+          <w:p>
+            <w:pPr>
+              <w:jc w:val="left"/>
+              <w:spacing w:before="0" w:after="0" w:line="220" w:lineRule="auto"/>
+            </w:pPr>
+            <w:r>
+              <w:rPr>
+                <w:rFonts w:ascii="Courier New" w:hAnsi="Courier New"/>
+                <w:color w:val="1A331F"/>
+                <w:sz w:val="17"/>
+              </w:rPr>
               <w:t xml:space="preserve">        +-------------- ↑</w:t>
+            </w:r>
+          </w:p>
+        </w:tc>
+      </w:tr>
+      <w:tr>
+        <w:tc>
+          <w:tcPr>
+            <w:tcW w:type="dxa" w:w="9638"/>
+            <w:shd w:val="clear" w:color="auto" w:fill="F0F4F1"/>
+          </w:tcPr>
+          <w:p>
+            <w:pPr>
+              <w:jc w:val="left"/>
+              <w:spacing w:before="0" w:after="0" w:line="220" w:lineRule="auto"/>
+            </w:pPr>
+            <w:r>
+              <w:rPr>
+                <w:rFonts w:ascii="Courier New" w:hAnsi="Courier New"/>
+                <w:color w:val="1A331F"/>
+                <w:sz w:val="17"/>
+              </w:rPr>
+              <w:t xml:space="preserve"> </w:t>
+            </w:r>
+          </w:p>
+        </w:tc>
+      </w:tr>
+      <w:tr>
+        <w:tc>
+          <w:tcPr>
+            <w:tcW w:type="dxa" w:w="9638"/>
+            <w:shd w:val="clear" w:color="auto" w:fill="F0F4F1"/>
+          </w:tcPr>
+          <w:p>
+            <w:pPr>
+              <w:jc w:val="left"/>
+              <w:spacing w:before="0" w:after="0" w:line="220" w:lineRule="auto"/>
+            </w:pPr>
+            <w:r>
+              <w:rPr>
+                <w:rFonts w:ascii="Courier New" w:hAnsi="Courier New"/>
+                <w:color w:val="1A331F"/>
+                <w:sz w:val="17"/>
+              </w:rPr>
+              <w:t xml:space="preserve">   +-------------------+     (run separately on server machine)</w:t>
+            </w:r>
+          </w:p>
+        </w:tc>
+      </w:tr>
+      <w:tr>
+        <w:tc>
+          <w:tcPr>
+            <w:tcW w:type="dxa" w:w="9638"/>
+            <w:shd w:val="clear" w:color="auto" w:fill="F0F4F1"/>
+          </w:tcPr>
+          <w:p>
+            <w:pPr>
+              <w:jc w:val="left"/>
+              <w:spacing w:before="0" w:after="0" w:line="220" w:lineRule="auto"/>
+            </w:pPr>
+            <w:r>
+              <w:rPr>
+                <w:rFonts w:ascii="Courier New" w:hAnsi="Courier New"/>
+                <w:color w:val="1A331F"/>
+                <w:sz w:val="17"/>
+              </w:rPr>
+              <w:t xml:space="preserve">   |  ServerApp        |</w:t>
+            </w:r>
+          </w:p>
+        </w:tc>
+      </w:tr>
+      <w:tr>
+        <w:tc>
+          <w:tcPr>
+            <w:tcW w:type="dxa" w:w="9638"/>
+            <w:shd w:val="clear" w:color="auto" w:fill="F0F4F1"/>
+          </w:tcPr>
+          <w:p>
+            <w:pPr>
+              <w:jc w:val="left"/>
+              <w:spacing w:before="0" w:after="0" w:line="220" w:lineRule="auto"/>
+            </w:pPr>
+            <w:r>
+              <w:rPr>
+                <w:rFonts w:ascii="Courier New" w:hAnsi="Courier New"/>
+                <w:color w:val="1A331F"/>
+                <w:sz w:val="17"/>
+              </w:rPr>
+              <w:t xml:space="preserve">   |  (server GUI)     |</w:t>
+            </w:r>
+          </w:p>
+        </w:tc>
+      </w:tr>
+      <w:tr>
+        <w:tc>
+          <w:tcPr>
+            <w:tcW w:type="dxa" w:w="9638"/>
+            <w:shd w:val="clear" w:color="auto" w:fill="F0F4F1"/>
+          </w:tcPr>
+          <w:p>
+            <w:pPr>
+              <w:jc w:val="left"/>
+              <w:spacing w:before="0" w:after="0" w:line="220" w:lineRule="auto"/>
+            </w:pPr>
+            <w:r>
+              <w:rPr>
+                <w:rFonts w:ascii="Courier New" w:hAnsi="Courier New"/>
+                <w:color w:val="1A331F"/>
+                <w:sz w:val="17"/>
+              </w:rPr>
+              <w:t xml:space="preserve">   +-------------------+</w:t>
+            </w:r>
+          </w:p>
+        </w:tc>
+      </w:tr>
+      <w:tr>
+        <w:tc>
+          <w:tcPr>
+            <w:tcW w:type="dxa" w:w="9638"/>
+            <w:shd w:val="clear" w:color="auto" w:fill="F0F4F1"/>
+          </w:tcPr>
+          <w:p>
+            <w:pPr>
+              <w:jc w:val="left"/>
+              <w:spacing w:before="0" w:after="0" w:line="220" w:lineRule="auto"/>
+            </w:pPr>
+            <w:r>
+              <w:rPr>
+                <w:rFonts w:ascii="Courier New" w:hAnsi="Courier New"/>
+                <w:color w:val="1A331F"/>
+                <w:sz w:val="17"/>
+              </w:rPr>
+              <w:t xml:space="preserve">        |  Stop / Kick player</w:t>
+            </w:r>
+          </w:p>
+        </w:tc>
+      </w:tr>
+      <w:tr>
+        <w:tc>
+          <w:tcPr>
+            <w:tcW w:type="dxa" w:w="9638"/>
+            <w:shd w:val="clear" w:color="auto" w:fill="F0F4F1"/>
+          </w:tcPr>
+          <w:p>
+            <w:pPr>
+              <w:jc w:val="left"/>
+              <w:spacing w:before="0" w:after="0" w:line="220" w:lineRule="auto"/>
+            </w:pPr>
+            <w:r>
+              <w:rPr>
+                <w:rFonts w:ascii="Courier New" w:hAnsi="Courier New"/>
+                <w:color w:val="1A331F"/>
+                <w:sz w:val="17"/>
+              </w:rPr>
+              <w:t xml:space="preserve">        v</w:t>
+            </w:r>
+          </w:p>
+        </w:tc>
+      </w:tr>
+      <w:tr>
+        <w:tc>
+          <w:tcPr>
+            <w:tcW w:type="dxa" w:w="9638"/>
+            <w:shd w:val="clear" w:color="auto" w:fill="F0F4F1"/>
+          </w:tcPr>
+          <w:p>
+            <w:pPr>
+              <w:jc w:val="left"/>
+              <w:spacing w:before="0" w:after="0" w:line="220" w:lineRule="auto"/>
+            </w:pPr>
+            <w:r>
+              <w:rPr>
+                <w:rFonts w:ascii="Courier New" w:hAnsi="Courier New"/>
+                <w:color w:val="1A331F"/>
+                <w:sz w:val="17"/>
+              </w:rPr>
+              <w:t xml:space="preserve">   [server shuts down / client disconnected]</w:t>
             </w:r>
           </w:p>
         </w:tc>
@@ -16821,6 +17809,80 @@
           </w:p>
         </w:tc>
       </w:tr>
+      <w:tr>
+        <w:tc>
+          <w:tcPr>
+            <w:tcW w:type="dxa" w:w="3213"/>
+            <w:vAlign w:val="center"/>
+            <w:shd w:val="clear" w:color="auto" w:fill="EDF8F1"/>
+          </w:tcPr>
+          <w:p>
+            <w:pPr>
+              <w:bidi w:val="1"/>
+              <w:jc w:val="right"/>
+              <w:spacing w:before="40" w:after="40"/>
+            </w:pPr>
+            <w:r>
+              <w:rPr>
+                <w:rFonts w:ascii="Arial" w:hAnsi="Arial"/>
+                <w:color w:val="1A1A1A"/>
+                <w:sz w:val="19"/>
+                <w:rtl w:val="1"/>
+                <w:cs/>
+              </w:rPr>
+              <w:t>חשיפת מפתח Gemini API</w:t>
+            </w:r>
+          </w:p>
+        </w:tc>
+        <w:tc>
+          <w:tcPr>
+            <w:tcW w:type="dxa" w:w="3213"/>
+            <w:vAlign w:val="center"/>
+            <w:shd w:val="clear" w:color="auto" w:fill="EDF8F1"/>
+          </w:tcPr>
+          <w:p>
+            <w:pPr>
+              <w:bidi w:val="1"/>
+              <w:jc w:val="right"/>
+              <w:spacing w:before="40" w:after="40"/>
+            </w:pPr>
+            <w:r>
+              <w:rPr>
+                <w:rFonts w:ascii="Arial" w:hAnsi="Arial"/>
+                <w:color w:val="1A1A1A"/>
+                <w:sz w:val="19"/>
+                <w:rtl w:val="1"/>
+                <w:cs/>
+              </w:rPr>
+              <w:t>רלוונטי</w:t>
+            </w:r>
+          </w:p>
+        </w:tc>
+        <w:tc>
+          <w:tcPr>
+            <w:tcW w:type="dxa" w:w="3213"/>
+            <w:vAlign w:val="center"/>
+            <w:shd w:val="clear" w:color="auto" w:fill="EDF8F1"/>
+          </w:tcPr>
+          <w:p>
+            <w:pPr>
+              <w:bidi w:val="1"/>
+              <w:jc w:val="right"/>
+              <w:spacing w:before="40" w:after="40"/>
+            </w:pPr>
+            <w:r>
+              <w:rPr>
+                <w:rFonts w:ascii="Arial" w:hAnsi="Arial"/>
+                <w:color w:val="1A1A1A"/>
+                <w:sz w:val="19"/>
+                <w:rtl w:val="1"/>
+                <w:cs/>
+              </w:rPr>
+              <w:t>GEMINI_API_KEY מועבר רק כמשתנה סביבה; לא נכתב ב‑log ולא מוטבע בקוד. אם הוא נגנב, תוקף יכול לצרוך מכסה — לכן מומלץ להגביל הרשאות במסוף Google AI Studio</w:t>
+            </w:r>
+          </w:p>
+        </w:tc>
+      </w:tr>
     </w:tbl>
     <w:p/>
     <w:p>
@@ -17819,7 +18881,7 @@
                 <w:rtl w:val="1"/>
                 <w:cs/>
               </w:rPr>
-              <w:t>ממשק משתמש גרפי</w:t>
+              <w:t>ממשק משתמש גרפי (לקוח ולוח בקרה שרת)</w:t>
             </w:r>
           </w:p>
         </w:tc>
@@ -17972,6 +19034,54 @@
           </w:p>
         </w:tc>
       </w:tr>
+      <w:tr>
+        <w:tc>
+          <w:tcPr>
+            <w:tcW w:type="dxa" w:w="4819"/>
+            <w:vAlign w:val="center"/>
+          </w:tcPr>
+          <w:p>
+            <w:pPr>
+              <w:bidi w:val="1"/>
+              <w:jc w:val="right"/>
+              <w:spacing w:before="40" w:after="40"/>
+            </w:pPr>
+            <w:r>
+              <w:rPr>
+                <w:rFonts w:ascii="Arial" w:hAnsi="Arial"/>
+                <w:color w:val="1A1A1A"/>
+                <w:sz w:val="19"/>
+                <w:rtl w:val="1"/>
+                <w:cs/>
+              </w:rPr>
+              <w:t>google.genai (חיצוני)</w:t>
+            </w:r>
+          </w:p>
+        </w:tc>
+        <w:tc>
+          <w:tcPr>
+            <w:tcW w:type="dxa" w:w="4819"/>
+            <w:vAlign w:val="center"/>
+          </w:tcPr>
+          <w:p>
+            <w:pPr>
+              <w:bidi w:val="1"/>
+              <w:jc w:val="right"/>
+              <w:spacing w:before="40" w:after="40"/>
+            </w:pPr>
+            <w:r>
+              <w:rPr>
+                <w:rFonts w:ascii="Arial" w:hAnsi="Arial"/>
+                <w:color w:val="1A1A1A"/>
+                <w:sz w:val="19"/>
+                <w:rtl w:val="1"/>
+                <w:cs/>
+              </w:rPr>
+              <w:t>קריאות ל‑Gemini 2.0 Flash לסינון תוכן בצ'אט</w:t>
+            </w:r>
+          </w:p>
+        </w:tc>
+      </w:tr>
     </w:tbl>
     <w:p/>
     <w:p>
@@ -21727,6 +22837,638 @@
           <w:cs/>
         </w:rPr>
         <w:t>_on_close</w:t>
+      </w:r>
+      <w:r>
+        <w:rPr>
+          <w:rFonts w:ascii="Arial" w:hAnsi="Arial"/>
+          <w:sz w:val="22"/>
+          <w:rtl w:val="1"/>
+          <w:cs/>
+        </w:rPr>
+        <w:t>.</w:t>
+      </w:r>
+    </w:p>
+    <w:p>
+      <w:pPr>
+        <w:bidi w:val="1"/>
+        <w:pStyle w:val="Heading4"/>
+        <w:jc w:val="right"/>
+        <w:spacing w:before="80" w:after="20"/>
+      </w:pPr>
+      <w:r>
+        <w:rPr>
+          <w:rFonts w:ascii="Arial" w:hAnsi="Arial"/>
+          <w:rtl w:val="1"/>
+          <w:cs/>
+        </w:rPr>
+        <w:t>ChatModerator (‎server/chat_moderator.py‎)</w:t>
+      </w:r>
+    </w:p>
+    <w:p>
+      <w:pPr>
+        <w:bidi w:val="1"/>
+        <w:pStyle w:val="ListBullet"/>
+        <w:jc w:val="right"/>
+        <w:spacing w:before="20" w:after="20" w:line="252" w:lineRule="auto"/>
+      </w:pPr>
+      <w:r>
+        <w:rPr>
+          <w:rFonts w:ascii="Arial" w:hAnsi="Arial"/>
+          <w:b/>
+          <w:color w:val="0A4D1F"/>
+          <w:sz w:val="22"/>
+          <w:rtl w:val="1"/>
+          <w:cs/>
+        </w:rPr>
+        <w:t>תפקיד:</w:t>
+      </w:r>
+      <w:r>
+        <w:rPr>
+          <w:rFonts w:ascii="Arial" w:hAnsi="Arial"/>
+          <w:sz w:val="22"/>
+          <w:rtl w:val="1"/>
+          <w:cs/>
+        </w:rPr>
+        <w:t xml:space="preserve"> סורק הודעות צ'אט של שחקנים בעזרת Gemini AI לפני שהן משודרות.</w:t>
+      </w:r>
+    </w:p>
+    <w:p>
+      <w:pPr>
+        <w:bidi w:val="1"/>
+        <w:pStyle w:val="ListBullet"/>
+        <w:jc w:val="right"/>
+        <w:spacing w:before="20" w:after="20" w:line="252" w:lineRule="auto"/>
+      </w:pPr>
+      <w:r>
+        <w:rPr>
+          <w:rFonts w:ascii="Arial" w:hAnsi="Arial"/>
+          <w:b/>
+          <w:color w:val="0A4D1F"/>
+          <w:sz w:val="22"/>
+          <w:rtl w:val="1"/>
+          <w:cs/>
+        </w:rPr>
+        <w:t>תכונות:</w:t>
+      </w:r>
+      <w:r>
+        <w:rPr>
+          <w:rFonts w:ascii="Arial" w:hAnsi="Arial"/>
+          <w:sz w:val="22"/>
+          <w:rtl w:val="1"/>
+          <w:cs/>
+        </w:rPr>
+        <w:t xml:space="preserve"> </w:t>
+      </w:r>
+      <w:r>
+        <w:rPr>
+          <w:rFonts w:ascii="Arial" w:hAnsi="Arial"/>
+          <w:sz w:val="22"/>
+          <w:rtl w:val="1"/>
+          <w:cs/>
+        </w:rPr>
+        <w:t>_enabled: bool</w:t>
+      </w:r>
+      <w:r>
+        <w:rPr>
+          <w:rFonts w:ascii="Arial" w:hAnsi="Arial"/>
+          <w:sz w:val="22"/>
+          <w:rtl w:val="1"/>
+          <w:cs/>
+        </w:rPr>
+        <w:t xml:space="preserve"> (האם </w:t>
+      </w:r>
+      <w:r>
+        <w:rPr>
+          <w:rFonts w:ascii="Arial" w:hAnsi="Arial"/>
+          <w:sz w:val="22"/>
+          <w:rtl w:val="1"/>
+          <w:cs/>
+        </w:rPr>
+        <w:t>GEMINI_API_KEY</w:t>
+      </w:r>
+      <w:r>
+        <w:rPr>
+          <w:rFonts w:ascii="Arial" w:hAnsi="Arial"/>
+          <w:sz w:val="22"/>
+          <w:rtl w:val="1"/>
+          <w:cs/>
+        </w:rPr>
+        <w:t xml:space="preserve"> מוגדר), </w:t>
+      </w:r>
+      <w:r>
+        <w:rPr>
+          <w:rFonts w:ascii="Arial" w:hAnsi="Arial"/>
+          <w:sz w:val="22"/>
+          <w:rtl w:val="1"/>
+          <w:cs/>
+        </w:rPr>
+        <w:t>_model</w:t>
+      </w:r>
+      <w:r>
+        <w:rPr>
+          <w:rFonts w:ascii="Arial" w:hAnsi="Arial"/>
+          <w:sz w:val="22"/>
+          <w:rtl w:val="1"/>
+          <w:cs/>
+        </w:rPr>
+        <w:t xml:space="preserve"> (Gemini client — נטען בצורה עצלה).</w:t>
+      </w:r>
+    </w:p>
+    <w:p>
+      <w:pPr>
+        <w:bidi w:val="1"/>
+        <w:pStyle w:val="ListBullet"/>
+        <w:jc w:val="right"/>
+        <w:spacing w:before="20" w:after="20" w:line="252" w:lineRule="auto"/>
+      </w:pPr>
+      <w:r>
+        <w:rPr>
+          <w:rFonts w:ascii="Arial" w:hAnsi="Arial"/>
+          <w:b/>
+          <w:color w:val="0A4D1F"/>
+          <w:sz w:val="22"/>
+          <w:rtl w:val="1"/>
+          <w:cs/>
+        </w:rPr>
+        <w:t>פעולות:</w:t>
+      </w:r>
+      <w:r>
+        <w:rPr>
+          <w:rFonts w:ascii="Arial" w:hAnsi="Arial"/>
+          <w:sz w:val="22"/>
+          <w:rtl w:val="1"/>
+          <w:cs/>
+        </w:rPr>
+        <w:t xml:space="preserve"> </w:t>
+      </w:r>
+      <w:r>
+        <w:rPr>
+          <w:rFonts w:ascii="Arial" w:hAnsi="Arial"/>
+          <w:sz w:val="22"/>
+          <w:rtl w:val="1"/>
+          <w:cs/>
+        </w:rPr>
+        <w:t>check(message) -&gt; (allowed, reason)</w:t>
+      </w:r>
+      <w:r>
+        <w:rPr>
+          <w:rFonts w:ascii="Arial" w:hAnsi="Arial"/>
+          <w:sz w:val="22"/>
+          <w:rtl w:val="1"/>
+          <w:cs/>
+        </w:rPr>
+        <w:t xml:space="preserve"> – מחזיר </w:t>
+      </w:r>
+      <w:r>
+        <w:rPr>
+          <w:rFonts w:ascii="Arial" w:hAnsi="Arial"/>
+          <w:sz w:val="22"/>
+          <w:rtl w:val="1"/>
+          <w:cs/>
+        </w:rPr>
+        <w:t>True/False</w:t>
+      </w:r>
+      <w:r>
+        <w:rPr>
+          <w:rFonts w:ascii="Arial" w:hAnsi="Arial"/>
+          <w:sz w:val="22"/>
+          <w:rtl w:val="1"/>
+          <w:cs/>
+        </w:rPr>
+        <w:t xml:space="preserve"> ואת הסיבה; </w:t>
+      </w:r>
+      <w:r>
+        <w:rPr>
+          <w:rFonts w:ascii="Arial" w:hAnsi="Arial"/>
+          <w:sz w:val="22"/>
+          <w:rtl w:val="1"/>
+          <w:cs/>
+        </w:rPr>
+        <w:t>enabled</w:t>
+      </w:r>
+      <w:r>
+        <w:rPr>
+          <w:rFonts w:ascii="Arial" w:hAnsi="Arial"/>
+          <w:sz w:val="22"/>
+          <w:rtl w:val="1"/>
+          <w:cs/>
+        </w:rPr>
+        <w:t xml:space="preserve"> (property).</w:t>
+      </w:r>
+    </w:p>
+    <w:p>
+      <w:pPr>
+        <w:bidi w:val="1"/>
+        <w:pStyle w:val="Heading4"/>
+        <w:jc w:val="right"/>
+        <w:spacing w:before="80" w:after="20"/>
+      </w:pPr>
+      <w:r>
+        <w:rPr>
+          <w:rFonts w:ascii="Arial" w:hAnsi="Arial"/>
+          <w:rtl w:val="1"/>
+          <w:cs/>
+        </w:rPr>
+        <w:t>ServerApp (‎server/gui.py‎)</w:t>
+      </w:r>
+    </w:p>
+    <w:p>
+      <w:pPr>
+        <w:bidi w:val="1"/>
+        <w:pStyle w:val="ListBullet"/>
+        <w:jc w:val="right"/>
+        <w:spacing w:before="20" w:after="20" w:line="252" w:lineRule="auto"/>
+      </w:pPr>
+      <w:r>
+        <w:rPr>
+          <w:rFonts w:ascii="Arial" w:hAnsi="Arial"/>
+          <w:b/>
+          <w:color w:val="0A4D1F"/>
+          <w:sz w:val="22"/>
+          <w:rtl w:val="1"/>
+          <w:cs/>
+        </w:rPr>
+        <w:t>תפקיד:</w:t>
+      </w:r>
+      <w:r>
+        <w:rPr>
+          <w:rFonts w:ascii="Arial" w:hAnsi="Arial"/>
+          <w:sz w:val="22"/>
+          <w:rtl w:val="1"/>
+          <w:cs/>
+        </w:rPr>
+        <w:t xml:space="preserve"> לוח בקרה גרפי לשרת — אותה תמה חזותית כמו ממשק הלקוח (ירוק כהה, זהב).</w:t>
+      </w:r>
+    </w:p>
+    <w:p>
+      <w:pPr>
+        <w:bidi w:val="1"/>
+        <w:pStyle w:val="ListBullet"/>
+        <w:jc w:val="right"/>
+        <w:spacing w:before="20" w:after="20" w:line="252" w:lineRule="auto"/>
+      </w:pPr>
+      <w:r>
+        <w:rPr>
+          <w:rFonts w:ascii="Arial" w:hAnsi="Arial"/>
+          <w:b/>
+          <w:color w:val="0A4D1F"/>
+          <w:sz w:val="22"/>
+          <w:rtl w:val="1"/>
+          <w:cs/>
+        </w:rPr>
+        <w:t>תכונות:</w:t>
+      </w:r>
+      <w:r>
+        <w:rPr>
+          <w:rFonts w:ascii="Arial" w:hAnsi="Arial"/>
+          <w:sz w:val="22"/>
+          <w:rtl w:val="1"/>
+          <w:cs/>
+        </w:rPr>
+        <w:t xml:space="preserve"> </w:t>
+      </w:r>
+      <w:r>
+        <w:rPr>
+          <w:rFonts w:ascii="Arial" w:hAnsi="Arial"/>
+          <w:sz w:val="22"/>
+          <w:rtl w:val="1"/>
+          <w:cs/>
+        </w:rPr>
+        <w:t>_server</w:t>
+      </w:r>
+      <w:r>
+        <w:rPr>
+          <w:rFonts w:ascii="Arial" w:hAnsi="Arial"/>
+          <w:sz w:val="22"/>
+          <w:rtl w:val="1"/>
+          <w:cs/>
+        </w:rPr>
+        <w:t xml:space="preserve">, </w:t>
+      </w:r>
+      <w:r>
+        <w:rPr>
+          <w:rFonts w:ascii="Arial" w:hAnsi="Arial"/>
+          <w:sz w:val="22"/>
+          <w:rtl w:val="1"/>
+          <w:cs/>
+        </w:rPr>
+        <w:t>_log_queue</w:t>
+      </w:r>
+      <w:r>
+        <w:rPr>
+          <w:rFonts w:ascii="Arial" w:hAnsi="Arial"/>
+          <w:sz w:val="22"/>
+          <w:rtl w:val="1"/>
+          <w:cs/>
+        </w:rPr>
+        <w:t xml:space="preserve">, </w:t>
+      </w:r>
+      <w:r>
+        <w:rPr>
+          <w:rFonts w:ascii="Arial" w:hAnsi="Arial"/>
+          <w:sz w:val="22"/>
+          <w:rtl w:val="1"/>
+          <w:cs/>
+        </w:rPr>
+        <w:t>_player_rows: dict</w:t>
+      </w:r>
+      <w:r>
+        <w:rPr>
+          <w:rFonts w:ascii="Arial" w:hAnsi="Arial"/>
+          <w:sz w:val="22"/>
+          <w:rtl w:val="1"/>
+          <w:cs/>
+        </w:rPr>
+        <w:t xml:space="preserve">, </w:t>
+      </w:r>
+      <w:r>
+        <w:rPr>
+          <w:rFonts w:ascii="Arial" w:hAnsi="Arial"/>
+          <w:sz w:val="22"/>
+          <w:rtl w:val="1"/>
+          <w:cs/>
+        </w:rPr>
+        <w:t>_mod_checked / _mod_blocked: int</w:t>
+      </w:r>
+      <w:r>
+        <w:rPr>
+          <w:rFonts w:ascii="Arial" w:hAnsi="Arial"/>
+          <w:sz w:val="22"/>
+          <w:rtl w:val="1"/>
+          <w:cs/>
+        </w:rPr>
+        <w:t>.</w:t>
+      </w:r>
+    </w:p>
+    <w:p>
+      <w:pPr>
+        <w:bidi w:val="1"/>
+        <w:pStyle w:val="ListBullet"/>
+        <w:jc w:val="right"/>
+        <w:spacing w:before="20" w:after="20" w:line="252" w:lineRule="auto"/>
+      </w:pPr>
+      <w:r>
+        <w:rPr>
+          <w:rFonts w:ascii="Arial" w:hAnsi="Arial"/>
+          <w:b/>
+          <w:color w:val="0A4D1F"/>
+          <w:sz w:val="22"/>
+          <w:rtl w:val="1"/>
+          <w:cs/>
+        </w:rPr>
+        <w:t>פעולות:</w:t>
+      </w:r>
+      <w:r>
+        <w:rPr>
+          <w:rFonts w:ascii="Arial" w:hAnsi="Arial"/>
+          <w:sz w:val="22"/>
+          <w:rtl w:val="1"/>
+          <w:cs/>
+        </w:rPr>
+        <w:t xml:space="preserve"> </w:t>
+      </w:r>
+      <w:r>
+        <w:rPr>
+          <w:rFonts w:ascii="Arial" w:hAnsi="Arial"/>
+          <w:sz w:val="22"/>
+          <w:rtl w:val="1"/>
+          <w:cs/>
+        </w:rPr>
+        <w:t>run()</w:t>
+      </w:r>
+      <w:r>
+        <w:rPr>
+          <w:rFonts w:ascii="Arial" w:hAnsi="Arial"/>
+          <w:sz w:val="22"/>
+          <w:rtl w:val="1"/>
+          <w:cs/>
+        </w:rPr>
+        <w:t xml:space="preserve"> — מפעיל את השרת ב‑thread ונכנס ל‑Tk mainloop; </w:t>
+      </w:r>
+      <w:r>
+        <w:rPr>
+          <w:rFonts w:ascii="Arial" w:hAnsi="Arial"/>
+          <w:sz w:val="22"/>
+          <w:rtl w:val="1"/>
+          <w:cs/>
+        </w:rPr>
+        <w:t>_poll()</w:t>
+      </w:r>
+      <w:r>
+        <w:rPr>
+          <w:rFonts w:ascii="Arial" w:hAnsi="Arial"/>
+          <w:sz w:val="22"/>
+          <w:rtl w:val="1"/>
+          <w:cs/>
+        </w:rPr>
+        <w:t xml:space="preserve"> — מרענן נתונים כל 400ms; </w:t>
+      </w:r>
+      <w:r>
+        <w:rPr>
+          <w:rFonts w:ascii="Arial" w:hAnsi="Arial"/>
+          <w:sz w:val="22"/>
+          <w:rtl w:val="1"/>
+          <w:cs/>
+        </w:rPr>
+        <w:t>_kick_player(username)</w:t>
+      </w:r>
+      <w:r>
+        <w:rPr>
+          <w:rFonts w:ascii="Arial" w:hAnsi="Arial"/>
+          <w:sz w:val="22"/>
+          <w:rtl w:val="1"/>
+          <w:cs/>
+        </w:rPr>
+        <w:t xml:space="preserve">; </w:t>
+      </w:r>
+      <w:r>
+        <w:rPr>
+          <w:rFonts w:ascii="Arial" w:hAnsi="Arial"/>
+          <w:sz w:val="22"/>
+          <w:rtl w:val="1"/>
+          <w:cs/>
+        </w:rPr>
+        <w:t>_on_stop()</w:t>
+      </w:r>
+      <w:r>
+        <w:rPr>
+          <w:rFonts w:ascii="Arial" w:hAnsi="Arial"/>
+          <w:sz w:val="22"/>
+          <w:rtl w:val="1"/>
+          <w:cs/>
+        </w:rPr>
+        <w:t xml:space="preserve">; </w:t>
+      </w:r>
+      <w:r>
+        <w:rPr>
+          <w:rFonts w:ascii="Arial" w:hAnsi="Arial"/>
+          <w:sz w:val="22"/>
+          <w:rtl w:val="1"/>
+          <w:cs/>
+        </w:rPr>
+        <w:t>_drain_logs()</w:t>
+      </w:r>
+      <w:r>
+        <w:rPr>
+          <w:rFonts w:ascii="Arial" w:hAnsi="Arial"/>
+          <w:sz w:val="22"/>
+          <w:rtl w:val="1"/>
+          <w:cs/>
+        </w:rPr>
+        <w:t xml:space="preserve">; </w:t>
+      </w:r>
+      <w:r>
+        <w:rPr>
+          <w:rFonts w:ascii="Arial" w:hAnsi="Arial"/>
+          <w:sz w:val="22"/>
+          <w:rtl w:val="1"/>
+          <w:cs/>
+        </w:rPr>
+        <w:t>_refresh_players()</w:t>
+      </w:r>
+      <w:r>
+        <w:rPr>
+          <w:rFonts w:ascii="Arial" w:hAnsi="Arial"/>
+          <w:sz w:val="22"/>
+          <w:rtl w:val="1"/>
+          <w:cs/>
+        </w:rPr>
+        <w:t xml:space="preserve">; </w:t>
+      </w:r>
+      <w:r>
+        <w:rPr>
+          <w:rFonts w:ascii="Arial" w:hAnsi="Arial"/>
+          <w:sz w:val="22"/>
+          <w:rtl w:val="1"/>
+          <w:cs/>
+        </w:rPr>
+        <w:t>_refresh_game_status()</w:t>
+      </w:r>
+      <w:r>
+        <w:rPr>
+          <w:rFonts w:ascii="Arial" w:hAnsi="Arial"/>
+          <w:sz w:val="22"/>
+          <w:rtl w:val="1"/>
+          <w:cs/>
+        </w:rPr>
+        <w:t>.</w:t>
+      </w:r>
+    </w:p>
+    <w:p>
+      <w:pPr>
+        <w:bidi w:val="1"/>
+        <w:pStyle w:val="Heading4"/>
+        <w:jc w:val="right"/>
+        <w:spacing w:before="80" w:after="20"/>
+      </w:pPr>
+      <w:r>
+        <w:rPr>
+          <w:rFonts w:ascii="Arial" w:hAnsi="Arial"/>
+          <w:rtl w:val="1"/>
+          <w:cs/>
+        </w:rPr>
+        <w:t>_PlayerRow (‎server/gui.py‎)</w:t>
+      </w:r>
+    </w:p>
+    <w:p>
+      <w:pPr>
+        <w:bidi w:val="1"/>
+        <w:pStyle w:val="ListBullet"/>
+        <w:jc w:val="right"/>
+        <w:spacing w:before="20" w:after="20" w:line="252" w:lineRule="auto"/>
+      </w:pPr>
+      <w:r>
+        <w:rPr>
+          <w:rFonts w:ascii="Arial" w:hAnsi="Arial"/>
+          <w:b/>
+          <w:color w:val="0A4D1F"/>
+          <w:sz w:val="22"/>
+          <w:rtl w:val="1"/>
+          <w:cs/>
+        </w:rPr>
+        <w:t>תפקיד:</w:t>
+      </w:r>
+      <w:r>
+        <w:rPr>
+          <w:rFonts w:ascii="Arial" w:hAnsi="Arial"/>
+          <w:sz w:val="22"/>
+          <w:rtl w:val="1"/>
+          <w:cs/>
+        </w:rPr>
+        <w:t xml:space="preserve"> שורה אחת ברשימת השחקנים — שם, קרדיטים, אחוז ניצחונות, כפתור Kick.</w:t>
+      </w:r>
+    </w:p>
+    <w:p>
+      <w:pPr>
+        <w:bidi w:val="1"/>
+        <w:pStyle w:val="ListBullet"/>
+        <w:jc w:val="right"/>
+        <w:spacing w:before="20" w:after="20" w:line="252" w:lineRule="auto"/>
+      </w:pPr>
+      <w:r>
+        <w:rPr>
+          <w:rFonts w:ascii="Arial" w:hAnsi="Arial"/>
+          <w:b/>
+          <w:color w:val="0A4D1F"/>
+          <w:sz w:val="22"/>
+          <w:rtl w:val="1"/>
+          <w:cs/>
+        </w:rPr>
+        <w:t>פעולות:</w:t>
+      </w:r>
+      <w:r>
+        <w:rPr>
+          <w:rFonts w:ascii="Arial" w:hAnsi="Arial"/>
+          <w:sz w:val="22"/>
+          <w:rtl w:val="1"/>
+          <w:cs/>
+        </w:rPr>
+        <w:t xml:space="preserve"> </w:t>
+      </w:r>
+      <w:r>
+        <w:rPr>
+          <w:rFonts w:ascii="Arial" w:hAnsi="Arial"/>
+          <w:sz w:val="22"/>
+          <w:rtl w:val="1"/>
+          <w:cs/>
+        </w:rPr>
+        <w:t>update_stats(profile)</w:t>
+      </w:r>
+      <w:r>
+        <w:rPr>
+          <w:rFonts w:ascii="Arial" w:hAnsi="Arial"/>
+          <w:sz w:val="22"/>
+          <w:rtl w:val="1"/>
+          <w:cs/>
+        </w:rPr>
+        <w:t xml:space="preserve">; </w:t>
+      </w:r>
+      <w:r>
+        <w:rPr>
+          <w:rFonts w:ascii="Arial" w:hAnsi="Arial"/>
+          <w:sz w:val="22"/>
+          <w:rtl w:val="1"/>
+          <w:cs/>
+        </w:rPr>
+        <w:t>reposition(idx)</w:t>
+      </w:r>
+      <w:r>
+        <w:rPr>
+          <w:rFonts w:ascii="Arial" w:hAnsi="Arial"/>
+          <w:sz w:val="22"/>
+          <w:rtl w:val="1"/>
+          <w:cs/>
+        </w:rPr>
+        <w:t xml:space="preserve">; </w:t>
+      </w:r>
+      <w:r>
+        <w:rPr>
+          <w:rFonts w:ascii="Arial" w:hAnsi="Arial"/>
+          <w:sz w:val="22"/>
+          <w:rtl w:val="1"/>
+          <w:cs/>
+        </w:rPr>
+        <w:t>destroy()</w:t>
       </w:r>
       <w:r>
         <w:rPr>
@@ -26861,7 +28603,7 @@
                 <w:color w:val="1A331F"/>
                 <w:sz w:val="17"/>
               </w:rPr>
-              <w:t>├── run_server.py              ← נקודת כניסה לשרת</w:t>
+              <w:t>├── run_server.py              ← הפעלת שרת (מצב טרמינל)</w:t>
             </w:r>
           </w:p>
         </w:tc>
@@ -26883,7 +28625,7 @@
                 <w:color w:val="1A331F"/>
                 <w:sz w:val="17"/>
               </w:rPr>
-              <w:t>├── run_client.py              ← נקודת כניסה ללקוח</w:t>
+              <w:t>├── run_server_gui.py          ← הפעלת שרת עם לוח בקרה גרפי</w:t>
             </w:r>
           </w:p>
         </w:tc>
@@ -26905,7 +28647,7 @@
                 <w:color w:val="1A331F"/>
                 <w:sz w:val="17"/>
               </w:rPr>
-              <w:t>├── common/                    ← קוד משותף לשרת ולקוח</w:t>
+              <w:t>├── run_client.py              ← נקודת כניסה ללקוח</w:t>
             </w:r>
           </w:p>
         </w:tc>
@@ -26927,7 +28669,7 @@
                 <w:color w:val="1A331F"/>
                 <w:sz w:val="17"/>
               </w:rPr>
-              <w:t>│   ├── __init__.py</w:t>
+              <w:t>├── common/                    ← קוד משותף לשרת ולקוח</w:t>
             </w:r>
           </w:p>
         </w:tc>
@@ -26949,7 +28691,7 @@
                 <w:color w:val="1A331F"/>
                 <w:sz w:val="17"/>
               </w:rPr>
-              <w:t>│   ├── card.py                ← Card</w:t>
+              <w:t>│   ├── __init__.py</w:t>
             </w:r>
           </w:p>
         </w:tc>
@@ -26971,7 +28713,7 @@
                 <w:color w:val="1A331F"/>
                 <w:sz w:val="17"/>
               </w:rPr>
-              <w:t>│   ├── deck.py                ← Deck</w:t>
+              <w:t>│   ├── card.py                ← Card</w:t>
             </w:r>
           </w:p>
         </w:tc>
@@ -26993,7 +28735,7 @@
                 <w:color w:val="1A331F"/>
                 <w:sz w:val="17"/>
               </w:rPr>
-              <w:t>│   ├── hand.py                ← Hand</w:t>
+              <w:t>│   ├── deck.py                ← Deck</w:t>
             </w:r>
           </w:p>
         </w:tc>
@@ -27015,7 +28757,7 @@
                 <w:color w:val="1A331F"/>
                 <w:sz w:val="17"/>
               </w:rPr>
-              <w:t>│   ├── protocol.py            ← framing + JSON envelope + הצפנה</w:t>
+              <w:t>│   ├── hand.py                ← Hand</w:t>
             </w:r>
           </w:p>
         </w:tc>
@@ -27037,7 +28779,7 @@
                 <w:color w:val="1A331F"/>
                 <w:sz w:val="17"/>
               </w:rPr>
-              <w:t>│   └── crypto.py              ← RSAKeyPair, SecureChannel, hash_password</w:t>
+              <w:t>│   ├── protocol.py            ← framing + JSON envelope + הצפנה</w:t>
             </w:r>
           </w:p>
         </w:tc>
@@ -27059,7 +28801,7 @@
                 <w:color w:val="1A331F"/>
                 <w:sz w:val="17"/>
               </w:rPr>
-              <w:t>├── server/                    ← רכיבי השרת בלבד</w:t>
+              <w:t>│   └── crypto.py              ← RSAKeyPair, SecureChannel, hash_password</w:t>
             </w:r>
           </w:p>
         </w:tc>
@@ -27081,7 +28823,7 @@
                 <w:color w:val="1A331F"/>
                 <w:sz w:val="17"/>
               </w:rPr>
-              <w:t>│   ├── __init__.py</w:t>
+              <w:t>├── server/                    ← רכיבי השרת בלבד</w:t>
             </w:r>
           </w:p>
         </w:tc>
@@ -27103,7 +28845,7 @@
                 <w:color w:val="1A331F"/>
                 <w:sz w:val="17"/>
               </w:rPr>
-              <w:t>│   ├── profile_manager.py     ← UserProfile + ProfileManager</w:t>
+              <w:t>│   ├── __init__.py</w:t>
             </w:r>
           </w:p>
         </w:tc>
@@ -27125,7 +28867,7 @@
                 <w:color w:val="1A331F"/>
                 <w:sz w:val="17"/>
               </w:rPr>
-              <w:t>│   ├── game.py                ← Phase, Participant, Player, Dealer, Table</w:t>
+              <w:t>│   ├── profile_manager.py     ← UserProfile + ProfileManager</w:t>
             </w:r>
           </w:p>
         </w:tc>
@@ -27147,7 +28889,73 @@
                 <w:color w:val="1A331F"/>
                 <w:sz w:val="17"/>
               </w:rPr>
-              <w:t>│   ├── client_handler.py      ← Thread אחד לכל לקוח</w:t>
+              <w:t>│   ├── game.py                ← Phase, Participant, Player, Dealer, Table</w:t>
+            </w:r>
+          </w:p>
+        </w:tc>
+      </w:tr>
+      <w:tr>
+        <w:tc>
+          <w:tcPr>
+            <w:tcW w:type="dxa" w:w="9638"/>
+            <w:shd w:val="clear" w:color="auto" w:fill="F0F4F1"/>
+          </w:tcPr>
+          <w:p>
+            <w:pPr>
+              <w:jc w:val="left"/>
+              <w:spacing w:before="0" w:after="0" w:line="220" w:lineRule="auto"/>
+            </w:pPr>
+            <w:r>
+              <w:rPr>
+                <w:rFonts w:ascii="Courier New" w:hAnsi="Courier New"/>
+                <w:color w:val="1A331F"/>
+                <w:sz w:val="17"/>
+              </w:rPr>
+              <w:t>│   ├── client_handler.py      ← Thread אחד לכל לקוח (כולל סינון צ'אט)</w:t>
+            </w:r>
+          </w:p>
+        </w:tc>
+      </w:tr>
+      <w:tr>
+        <w:tc>
+          <w:tcPr>
+            <w:tcW w:type="dxa" w:w="9638"/>
+            <w:shd w:val="clear" w:color="auto" w:fill="F0F4F1"/>
+          </w:tcPr>
+          <w:p>
+            <w:pPr>
+              <w:jc w:val="left"/>
+              <w:spacing w:before="0" w:after="0" w:line="220" w:lineRule="auto"/>
+            </w:pPr>
+            <w:r>
+              <w:rPr>
+                <w:rFonts w:ascii="Courier New" w:hAnsi="Courier New"/>
+                <w:color w:val="1A331F"/>
+                <w:sz w:val="17"/>
+              </w:rPr>
+              <w:t>│   ├── chat_moderator.py      ← ChatModerator (Gemini AI)</w:t>
+            </w:r>
+          </w:p>
+        </w:tc>
+      </w:tr>
+      <w:tr>
+        <w:tc>
+          <w:tcPr>
+            <w:tcW w:type="dxa" w:w="9638"/>
+            <w:shd w:val="clear" w:color="auto" w:fill="F0F4F1"/>
+          </w:tcPr>
+          <w:p>
+            <w:pPr>
+              <w:jc w:val="left"/>
+              <w:spacing w:before="0" w:after="0" w:line="220" w:lineRule="auto"/>
+            </w:pPr>
+            <w:r>
+              <w:rPr>
+                <w:rFonts w:ascii="Courier New" w:hAnsi="Courier New"/>
+                <w:color w:val="1A331F"/>
+                <w:sz w:val="17"/>
+              </w:rPr>
+              <w:t>│   ├── gui.py                 ← ServerApp + _PlayerRow (לוח בקרה)</w:t>
             </w:r>
           </w:p>
         </w:tc>
@@ -27472,7 +29280,7 @@
           <w:rtl w:val="1"/>
           <w:cs/>
         </w:rPr>
-        <w:t>התקנה של החבילה החיצונית היחידה:</w:t>
+        <w:t>התקנת החבילות החיצוניות:</w:t>
       </w:r>
     </w:p>
     <w:p>
@@ -27523,7 +29331,7 @@
           <w:rtl w:val="1"/>
           <w:cs/>
         </w:rPr>
-        <w:t xml:space="preserve">  pip install cryptography</w:t>
+        <w:t xml:space="preserve">  pip install cryptography google-genai</w:t>
       </w:r>
     </w:p>
     <w:p>
@@ -27566,7 +29374,7 @@
           <w:rtl w:val="1"/>
           <w:cs/>
         </w:rPr>
-        <w:t xml:space="preserve">Tkinter כבר כלול בהתקנה הסטנדרטית של Python (ב‑Linux ייתכן שיש להתקין </w:t>
+        <w:t xml:space="preserve">Tkinter כלול בהתקנה הסטנדרטית של Python (ב‑Linux ייתכן שיש להתקין </w:t>
       </w:r>
       <w:r>
         <w:rPr>
@@ -27585,6 +29393,154 @@
           <w:cs/>
         </w:rPr>
         <w:t>).</w:t>
+      </w:r>
+    </w:p>
+    <w:p>
+      <w:pPr>
+        <w:bidi w:val="1"/>
+        <w:pStyle w:val="ListBullet"/>
+        <w:jc w:val="right"/>
+        <w:spacing w:before="20" w:after="20" w:line="252" w:lineRule="auto"/>
+      </w:pPr>
+      <w:r>
+        <w:rPr>
+          <w:rFonts w:ascii="Arial" w:hAnsi="Arial"/>
+          <w:sz w:val="22"/>
+          <w:rtl w:val="1"/>
+          <w:cs/>
+        </w:rPr>
+        <w:t xml:space="preserve">סינון צ'אט בעזרת Gemini הוא </w:t>
+      </w:r>
+      <w:r>
+        <w:rPr>
+          <w:rFonts w:ascii="Arial" w:hAnsi="Arial"/>
+          <w:b/>
+          <w:color w:val="0A4D1F"/>
+          <w:sz w:val="22"/>
+          <w:rtl w:val="1"/>
+          <w:cs/>
+        </w:rPr>
+        <w:t>אופציונלי</w:t>
+      </w:r>
+      <w:r>
+        <w:rPr>
+          <w:rFonts w:ascii="Arial" w:hAnsi="Arial"/>
+          <w:sz w:val="22"/>
+          <w:rtl w:val="1"/>
+          <w:cs/>
+        </w:rPr>
+        <w:t xml:space="preserve"> — ללא </w:t>
+      </w:r>
+      <w:r>
+        <w:rPr>
+          <w:rFonts w:ascii="Arial" w:hAnsi="Arial"/>
+          <w:sz w:val="22"/>
+          <w:rtl w:val="1"/>
+          <w:cs/>
+        </w:rPr>
+        <w:t>GEMINI_API_KEY</w:t>
+      </w:r>
+      <w:r>
+        <w:rPr>
+          <w:rFonts w:ascii="Arial" w:hAnsi="Arial"/>
+          <w:sz w:val="22"/>
+          <w:rtl w:val="1"/>
+          <w:cs/>
+        </w:rPr>
+        <w:t xml:space="preserve"> המשחק עובד רגיל, כל הודעת צ'אט עוברת. להפעלת הסינון:</w:t>
+      </w:r>
+    </w:p>
+    <w:p>
+      <w:pPr>
+        <w:bidi w:val="1"/>
+        <w:jc w:val="right"/>
+        <w:spacing w:before="20" w:after="60" w:line="276" w:lineRule="auto"/>
+      </w:pPr>
+      <w:r>
+        <w:rPr>
+          <w:rFonts w:ascii="Arial" w:hAnsi="Arial"/>
+          <w:sz w:val="22"/>
+          <w:rtl w:val="1"/>
+          <w:cs/>
+        </w:rPr>
+        <w:t xml:space="preserve">  </w:t>
+      </w:r>
+      <w:r>
+        <w:rPr>
+          <w:rFonts w:ascii="Courier New" w:hAnsi="Courier New"/>
+          <w:color w:val="1A331F"/>
+          <w:sz w:val="19"/>
+          <w:rtl w:val="1"/>
+          <w:cs/>
+        </w:rPr>
+        <w:t>`</w:t>
+      </w:r>
+      <w:r>
+        <w:rPr>
+          <w:rFonts w:ascii="Arial" w:hAnsi="Arial"/>
+          <w:sz w:val="22"/>
+          <w:rtl w:val="1"/>
+          <w:cs/>
+        </w:rPr>
+        <w:t>bash</w:t>
+      </w:r>
+    </w:p>
+    <w:p>
+      <w:pPr>
+        <w:bidi w:val="1"/>
+        <w:jc w:val="right"/>
+        <w:spacing w:before="20" w:after="60" w:line="276" w:lineRule="auto"/>
+      </w:pPr>
+      <w:r>
+        <w:rPr>
+          <w:rFonts w:ascii="Arial" w:hAnsi="Arial"/>
+          <w:sz w:val="22"/>
+          <w:rtl w:val="1"/>
+          <w:cs/>
+        </w:rPr>
+        <w:t xml:space="preserve">  export GEMINI_API_KEY="&lt;מפתח שלך&gt;"   # Linux / macOS</w:t>
+      </w:r>
+    </w:p>
+    <w:p>
+      <w:pPr>
+        <w:bidi w:val="1"/>
+        <w:jc w:val="right"/>
+        <w:spacing w:before="20" w:after="60" w:line="276" w:lineRule="auto"/>
+      </w:pPr>
+      <w:r>
+        <w:rPr>
+          <w:rFonts w:ascii="Arial" w:hAnsi="Arial"/>
+          <w:sz w:val="22"/>
+          <w:rtl w:val="1"/>
+          <w:cs/>
+        </w:rPr>
+        <w:t xml:space="preserve">  set GEMINI_API_KEY=&lt;מפתח שלך&gt;        # Windows cmd</w:t>
+      </w:r>
+    </w:p>
+    <w:p>
+      <w:pPr>
+        <w:bidi w:val="1"/>
+        <w:jc w:val="right"/>
+        <w:spacing w:before="20" w:after="60" w:line="276" w:lineRule="auto"/>
+      </w:pPr>
+      <w:r>
+        <w:rPr>
+          <w:rFonts w:ascii="Arial" w:hAnsi="Arial"/>
+          <w:sz w:val="22"/>
+          <w:rtl w:val="1"/>
+          <w:cs/>
+        </w:rPr>
+        <w:t xml:space="preserve">  </w:t>
+      </w:r>
+      <w:r>
+        <w:rPr>
+          <w:rFonts w:ascii="Courier New" w:hAnsi="Courier New"/>
+          <w:color w:val="1A331F"/>
+          <w:sz w:val="19"/>
+          <w:rtl w:val="1"/>
+          <w:cs/>
+        </w:rPr>
+        <w:t>`</w:t>
       </w:r>
     </w:p>
     <w:p>
@@ -28027,6 +29983,40 @@
           <w:cs/>
         </w:rPr>
         <w:t>4.3.1 הפעלת השרת</w:t>
+      </w:r>
+    </w:p>
+    <w:p>
+      <w:pPr>
+        <w:bidi w:val="1"/>
+        <w:jc w:val="right"/>
+        <w:spacing w:before="20" w:after="60" w:line="276" w:lineRule="auto"/>
+      </w:pPr>
+      <w:r>
+        <w:rPr>
+          <w:rFonts w:ascii="Arial" w:hAnsi="Arial"/>
+          <w:sz w:val="22"/>
+          <w:rtl w:val="1"/>
+          <w:cs/>
+        </w:rPr>
+        <w:t>יש שתי דרכים להפעיל את השרת:</w:t>
+      </w:r>
+    </w:p>
+    <w:p>
+      <w:pPr>
+        <w:bidi w:val="1"/>
+        <w:jc w:val="right"/>
+        <w:spacing w:before="20" w:after="60" w:line="276" w:lineRule="auto"/>
+      </w:pPr>
+      <w:r>
+        <w:rPr>
+          <w:rFonts w:ascii="Arial" w:hAnsi="Arial"/>
+          <w:b/>
+          <w:color w:val="0A4D1F"/>
+          <w:sz w:val="22"/>
+          <w:rtl w:val="1"/>
+          <w:cs/>
+        </w:rPr>
+        <w:t>א. מצב טרמינל (ללא חלון גרפי):</w:t>
       </w:r>
     </w:p>
     <w:tbl>
@@ -28076,7 +30066,7 @@
           <w:rtl w:val="1"/>
           <w:cs/>
         </w:rPr>
-        <w:t>יודפס בלוג מסר כגון:</w:t>
+        <w:t>יודפסו הודעות לוג בטרמינל:</w:t>
       </w:r>
     </w:p>
     <w:tbl>
@@ -28144,23 +30134,7 @@
           <w:rtl w:val="1"/>
           <w:cs/>
         </w:rPr>
-        <w:t xml:space="preserve"> (השרת סוגר בנימוס את כל החיבורים).</w:t>
-      </w:r>
-    </w:p>
-    <w:p>
-      <w:pPr>
-        <w:bidi w:val="1"/>
-        <w:pStyle w:val="Heading3"/>
-        <w:jc w:val="right"/>
-        <w:spacing w:before="100" w:after="40"/>
-      </w:pPr>
-      <w:r>
-        <w:rPr>
-          <w:rFonts w:ascii="Arial" w:hAnsi="Arial"/>
-          <w:rtl w:val="1"/>
-          <w:cs/>
-        </w:rPr>
-        <w:t>4.3.2 הפעלת הלקוח</w:t>
+        <w:t xml:space="preserve"> (השרת סוגר את כל החיבורים בנימוס).</w:t>
       </w:r>
     </w:p>
     <w:p>
@@ -28172,11 +30146,13 @@
       <w:r>
         <w:rPr>
           <w:rFonts w:ascii="Arial" w:hAnsi="Arial"/>
-          <w:sz w:val="22"/>
-          <w:rtl w:val="1"/>
-          <w:cs/>
-        </w:rPr>
-        <w:t>על אותו מחשב או על מחשב אחר באותה רשת:</w:t>
+          <w:b/>
+          <w:color w:val="0A4D1F"/>
+          <w:sz w:val="22"/>
+          <w:rtl w:val="1"/>
+          <w:cs/>
+        </w:rPr>
+        <w:t>ב. מצב לוח בקרה גרפי (GUI):</w:t>
       </w:r>
     </w:p>
     <w:tbl>
@@ -28206,7 +30182,7 @@
                 <w:color w:val="1A331F"/>
                 <w:sz w:val="17"/>
               </w:rPr>
-              <w:t>python -m blackjack.run_client</w:t>
+              <w:t>python -m blackjack.run_server_gui</w:t>
             </w:r>
           </w:p>
         </w:tc>
@@ -28226,59 +30202,36 @@
           <w:rtl w:val="1"/>
           <w:cs/>
         </w:rPr>
-        <w:t xml:space="preserve">נפתח חלון התחברות. המשתמש יזין שם משתמש וסיסמה ויקליק </w:t>
-      </w:r>
-      <w:r>
-        <w:rPr>
-          <w:rFonts w:ascii="Arial" w:hAnsi="Arial"/>
-          <w:sz w:val="22"/>
-          <w:rtl w:val="1"/>
-          <w:cs/>
-        </w:rPr>
-        <w:t>Register</w:t>
-      </w:r>
-      <w:r>
-        <w:rPr>
-          <w:rFonts w:ascii="Arial" w:hAnsi="Arial"/>
-          <w:sz w:val="22"/>
-          <w:rtl w:val="1"/>
-          <w:cs/>
-        </w:rPr>
-        <w:t xml:space="preserve"> (פעם ראשונה) או </w:t>
-      </w:r>
-      <w:r>
-        <w:rPr>
-          <w:rFonts w:ascii="Arial" w:hAnsi="Arial"/>
-          <w:sz w:val="22"/>
-          <w:rtl w:val="1"/>
-          <w:cs/>
-        </w:rPr>
-        <w:t>Login</w:t>
-      </w:r>
-      <w:r>
-        <w:rPr>
-          <w:rFonts w:ascii="Arial" w:hAnsi="Arial"/>
-          <w:sz w:val="22"/>
-          <w:rtl w:val="1"/>
-          <w:cs/>
-        </w:rPr>
-        <w:t xml:space="preserve"> (פעמים הבאות).</w:t>
-      </w:r>
-    </w:p>
-    <w:p>
-      <w:pPr>
-        <w:bidi w:val="1"/>
-        <w:pStyle w:val="Heading3"/>
-        <w:jc w:val="right"/>
-        <w:spacing w:before="100" w:after="40"/>
-      </w:pPr>
-      <w:r>
-        <w:rPr>
-          <w:rFonts w:ascii="Arial" w:hAnsi="Arial"/>
-          <w:rtl w:val="1"/>
-          <w:cs/>
-        </w:rPr>
-        <w:t>4.3.3 צילומי מסך עם הסברים בשפה פשוטה</w:t>
+        <w:t xml:space="preserve">נפתח חלון ניהול: רשימת שחקנים, לוג, סטטוס משחק, מונה Gemini, וכפתור </w:t>
+      </w:r>
+      <w:r>
+        <w:rPr>
+          <w:rFonts w:ascii="Arial" w:hAnsi="Arial"/>
+          <w:sz w:val="22"/>
+          <w:rtl w:val="1"/>
+          <w:cs/>
+        </w:rPr>
+        <w:t>Stop Server</w:t>
+      </w:r>
+      <w:r>
+        <w:rPr>
+          <w:rFonts w:ascii="Arial" w:hAnsi="Arial"/>
+          <w:sz w:val="22"/>
+          <w:rtl w:val="1"/>
+          <w:cs/>
+        </w:rPr>
+        <w:t xml:space="preserve"> אדום לעצירה מסודרת. </w:t>
+      </w:r>
+      <w:r>
+        <w:rPr>
+          <w:rFonts w:ascii="Arial" w:hAnsi="Arial"/>
+          <w:b/>
+          <w:color w:val="0A4D1F"/>
+          <w:sz w:val="22"/>
+          <w:rtl w:val="1"/>
+          <w:cs/>
+        </w:rPr>
+        <w:t>כתובת החיבור ללקוחות מוצגת בכותרת החלון.</w:t>
       </w:r>
     </w:p>
     <w:p>
@@ -28298,6 +30251,160 @@
           <w:rtl w:val="1"/>
           <w:cs/>
         </w:rPr>
+        <w:t>❝  הערה: שני המצבים שקולים מבחינת הלוגיקה — ההבדל הוא רק בממשק האדמין. ניתן להפעיל ‎run_server.py‎ על שרת ללא מסך (headless) ו‑‎run_server_gui.py‎ כשמפעילים מתחנת עבודה.</w:t>
+      </w:r>
+    </w:p>
+    <w:p>
+      <w:pPr>
+        <w:bidi w:val="1"/>
+        <w:pStyle w:val="Heading3"/>
+        <w:jc w:val="right"/>
+        <w:spacing w:before="100" w:after="40"/>
+      </w:pPr>
+      <w:r>
+        <w:rPr>
+          <w:rFonts w:ascii="Arial" w:hAnsi="Arial"/>
+          <w:rtl w:val="1"/>
+          <w:cs/>
+        </w:rPr>
+        <w:t>4.3.2 הפעלת הלקוח</w:t>
+      </w:r>
+    </w:p>
+    <w:p>
+      <w:pPr>
+        <w:bidi w:val="1"/>
+        <w:jc w:val="right"/>
+        <w:spacing w:before="20" w:after="60" w:line="276" w:lineRule="auto"/>
+      </w:pPr>
+      <w:r>
+        <w:rPr>
+          <w:rFonts w:ascii="Arial" w:hAnsi="Arial"/>
+          <w:sz w:val="22"/>
+          <w:rtl w:val="1"/>
+          <w:cs/>
+        </w:rPr>
+        <w:t>על אותו מחשב או על מחשב אחר באותה רשת:</w:t>
+      </w:r>
+    </w:p>
+    <w:tbl>
+      <w:tblPr>
+        <w:tblStyle w:val="TableGrid"/>
+        <w:tblW w:type="auto" w:w="0"/>
+        <w:jc w:val="center"/>
+        <w:tblLook w:firstColumn="1" w:firstRow="1" w:lastColumn="0" w:lastRow="0" w:noHBand="0" w:noVBand="1" w:val="04A0"/>
+      </w:tblPr>
+      <w:tblGrid>
+        <w:gridCol w:w="9072"/>
+      </w:tblGrid>
+      <w:tr>
+        <w:tc>
+          <w:tcPr>
+            <w:tcW w:type="dxa" w:w="9638"/>
+            <w:shd w:val="clear" w:color="auto" w:fill="F0F4F1"/>
+          </w:tcPr>
+          <w:p>
+            <w:pPr>
+              <w:jc w:val="left"/>
+              <w:spacing w:before="0" w:after="0" w:line="220" w:lineRule="auto"/>
+            </w:pPr>
+            <w:r>
+              <w:rPr>
+                <w:rFonts w:ascii="Courier New" w:hAnsi="Courier New"/>
+                <w:color w:val="1A331F"/>
+                <w:sz w:val="17"/>
+              </w:rPr>
+              <w:t>python -m blackjack.run_client</w:t>
+            </w:r>
+          </w:p>
+        </w:tc>
+      </w:tr>
+    </w:tbl>
+    <w:p/>
+    <w:p>
+      <w:pPr>
+        <w:bidi w:val="1"/>
+        <w:jc w:val="right"/>
+        <w:spacing w:before="20" w:after="60" w:line="276" w:lineRule="auto"/>
+      </w:pPr>
+      <w:r>
+        <w:rPr>
+          <w:rFonts w:ascii="Arial" w:hAnsi="Arial"/>
+          <w:sz w:val="22"/>
+          <w:rtl w:val="1"/>
+          <w:cs/>
+        </w:rPr>
+        <w:t xml:space="preserve">נפתח חלון התחברות. המשתמש יזין שם משתמש וסיסמה ויקליק </w:t>
+      </w:r>
+      <w:r>
+        <w:rPr>
+          <w:rFonts w:ascii="Arial" w:hAnsi="Arial"/>
+          <w:sz w:val="22"/>
+          <w:rtl w:val="1"/>
+          <w:cs/>
+        </w:rPr>
+        <w:t>Register</w:t>
+      </w:r>
+      <w:r>
+        <w:rPr>
+          <w:rFonts w:ascii="Arial" w:hAnsi="Arial"/>
+          <w:sz w:val="22"/>
+          <w:rtl w:val="1"/>
+          <w:cs/>
+        </w:rPr>
+        <w:t xml:space="preserve"> (פעם ראשונה) או </w:t>
+      </w:r>
+      <w:r>
+        <w:rPr>
+          <w:rFonts w:ascii="Arial" w:hAnsi="Arial"/>
+          <w:sz w:val="22"/>
+          <w:rtl w:val="1"/>
+          <w:cs/>
+        </w:rPr>
+        <w:t>Login</w:t>
+      </w:r>
+      <w:r>
+        <w:rPr>
+          <w:rFonts w:ascii="Arial" w:hAnsi="Arial"/>
+          <w:sz w:val="22"/>
+          <w:rtl w:val="1"/>
+          <w:cs/>
+        </w:rPr>
+        <w:t xml:space="preserve"> (פעמים הבאות).</w:t>
+      </w:r>
+    </w:p>
+    <w:p>
+      <w:pPr>
+        <w:bidi w:val="1"/>
+        <w:pStyle w:val="Heading3"/>
+        <w:jc w:val="right"/>
+        <w:spacing w:before="100" w:after="40"/>
+      </w:pPr>
+      <w:r>
+        <w:rPr>
+          <w:rFonts w:ascii="Arial" w:hAnsi="Arial"/>
+          <w:rtl w:val="1"/>
+          <w:cs/>
+        </w:rPr>
+        <w:t>4.3.3 צילומי מסך עם הסברים בשפה פשוטה</w:t>
+      </w:r>
+    </w:p>
+    <w:p>
+      <w:pPr>
+        <w:bidi w:val="1"/>
+        <w:jc w:val="right"/>
+        <w:shd w:val="clear" w:color="auto" w:fill="EDF8F1"/>
+        <w:ind w:right="360" w:left="360"/>
+        <w:spacing w:before="60" w:after="60"/>
+      </w:pPr>
+      <w:r>
+        <w:rPr>
+          <w:rFonts w:ascii="Arial" w:hAnsi="Arial"/>
+          <w:i/>
+          <w:color w:val="0A4D1F"/>
+          <w:sz w:val="20"/>
+          <w:rtl w:val="1"/>
+          <w:cs/>
+        </w:rPr>
         <w:t>❝  *(להוסיף בגרסה הסופית לאחר הצילום בפועל. בכל צילום מסך לכלול חץ או הסבר קצר במשפט.)*</w:t>
       </w:r>
     </w:p>
@@ -28511,6 +30618,34 @@
           <w:cs/>
         </w:rPr>
         <w:t xml:space="preserve"> "באנר זהוב = ניצחת; אדום = הפסדת; אפור = פוש (תיקו)."</w:t>
+      </w:r>
+    </w:p>
+    <w:p>
+      <w:pPr>
+        <w:bidi w:val="1"/>
+        <w:pStyle w:val="ListBullet"/>
+        <w:jc w:val="right"/>
+        <w:spacing w:before="20" w:after="20" w:line="252" w:lineRule="auto"/>
+      </w:pPr>
+      <w:r>
+        <w:rPr>
+          <w:rFonts w:ascii="Arial" w:hAnsi="Arial"/>
+          <w:b/>
+          <w:color w:val="0A4D1F"/>
+          <w:sz w:val="22"/>
+          <w:rtl w:val="1"/>
+          <w:cs/>
+        </w:rPr>
+        <w:t>צילום 6 – לוח בקרה שרת:</w:t>
+      </w:r>
+      <w:r>
+        <w:rPr>
+          <w:rFonts w:ascii="Arial" w:hAnsi="Arial"/>
+          <w:sz w:val="22"/>
+          <w:rtl w:val="1"/>
+          <w:cs/>
+        </w:rPr>
+        <w:t xml:space="preserve"> "חלון האדמין. בצד שמאל — רשימת שחקנים מחוברים עם כפתור Kick לכל אחד. בצד ימין — לוג הצבעוני. בשורה התחתונה — שלב המשחק ומונה Gemini."</w:t>
       </w:r>
     </w:p>
     <w:p>
@@ -29452,6 +31587,42 @@
           <w:cs/>
         </w:rPr>
         <w:t xml:space="preserve"> [Video]. YouTube. https://www.youtube.com/watch?v=GSIDS_lvRv4</w:t>
+      </w:r>
+    </w:p>
+    <w:p>
+      <w:pPr>
+        <w:bidi w:val="1"/>
+        <w:pStyle w:val="ListBullet"/>
+        <w:jc w:val="right"/>
+        <w:spacing w:before="20" w:after="20" w:line="252" w:lineRule="auto"/>
+      </w:pPr>
+      <w:r>
+        <w:rPr>
+          <w:rFonts w:ascii="Arial" w:hAnsi="Arial"/>
+          <w:sz w:val="22"/>
+          <w:rtl w:val="1"/>
+          <w:cs/>
+        </w:rPr>
+        <w:t xml:space="preserve">Google. (2025). </w:t>
+      </w:r>
+      <w:r>
+        <w:rPr>
+          <w:rFonts w:ascii="Arial" w:hAnsi="Arial"/>
+          <w:i/>
+          <w:sz w:val="22"/>
+          <w:rtl w:val="1"/>
+          <w:cs/>
+        </w:rPr>
+        <w:t>Google Generative AI Python SDK (google-genai)</w:t>
+      </w:r>
+      <w:r>
+        <w:rPr>
+          <w:rFonts w:ascii="Arial" w:hAnsi="Arial"/>
+          <w:sz w:val="22"/>
+          <w:rtl w:val="1"/>
+          <w:cs/>
+        </w:rPr>
+        <w:t>. Retrieved from https://ai.google.dev/gemini-api/docs/sdks</w:t>
       </w:r>
     </w:p>
     <w:p>
@@ -29746,7 +31917,7 @@
           <w:rtl w:val="1"/>
           <w:cs/>
         </w:rPr>
-        <w:t xml:space="preserve">Thread הוא "תהליכון" – נתיב ביצוע נוסף בתוך אותה תוכנה. שני threads המנסים לקרוא ולכתוב לאותו משתנה בו זמנית עלולים להגיע ל‑race condition. </w:t>
+        <w:t xml:space="preserve">Thread הוא "תהליכון" – נתיב ביצוע נוסף בתוך אותה תוכנה. שני threads שמנסים לשנות את אותו נתון בו‑זמנית עלולים לגרום לתוצאה שגויה (race condition). </w:t>
       </w:r>
       <w:r>
         <w:rPr>
@@ -29764,7 +31935,7 @@
           <w:rtl w:val="1"/>
           <w:cs/>
         </w:rPr>
-        <w:t xml:space="preserve"> (וביתר ספציפית </w:t>
+        <w:t xml:space="preserve"> (ובמקרה שלנו </w:t>
       </w:r>
       <w:r>
         <w:rPr>
@@ -29782,7 +31953,75 @@
           <w:rtl w:val="1"/>
           <w:cs/>
         </w:rPr>
-        <w:t>) מבטיח שרק thread אחד "מחזיק את המפתח" באותו רגע, וכל אחר ימתין.</w:t>
+        <w:t>, שמאפשר לאותו thread לנעול שנית) מבטיח שרק thread אחד "מחזיק את המפתח" ברגע נתון — כל האחרים ממתינים.</w:t>
+      </w:r>
+    </w:p>
+    <w:p>
+      <w:pPr>
+        <w:bidi w:val="1"/>
+        <w:pStyle w:val="Heading3"/>
+        <w:jc w:val="right"/>
+        <w:spacing w:before="100" w:after="40"/>
+      </w:pPr>
+      <w:r>
+        <w:rPr>
+          <w:rFonts w:ascii="Arial" w:hAnsi="Arial"/>
+          <w:rtl w:val="1"/>
+          <w:cs/>
+        </w:rPr>
+        <w:t>B.6 Gemini AI (google-genai)</w:t>
+      </w:r>
+    </w:p>
+    <w:p>
+      <w:pPr>
+        <w:bidi w:val="1"/>
+        <w:jc w:val="right"/>
+        <w:spacing w:before="20" w:after="60" w:line="276" w:lineRule="auto"/>
+      </w:pPr>
+      <w:r>
+        <w:rPr>
+          <w:rFonts w:ascii="Arial" w:hAnsi="Arial"/>
+          <w:sz w:val="22"/>
+          <w:rtl w:val="1"/>
+          <w:cs/>
+        </w:rPr>
+        <w:t xml:space="preserve">Gemini הוא מודל שפה גדול (LLM) של Google. במשחק שלנו משתמשים ב‑Gemini 2.0 Flash — גרסה קלה ומהירה — אך ורק לסינון הודעות צ'אט: כל הודעה נשלחת ל‑API ומחזירה ALLOW או BLOCK בהתאם ל‑system prompt שקבענו. ה‑SDK </w:t>
+      </w:r>
+      <w:r>
+        <w:rPr>
+          <w:rFonts w:ascii="Arial" w:hAnsi="Arial"/>
+          <w:sz w:val="22"/>
+          <w:rtl w:val="1"/>
+          <w:cs/>
+        </w:rPr>
+        <w:t>google-genai</w:t>
+      </w:r>
+      <w:r>
+        <w:rPr>
+          <w:rFonts w:ascii="Arial" w:hAnsi="Arial"/>
+          <w:sz w:val="22"/>
+          <w:rtl w:val="1"/>
+          <w:cs/>
+        </w:rPr>
+        <w:t xml:space="preserve"> הוא הממשק הרשמי של Google ל‑Python. כדי שהמשחק לא יתקע אם ה‑API לא זמין, </w:t>
+      </w:r>
+      <w:r>
+        <w:rPr>
+          <w:rFonts w:ascii="Arial" w:hAnsi="Arial"/>
+          <w:sz w:val="22"/>
+          <w:rtl w:val="1"/>
+          <w:cs/>
+        </w:rPr>
+        <w:t>ChatModerator</w:t>
+      </w:r>
+      <w:r>
+        <w:rPr>
+          <w:rFonts w:ascii="Arial" w:hAnsi="Arial"/>
+          <w:sz w:val="22"/>
+          <w:rtl w:val="1"/>
+          <w:cs/>
+        </w:rPr>
+        <w:t xml:space="preserve"> עוטף את הקריאה ב‑try/except ומאפשר מעבר כברירת מחדל.</w:t>
       </w:r>
     </w:p>
     <w:p>
@@ -30025,7 +32264,58 @@
           <w:rtl w:val="1"/>
           <w:cs/>
         </w:rPr>
+        <w:t>blackjack/server/chat_moderator.py</w:t>
+      </w:r>
+    </w:p>
+    <w:p>
+      <w:pPr>
+        <w:bidi w:val="1"/>
+        <w:pStyle w:val="ListNumber"/>
+        <w:jc w:val="right"/>
+        <w:spacing w:before="20" w:after="20" w:line="252" w:lineRule="auto"/>
+      </w:pPr>
+      <w:r>
+        <w:rPr>
+          <w:rFonts w:ascii="Arial" w:hAnsi="Arial"/>
+          <w:sz w:val="22"/>
+          <w:rtl w:val="1"/>
+          <w:cs/>
+        </w:rPr>
+        <w:t>blackjack/server/gui.py</w:t>
+      </w:r>
+    </w:p>
+    <w:p>
+      <w:pPr>
+        <w:bidi w:val="1"/>
+        <w:pStyle w:val="ListNumber"/>
+        <w:jc w:val="right"/>
+        <w:spacing w:before="20" w:after="20" w:line="252" w:lineRule="auto"/>
+      </w:pPr>
+      <w:r>
+        <w:rPr>
+          <w:rFonts w:ascii="Arial" w:hAnsi="Arial"/>
+          <w:sz w:val="22"/>
+          <w:rtl w:val="1"/>
+          <w:cs/>
+        </w:rPr>
         <w:t>blackjack/run_server.py</w:t>
+      </w:r>
+    </w:p>
+    <w:p>
+      <w:pPr>
+        <w:bidi w:val="1"/>
+        <w:pStyle w:val="ListNumber"/>
+        <w:jc w:val="right"/>
+        <w:spacing w:before="20" w:after="20" w:line="252" w:lineRule="auto"/>
+      </w:pPr>
+      <w:r>
+        <w:rPr>
+          <w:rFonts w:ascii="Arial" w:hAnsi="Arial"/>
+          <w:sz w:val="22"/>
+          <w:rtl w:val="1"/>
+          <w:cs/>
+        </w:rPr>
+        <w:t>blackjack/run_server_gui.py</w:t>
       </w:r>
     </w:p>
     <w:p>

</xml_diff>

<commit_message>
Remove mentions of flowcharts from project documentation and files
Removes references to flowchart files from the project's README, documentation file tree, and appendix, and regenerates the DOCX and PDF output files.

Replit-Commit-Author: Agent
Replit-Commit-Session-Id: 0f7ed1f8-bcb2-4642-98d6-71d98ba108b2
Replit-Commit-Checkpoint-Type: full_checkpoint
Replit-Commit-Event-Id: d0487d8b-a24d-4a67-95ec-d10ee63a0be9
Replit-Helium-Checkpoint-Created: true
</commit_message>
<xml_diff>
--- a/blackjack/תיק_פרויקט.docx
+++ b/blackjack/תיק_פרויקט.docx
@@ -18622,50 +18622,6 @@
                 <w:color w:val="1A1A1A"/>
                 <w:sz w:val="17"/>
               </w:rPr>
-              <w:t>├── flowchart.html             &lt;- תרשים זרימה high-level</w:t>
-            </w:r>
-          </w:p>
-        </w:tc>
-      </w:tr>
-      <w:tr>
-        <w:tc>
-          <w:tcPr>
-            <w:tcW w:type="dxa" w:w="9638"/>
-            <w:shd w:val="clear" w:color="auto" w:fill="F2F2F2"/>
-          </w:tcPr>
-          <w:p>
-            <w:pPr>
-              <w:jc w:val="left"/>
-              <w:spacing w:before="0" w:after="0" w:line="220" w:lineRule="auto"/>
-            </w:pPr>
-            <w:r>
-              <w:rPr>
-                <w:rFonts w:ascii="Courier New" w:hAnsi="Courier New"/>
-                <w:color w:val="1A1A1A"/>
-                <w:sz w:val="17"/>
-              </w:rPr>
-              <w:t>├── flowchart_deep.html        &lt;- תרשים לכל קובץ ופונקציה</w:t>
-            </w:r>
-          </w:p>
-        </w:tc>
-      </w:tr>
-      <w:tr>
-        <w:tc>
-          <w:tcPr>
-            <w:tcW w:type="dxa" w:w="9638"/>
-            <w:shd w:val="clear" w:color="auto" w:fill="F2F2F2"/>
-          </w:tcPr>
-          <w:p>
-            <w:pPr>
-              <w:jc w:val="left"/>
-              <w:spacing w:before="0" w:after="0" w:line="220" w:lineRule="auto"/>
-            </w:pPr>
-            <w:r>
-              <w:rPr>
-                <w:rFonts w:ascii="Courier New" w:hAnsi="Courier New"/>
-                <w:color w:val="1A1A1A"/>
-                <w:sz w:val="17"/>
-              </w:rPr>
               <w:t>├── run_server.py              &lt;- הפעלת שרת (טרמינל)</w:t>
             </w:r>
           </w:p>
@@ -20877,60 +20833,7 @@
           <w:rtl w:val="1"/>
           <w:cs/>
         </w:rPr>
-        <w:t>נספח א' – פלואו צ'ארטים</w:t>
-      </w:r>
-    </w:p>
-    <w:p>
-      <w:pPr>
-        <w:bidi w:val="1"/>
-        <w:pStyle w:val="ListBullet"/>
-        <w:jc w:val="right"/>
-        <w:spacing w:before="20" w:after="20" w:line="252" w:lineRule="auto"/>
-      </w:pPr>
-      <w:r>
-        <w:rPr>
-          <w:rFonts w:ascii="Arial" w:hAnsi="Arial"/>
-          <w:sz w:val="22"/>
-          <w:rtl w:val="1"/>
-          <w:cs/>
-        </w:rPr>
-        <w:t>flowchart.html – מסביר את חוויית המשחק (13 שלבים).</w:t>
-      </w:r>
-    </w:p>
-    <w:p>
-      <w:pPr>
-        <w:bidi w:val="1"/>
-        <w:pStyle w:val="ListBullet"/>
-        <w:jc w:val="right"/>
-        <w:spacing w:before="20" w:after="20" w:line="252" w:lineRule="auto"/>
-      </w:pPr>
-      <w:r>
-        <w:rPr>
-          <w:rFonts w:ascii="Arial" w:hAnsi="Arial"/>
-          <w:sz w:val="22"/>
-          <w:rtl w:val="1"/>
-          <w:cs/>
-        </w:rPr>
-        <w:t>flowchart_deep.html – כל קובץ, מחלקה ופונקציה (~90 פריטים).</w:t>
-      </w:r>
-    </w:p>
-    <w:p>
-      <w:pPr>
-        <w:bidi w:val="1"/>
-        <w:pStyle w:val="Heading2"/>
-        <w:jc w:val="right"/>
-        <w:spacing w:before="160" w:after="60"/>
-        <w:pBdr>
-          <w:bottom w:val="single" w:sz="4" w:space="1" w:color="000000"/>
-        </w:pBdr>
-      </w:pPr>
-      <w:r>
-        <w:rPr>
-          <w:rFonts w:ascii="Arial" w:hAnsi="Arial"/>
-          <w:rtl w:val="1"/>
-          <w:cs/>
-        </w:rPr>
-        <w:t>נספח ב' – הסבר טכנולוגיות</w:t>
+        <w:t>נספח א' – הסבר טכנולוגיות</w:t>
       </w:r>
     </w:p>
     <w:p>

</xml_diff>

<commit_message>
Replace file storage with SQLite database for user profiles
Rewrite profile management to use SQLite for persistent storage, updating relevant file paths and documentation.

Replit-Commit-Author: Agent
Replit-Commit-Session-Id: 0f7ed1f8-bcb2-4642-98d6-71d98ba108b2
Replit-Commit-Checkpoint-Type: full_checkpoint
Replit-Commit-Event-Id: 9e38ee08-d784-4cd1-b2d5-91a8493b4c4d
Replit-Helium-Checkpoint-Created: true
</commit_message>
<xml_diff>
--- a/blackjack/תיק_פרויקט.docx
+++ b/blackjack/תיק_פרויקט.docx
@@ -1182,7 +1182,7 @@
           <w:rtl w:val="1"/>
           <w:cs/>
         </w:rPr>
-        <w:t xml:space="preserve"> ושמירת פרופילים בקובץ מקומי – כך שכל שכבה ניתנת לקריאה ולהבנה.</w:t>
+        <w:t xml:space="preserve"> ושמירת פרופילים ב‑SQLite מקומי – כך שכל שכבה ניתנת לקריאה ולהבנה.</w:t>
       </w:r>
     </w:p>
     <w:p>
@@ -1233,7 +1233,7 @@
           <w:rtl w:val="1"/>
           <w:cs/>
         </w:rPr>
-        <w:t xml:space="preserve">. רוב הספריות סטנדרטיות (socket, threading, json, struct, secrets, hmac, hashlib, tkinter). ספריות חיצוניות: </w:t>
+        <w:t xml:space="preserve">. רוב הספריות סטנדרטיות (socket, threading, sqlite3, struct, secrets, hmac, hashlib, tkinter). ספריות חיצוניות: </w:t>
       </w:r>
       <w:r>
         <w:rPr>
@@ -1440,7 +1440,7 @@
           <w:rtl w:val="1"/>
           <w:cs/>
         </w:rPr>
-        <w:t>שמירת נתונים בקובץ JSON עם כתיבה אטומית.</w:t>
+        <w:t>שמירת נתונים במסד נתונים SQLite.</w:t>
       </w:r>
     </w:p>
     <w:p>
@@ -4020,7 +4020,7 @@
                 <w:rtl w:val="1"/>
                 <w:cs/>
               </w:rPr>
-              <w:t>איבוד קובץ פרופילים בכתיבה</w:t>
+              <w:t>שחיתות נתונים בכתיבה</w:t>
             </w:r>
           </w:p>
         </w:tc>
@@ -4044,7 +4044,7 @@
                 <w:rtl w:val="1"/>
                 <w:cs/>
               </w:rPr>
-              <w:t>כתיבה אטומית temp + os.replace</w:t>
+              <w:t>SQLite WAL mode – כתיבות אטומיות מובנות</w:t>
             </w:r>
           </w:p>
         </w:tc>
@@ -4068,7 +4068,7 @@
                 <w:rtl w:val="1"/>
                 <w:cs/>
               </w:rPr>
-              <w:t>ממומש ב‑_save_locked()</w:t>
+              <w:t>ממומש ב‑ProfileManager עם PRAGMA journal_mode=WAL</w:t>
             </w:r>
           </w:p>
         </w:tc>
@@ -4516,7 +4516,7 @@
           <w:rtl w:val="1"/>
           <w:cs/>
         </w:rPr>
-        <w:t xml:space="preserve"> ולידציה, hash_password (PBKDF2), הוספה לפרופילים, שמירה אטומית.</w:t>
+        <w:t xml:space="preserve"> ולידציה, hash_password (PBKDF2), INSERT לטבלת users ב‑SQLite, commit.</w:t>
       </w:r>
     </w:p>
     <w:p>
@@ -5769,7 +5769,7 @@
           <w:rtl w:val="1"/>
           <w:cs/>
         </w:rPr>
-        <w:t xml:space="preserve"> מריץ python -m blackjack.run_server. צריך Python 3.11, חיבור רשת, מקום לשני קבצים (profiles.json, server_rsa.pem).</w:t>
+        <w:t xml:space="preserve"> מריץ python -m blackjack.run_server. צריך Python 3.11, חיבור רשת, מקום לשני קבצים (profiles.db, server_rsa.pem).</w:t>
       </w:r>
     </w:p>
     <w:p>
@@ -6331,7 +6331,7 @@
                 <w:color w:val="1A1A1A"/>
                 <w:sz w:val="17"/>
               </w:rPr>
-              <w:t xml:space="preserve">                |    |  profiles.json   |               |</w:t>
+              <w:t xml:space="preserve">                |    |  profiles.db     |               |</w:t>
             </w:r>
           </w:p>
         </w:tc>
@@ -7146,7 +7146,7 @@
                 <w:rtl w:val="1"/>
                 <w:cs/>
               </w:rPr>
-              <w:t>קובץ JSON, כתיבה אטומית</w:t>
+              <w:t>SQLite (sqlite3) – WAL mode</w:t>
             </w:r>
           </w:p>
         </w:tc>
@@ -7170,7 +7170,7 @@
                 <w:rtl w:val="1"/>
                 <w:cs/>
               </w:rPr>
-              <w:t>פשוט, עמיד בפני קריסה</w:t>
+              <w:t>עמיד בפני קריסה, תומך בשאילתות SQL, חלק מהספרייה הסטנדרטית</w:t>
             </w:r>
           </w:p>
         </w:tc>
@@ -11409,7 +11409,1088 @@
           <w:rtl w:val="1"/>
           <w:cs/>
         </w:rPr>
-        <w:t>2.8.1 קובץ profiles.json</w:t>
+        <w:t>2.8.1 טבלת users – מסד הנתונים profiles.db</w:t>
+      </w:r>
+    </w:p>
+    <w:p>
+      <w:pPr>
+        <w:bidi w:val="1"/>
+        <w:jc w:val="right"/>
+        <w:spacing w:before="20" w:after="60" w:line="276" w:lineRule="auto"/>
+      </w:pPr>
+      <w:r>
+        <w:rPr>
+          <w:rFonts w:ascii="Arial" w:hAnsi="Arial"/>
+          <w:sz w:val="22"/>
+          <w:rtl w:val="1"/>
+          <w:cs/>
+        </w:rPr>
+        <w:t>מסד הנתונים הוא קובץ SQLite יחיד. הטבלה נוצרת אוטומטית בריצה ראשונה.</w:t>
+      </w:r>
+    </w:p>
+    <w:tbl>
+      <w:tblPr>
+        <w:tblStyle w:val="TableGrid"/>
+        <w:tblW w:type="auto" w:w="0"/>
+        <w:jc w:val="center"/>
+        <w:tblLook w:firstColumn="1" w:firstRow="1" w:lastColumn="0" w:lastRow="0" w:noHBand="0" w:noVBand="1" w:val="04A0"/>
+      </w:tblPr>
+      <w:tblGrid>
+        <w:gridCol w:w="9072"/>
+      </w:tblGrid>
+      <w:tr>
+        <w:tc>
+          <w:tcPr>
+            <w:tcW w:type="dxa" w:w="9638"/>
+            <w:shd w:val="clear" w:color="auto" w:fill="F2F2F2"/>
+          </w:tcPr>
+          <w:p>
+            <w:pPr>
+              <w:jc w:val="left"/>
+              <w:spacing w:before="0" w:after="0" w:line="220" w:lineRule="auto"/>
+            </w:pPr>
+            <w:r>
+              <w:rPr>
+                <w:rFonts w:ascii="Courier New" w:hAnsi="Courier New"/>
+                <w:color w:val="1A1A1A"/>
+                <w:sz w:val="17"/>
+              </w:rPr>
+              <w:t>CREATE TABLE IF NOT EXISTS users (</w:t>
+            </w:r>
+          </w:p>
+        </w:tc>
+      </w:tr>
+      <w:tr>
+        <w:tc>
+          <w:tcPr>
+            <w:tcW w:type="dxa" w:w="9638"/>
+            <w:shd w:val="clear" w:color="auto" w:fill="F2F2F2"/>
+          </w:tcPr>
+          <w:p>
+            <w:pPr>
+              <w:jc w:val="left"/>
+              <w:spacing w:before="0" w:after="0" w:line="220" w:lineRule="auto"/>
+            </w:pPr>
+            <w:r>
+              <w:rPr>
+                <w:rFonts w:ascii="Courier New" w:hAnsi="Courier New"/>
+                <w:color w:val="1A1A1A"/>
+                <w:sz w:val="17"/>
+              </w:rPr>
+              <w:t xml:space="preserve">    username      TEXT    PRIMARY KEY,</w:t>
+            </w:r>
+          </w:p>
+        </w:tc>
+      </w:tr>
+      <w:tr>
+        <w:tc>
+          <w:tcPr>
+            <w:tcW w:type="dxa" w:w="9638"/>
+            <w:shd w:val="clear" w:color="auto" w:fill="F2F2F2"/>
+          </w:tcPr>
+          <w:p>
+            <w:pPr>
+              <w:jc w:val="left"/>
+              <w:spacing w:before="0" w:after="0" w:line="220" w:lineRule="auto"/>
+            </w:pPr>
+            <w:r>
+              <w:rPr>
+                <w:rFonts w:ascii="Courier New" w:hAnsi="Courier New"/>
+                <w:color w:val="1A1A1A"/>
+                <w:sz w:val="17"/>
+              </w:rPr>
+              <w:t xml:space="preserve">    password_hash TEXT    NOT NULL,</w:t>
+            </w:r>
+          </w:p>
+        </w:tc>
+      </w:tr>
+      <w:tr>
+        <w:tc>
+          <w:tcPr>
+            <w:tcW w:type="dxa" w:w="9638"/>
+            <w:shd w:val="clear" w:color="auto" w:fill="F2F2F2"/>
+          </w:tcPr>
+          <w:p>
+            <w:pPr>
+              <w:jc w:val="left"/>
+              <w:spacing w:before="0" w:after="0" w:line="220" w:lineRule="auto"/>
+            </w:pPr>
+            <w:r>
+              <w:rPr>
+                <w:rFonts w:ascii="Courier New" w:hAnsi="Courier New"/>
+                <w:color w:val="1A1A1A"/>
+                <w:sz w:val="17"/>
+              </w:rPr>
+              <w:t xml:space="preserve">    credits       INTEGER NOT NULL DEFAULT 10000,</w:t>
+            </w:r>
+          </w:p>
+        </w:tc>
+      </w:tr>
+      <w:tr>
+        <w:tc>
+          <w:tcPr>
+            <w:tcW w:type="dxa" w:w="9638"/>
+            <w:shd w:val="clear" w:color="auto" w:fill="F2F2F2"/>
+          </w:tcPr>
+          <w:p>
+            <w:pPr>
+              <w:jc w:val="left"/>
+              <w:spacing w:before="0" w:after="0" w:line="220" w:lineRule="auto"/>
+            </w:pPr>
+            <w:r>
+              <w:rPr>
+                <w:rFonts w:ascii="Courier New" w:hAnsi="Courier New"/>
+                <w:color w:val="1A1A1A"/>
+                <w:sz w:val="17"/>
+              </w:rPr>
+              <w:t xml:space="preserve">    wins          INTEGER NOT NULL DEFAULT 0,</w:t>
+            </w:r>
+          </w:p>
+        </w:tc>
+      </w:tr>
+      <w:tr>
+        <w:tc>
+          <w:tcPr>
+            <w:tcW w:type="dxa" w:w="9638"/>
+            <w:shd w:val="clear" w:color="auto" w:fill="F2F2F2"/>
+          </w:tcPr>
+          <w:p>
+            <w:pPr>
+              <w:jc w:val="left"/>
+              <w:spacing w:before="0" w:after="0" w:line="220" w:lineRule="auto"/>
+            </w:pPr>
+            <w:r>
+              <w:rPr>
+                <w:rFonts w:ascii="Courier New" w:hAnsi="Courier New"/>
+                <w:color w:val="1A1A1A"/>
+                <w:sz w:val="17"/>
+              </w:rPr>
+              <w:t xml:space="preserve">    losses        INTEGER NOT NULL DEFAULT 0,</w:t>
+            </w:r>
+          </w:p>
+        </w:tc>
+      </w:tr>
+      <w:tr>
+        <w:tc>
+          <w:tcPr>
+            <w:tcW w:type="dxa" w:w="9638"/>
+            <w:shd w:val="clear" w:color="auto" w:fill="F2F2F2"/>
+          </w:tcPr>
+          <w:p>
+            <w:pPr>
+              <w:jc w:val="left"/>
+              <w:spacing w:before="0" w:after="0" w:line="220" w:lineRule="auto"/>
+            </w:pPr>
+            <w:r>
+              <w:rPr>
+                <w:rFonts w:ascii="Courier New" w:hAnsi="Courier New"/>
+                <w:color w:val="1A1A1A"/>
+                <w:sz w:val="17"/>
+              </w:rPr>
+              <w:t xml:space="preserve">    pushes        INTEGER NOT NULL DEFAULT 0</w:t>
+            </w:r>
+          </w:p>
+        </w:tc>
+      </w:tr>
+      <w:tr>
+        <w:tc>
+          <w:tcPr>
+            <w:tcW w:type="dxa" w:w="9638"/>
+            <w:shd w:val="clear" w:color="auto" w:fill="F2F2F2"/>
+          </w:tcPr>
+          <w:p>
+            <w:pPr>
+              <w:jc w:val="left"/>
+              <w:spacing w:before="0" w:after="0" w:line="220" w:lineRule="auto"/>
+            </w:pPr>
+            <w:r>
+              <w:rPr>
+                <w:rFonts w:ascii="Courier New" w:hAnsi="Courier New"/>
+                <w:color w:val="1A1A1A"/>
+                <w:sz w:val="17"/>
+              </w:rPr>
+              <w:t>);</w:t>
+            </w:r>
+          </w:p>
+        </w:tc>
+      </w:tr>
+    </w:tbl>
+    <w:p/>
+    <w:tbl>
+      <w:tblPr>
+        <w:tblStyle w:val="TableGrid"/>
+        <w:tblW w:type="auto" w:w="0"/>
+        <w:jc w:val="center"/>
+        <w:tblLook w:firstColumn="1" w:firstRow="1" w:lastColumn="0" w:lastRow="0" w:noHBand="0" w:noVBand="1" w:val="04A0"/>
+      </w:tblPr>
+      <w:tblGrid>
+        <w:gridCol w:w="2268"/>
+        <w:gridCol w:w="2268"/>
+        <w:gridCol w:w="2268"/>
+        <w:gridCol w:w="2268"/>
+      </w:tblGrid>
+      <w:tr>
+        <w:tc>
+          <w:tcPr>
+            <w:tcW w:type="dxa" w:w="2409"/>
+            <w:vAlign w:val="center"/>
+            <w:shd w:val="clear" w:color="auto" w:fill="D0D0D0"/>
+          </w:tcPr>
+          <w:p>
+            <w:pPr>
+              <w:bidi w:val="1"/>
+              <w:jc w:val="right"/>
+              <w:spacing w:before="40" w:after="40"/>
+            </w:pPr>
+            <w:r>
+              <w:rPr>
+                <w:rFonts w:ascii="Arial" w:hAnsi="Arial"/>
+                <w:b/>
+                <w:color w:val="1A1A1A"/>
+                <w:sz w:val="19"/>
+                <w:rtl w:val="1"/>
+                <w:cs/>
+              </w:rPr>
+              <w:t>שם עמודה</w:t>
+            </w:r>
+          </w:p>
+        </w:tc>
+        <w:tc>
+          <w:tcPr>
+            <w:tcW w:type="dxa" w:w="2409"/>
+            <w:vAlign w:val="center"/>
+            <w:shd w:val="clear" w:color="auto" w:fill="D0D0D0"/>
+          </w:tcPr>
+          <w:p>
+            <w:pPr>
+              <w:bidi w:val="1"/>
+              <w:jc w:val="right"/>
+              <w:spacing w:before="40" w:after="40"/>
+            </w:pPr>
+            <w:r>
+              <w:rPr>
+                <w:rFonts w:ascii="Arial" w:hAnsi="Arial"/>
+                <w:b/>
+                <w:color w:val="1A1A1A"/>
+                <w:sz w:val="19"/>
+                <w:rtl w:val="1"/>
+                <w:cs/>
+              </w:rPr>
+              <w:t>טיפוס</w:t>
+            </w:r>
+          </w:p>
+        </w:tc>
+        <w:tc>
+          <w:tcPr>
+            <w:tcW w:type="dxa" w:w="2409"/>
+            <w:vAlign w:val="center"/>
+            <w:shd w:val="clear" w:color="auto" w:fill="D0D0D0"/>
+          </w:tcPr>
+          <w:p>
+            <w:pPr>
+              <w:bidi w:val="1"/>
+              <w:jc w:val="right"/>
+              <w:spacing w:before="40" w:after="40"/>
+            </w:pPr>
+            <w:r>
+              <w:rPr>
+                <w:rFonts w:ascii="Arial" w:hAnsi="Arial"/>
+                <w:b/>
+                <w:color w:val="1A1A1A"/>
+                <w:sz w:val="19"/>
+                <w:rtl w:val="1"/>
+                <w:cs/>
+              </w:rPr>
+              <w:t>אורך / טווח</w:t>
+            </w:r>
+          </w:p>
+        </w:tc>
+        <w:tc>
+          <w:tcPr>
+            <w:tcW w:type="dxa" w:w="2409"/>
+            <w:vAlign w:val="center"/>
+            <w:shd w:val="clear" w:color="auto" w:fill="D0D0D0"/>
+          </w:tcPr>
+          <w:p>
+            <w:pPr>
+              <w:bidi w:val="1"/>
+              <w:jc w:val="right"/>
+              <w:spacing w:before="40" w:after="40"/>
+            </w:pPr>
+            <w:r>
+              <w:rPr>
+                <w:rFonts w:ascii="Arial" w:hAnsi="Arial"/>
+                <w:b/>
+                <w:color w:val="1A1A1A"/>
+                <w:sz w:val="19"/>
+                <w:rtl w:val="1"/>
+                <w:cs/>
+              </w:rPr>
+              <w:t>דוגמה</w:t>
+            </w:r>
+          </w:p>
+        </w:tc>
+      </w:tr>
+      <w:tr>
+        <w:tc>
+          <w:tcPr>
+            <w:tcW w:type="dxa" w:w="2409"/>
+            <w:vAlign w:val="center"/>
+            <w:shd w:val="clear" w:color="auto" w:fill="F5F5F5"/>
+          </w:tcPr>
+          <w:p>
+            <w:pPr>
+              <w:bidi w:val="1"/>
+              <w:jc w:val="right"/>
+              <w:spacing w:before="40" w:after="40"/>
+            </w:pPr>
+            <w:r>
+              <w:rPr>
+                <w:rFonts w:ascii="Arial" w:hAnsi="Arial"/>
+                <w:color w:val="1A1A1A"/>
+                <w:sz w:val="19"/>
+                <w:rtl w:val="1"/>
+                <w:cs/>
+              </w:rPr>
+              <w:t>username</w:t>
+            </w:r>
+          </w:p>
+        </w:tc>
+        <w:tc>
+          <w:tcPr>
+            <w:tcW w:type="dxa" w:w="2409"/>
+            <w:vAlign w:val="center"/>
+            <w:shd w:val="clear" w:color="auto" w:fill="F5F5F5"/>
+          </w:tcPr>
+          <w:p>
+            <w:pPr>
+              <w:bidi w:val="1"/>
+              <w:jc w:val="right"/>
+              <w:spacing w:before="40" w:after="40"/>
+            </w:pPr>
+            <w:r>
+              <w:rPr>
+                <w:rFonts w:ascii="Arial" w:hAnsi="Arial"/>
+                <w:color w:val="1A1A1A"/>
+                <w:sz w:val="19"/>
+                <w:rtl w:val="1"/>
+                <w:cs/>
+              </w:rPr>
+              <w:t>TEXT (PRIMARY KEY)</w:t>
+            </w:r>
+          </w:p>
+        </w:tc>
+        <w:tc>
+          <w:tcPr>
+            <w:tcW w:type="dxa" w:w="2409"/>
+            <w:vAlign w:val="center"/>
+            <w:shd w:val="clear" w:color="auto" w:fill="F5F5F5"/>
+          </w:tcPr>
+          <w:p>
+            <w:pPr>
+              <w:bidi w:val="1"/>
+              <w:jc w:val="right"/>
+              <w:spacing w:before="40" w:after="40"/>
+            </w:pPr>
+            <w:r>
+              <w:rPr>
+                <w:rFonts w:ascii="Arial" w:hAnsi="Arial"/>
+                <w:color w:val="1A1A1A"/>
+                <w:sz w:val="19"/>
+                <w:rtl w:val="1"/>
+                <w:cs/>
+              </w:rPr>
+              <w:t>3-16 תווים, A-Za-z0-9_</w:t>
+            </w:r>
+          </w:p>
+        </w:tc>
+        <w:tc>
+          <w:tcPr>
+            <w:tcW w:type="dxa" w:w="2409"/>
+            <w:vAlign w:val="center"/>
+            <w:shd w:val="clear" w:color="auto" w:fill="F5F5F5"/>
+          </w:tcPr>
+          <w:p>
+            <w:pPr>
+              <w:bidi w:val="1"/>
+              <w:jc w:val="right"/>
+              <w:spacing w:before="40" w:after="40"/>
+            </w:pPr>
+            <w:r>
+              <w:rPr>
+                <w:rFonts w:ascii="Arial" w:hAnsi="Arial"/>
+                <w:color w:val="1A1A1A"/>
+                <w:sz w:val="19"/>
+                <w:rtl w:val="1"/>
+                <w:cs/>
+              </w:rPr>
+              <w:t>"alice"</w:t>
+            </w:r>
+          </w:p>
+        </w:tc>
+      </w:tr>
+      <w:tr>
+        <w:tc>
+          <w:tcPr>
+            <w:tcW w:type="dxa" w:w="2409"/>
+            <w:vAlign w:val="center"/>
+          </w:tcPr>
+          <w:p>
+            <w:pPr>
+              <w:bidi w:val="1"/>
+              <w:jc w:val="right"/>
+              <w:spacing w:before="40" w:after="40"/>
+            </w:pPr>
+            <w:r>
+              <w:rPr>
+                <w:rFonts w:ascii="Arial" w:hAnsi="Arial"/>
+                <w:color w:val="1A1A1A"/>
+                <w:sz w:val="19"/>
+                <w:rtl w:val="1"/>
+                <w:cs/>
+              </w:rPr>
+              <w:t>password_hash</w:t>
+            </w:r>
+          </w:p>
+        </w:tc>
+        <w:tc>
+          <w:tcPr>
+            <w:tcW w:type="dxa" w:w="2409"/>
+            <w:vAlign w:val="center"/>
+          </w:tcPr>
+          <w:p>
+            <w:pPr>
+              <w:bidi w:val="1"/>
+              <w:jc w:val="right"/>
+              <w:spacing w:before="40" w:after="40"/>
+            </w:pPr>
+            <w:r>
+              <w:rPr>
+                <w:rFonts w:ascii="Arial" w:hAnsi="Arial"/>
+                <w:color w:val="1A1A1A"/>
+                <w:sz w:val="19"/>
+                <w:rtl w:val="1"/>
+                <w:cs/>
+              </w:rPr>
+              <w:t>TEXT</w:t>
+            </w:r>
+          </w:p>
+        </w:tc>
+        <w:tc>
+          <w:tcPr>
+            <w:tcW w:type="dxa" w:w="2409"/>
+            <w:vAlign w:val="center"/>
+          </w:tcPr>
+          <w:p>
+            <w:pPr>
+              <w:bidi w:val="1"/>
+              <w:jc w:val="right"/>
+              <w:spacing w:before="40" w:after="40"/>
+            </w:pPr>
+            <w:r>
+              <w:rPr>
+                <w:rFonts w:ascii="Arial" w:hAnsi="Arial"/>
+                <w:color w:val="1A1A1A"/>
+                <w:sz w:val="19"/>
+                <w:rtl w:val="1"/>
+                <w:cs/>
+              </w:rPr>
+              <w:t>פורמט salt_b64$hash_b64</w:t>
+            </w:r>
+          </w:p>
+        </w:tc>
+        <w:tc>
+          <w:tcPr>
+            <w:tcW w:type="dxa" w:w="2409"/>
+            <w:vAlign w:val="center"/>
+          </w:tcPr>
+          <w:p>
+            <w:pPr>
+              <w:bidi w:val="1"/>
+              <w:jc w:val="right"/>
+              <w:spacing w:before="40" w:after="40"/>
+            </w:pPr>
+            <w:r>
+              <w:rPr>
+                <w:rFonts w:ascii="Arial" w:hAnsi="Arial"/>
+                <w:color w:val="1A1A1A"/>
+                <w:sz w:val="19"/>
+                <w:rtl w:val="1"/>
+                <w:cs/>
+              </w:rPr>
+              <w:t>"k4Ja…$g2Cv…"</w:t>
+            </w:r>
+          </w:p>
+        </w:tc>
+      </w:tr>
+      <w:tr>
+        <w:tc>
+          <w:tcPr>
+            <w:tcW w:type="dxa" w:w="2409"/>
+            <w:vAlign w:val="center"/>
+            <w:shd w:val="clear" w:color="auto" w:fill="F5F5F5"/>
+          </w:tcPr>
+          <w:p>
+            <w:pPr>
+              <w:bidi w:val="1"/>
+              <w:jc w:val="right"/>
+              <w:spacing w:before="40" w:after="40"/>
+            </w:pPr>
+            <w:r>
+              <w:rPr>
+                <w:rFonts w:ascii="Arial" w:hAnsi="Arial"/>
+                <w:color w:val="1A1A1A"/>
+                <w:sz w:val="19"/>
+                <w:rtl w:val="1"/>
+                <w:cs/>
+              </w:rPr>
+              <w:t>credits</w:t>
+            </w:r>
+          </w:p>
+        </w:tc>
+        <w:tc>
+          <w:tcPr>
+            <w:tcW w:type="dxa" w:w="2409"/>
+            <w:vAlign w:val="center"/>
+            <w:shd w:val="clear" w:color="auto" w:fill="F5F5F5"/>
+          </w:tcPr>
+          <w:p>
+            <w:pPr>
+              <w:bidi w:val="1"/>
+              <w:jc w:val="right"/>
+              <w:spacing w:before="40" w:after="40"/>
+            </w:pPr>
+            <w:r>
+              <w:rPr>
+                <w:rFonts w:ascii="Arial" w:hAnsi="Arial"/>
+                <w:color w:val="1A1A1A"/>
+                <w:sz w:val="19"/>
+                <w:rtl w:val="1"/>
+                <w:cs/>
+              </w:rPr>
+              <w:t>INTEGER</w:t>
+            </w:r>
+          </w:p>
+        </w:tc>
+        <w:tc>
+          <w:tcPr>
+            <w:tcW w:type="dxa" w:w="2409"/>
+            <w:vAlign w:val="center"/>
+            <w:shd w:val="clear" w:color="auto" w:fill="F5F5F5"/>
+          </w:tcPr>
+          <w:p>
+            <w:pPr>
+              <w:bidi w:val="1"/>
+              <w:jc w:val="right"/>
+              <w:spacing w:before="40" w:after="40"/>
+            </w:pPr>
+            <w:r>
+              <w:rPr>
+                <w:rFonts w:ascii="Arial" w:hAnsi="Arial"/>
+                <w:color w:val="1A1A1A"/>
+                <w:sz w:val="19"/>
+                <w:rtl w:val="1"/>
+                <w:cs/>
+              </w:rPr>
+              <w:t>&gt;= 0</w:t>
+            </w:r>
+          </w:p>
+        </w:tc>
+        <w:tc>
+          <w:tcPr>
+            <w:tcW w:type="dxa" w:w="2409"/>
+            <w:vAlign w:val="center"/>
+            <w:shd w:val="clear" w:color="auto" w:fill="F5F5F5"/>
+          </w:tcPr>
+          <w:p>
+            <w:pPr>
+              <w:bidi w:val="1"/>
+              <w:jc w:val="right"/>
+              <w:spacing w:before="40" w:after="40"/>
+            </w:pPr>
+            <w:r>
+              <w:rPr>
+                <w:rFonts w:ascii="Arial" w:hAnsi="Arial"/>
+                <w:color w:val="1A1A1A"/>
+                <w:sz w:val="19"/>
+                <w:rtl w:val="1"/>
+                <w:cs/>
+              </w:rPr>
+              <w:t>9750</w:t>
+            </w:r>
+          </w:p>
+        </w:tc>
+      </w:tr>
+      <w:tr>
+        <w:tc>
+          <w:tcPr>
+            <w:tcW w:type="dxa" w:w="2409"/>
+            <w:vAlign w:val="center"/>
+          </w:tcPr>
+          <w:p>
+            <w:pPr>
+              <w:bidi w:val="1"/>
+              <w:jc w:val="right"/>
+              <w:spacing w:before="40" w:after="40"/>
+            </w:pPr>
+            <w:r>
+              <w:rPr>
+                <w:rFonts w:ascii="Arial" w:hAnsi="Arial"/>
+                <w:color w:val="1A1A1A"/>
+                <w:sz w:val="19"/>
+                <w:rtl w:val="1"/>
+                <w:cs/>
+              </w:rPr>
+              <w:t>wins</w:t>
+            </w:r>
+          </w:p>
+        </w:tc>
+        <w:tc>
+          <w:tcPr>
+            <w:tcW w:type="dxa" w:w="2409"/>
+            <w:vAlign w:val="center"/>
+          </w:tcPr>
+          <w:p>
+            <w:pPr>
+              <w:bidi w:val="1"/>
+              <w:jc w:val="right"/>
+              <w:spacing w:before="40" w:after="40"/>
+            </w:pPr>
+            <w:r>
+              <w:rPr>
+                <w:rFonts w:ascii="Arial" w:hAnsi="Arial"/>
+                <w:color w:val="1A1A1A"/>
+                <w:sz w:val="19"/>
+                <w:rtl w:val="1"/>
+                <w:cs/>
+              </w:rPr>
+              <w:t>INTEGER</w:t>
+            </w:r>
+          </w:p>
+        </w:tc>
+        <w:tc>
+          <w:tcPr>
+            <w:tcW w:type="dxa" w:w="2409"/>
+            <w:vAlign w:val="center"/>
+          </w:tcPr>
+          <w:p>
+            <w:pPr>
+              <w:bidi w:val="1"/>
+              <w:jc w:val="right"/>
+              <w:spacing w:before="40" w:after="40"/>
+            </w:pPr>
+            <w:r>
+              <w:rPr>
+                <w:rFonts w:ascii="Arial" w:hAnsi="Arial"/>
+                <w:color w:val="1A1A1A"/>
+                <w:sz w:val="19"/>
+                <w:rtl w:val="1"/>
+                <w:cs/>
+              </w:rPr>
+              <w:t>&gt;= 0</w:t>
+            </w:r>
+          </w:p>
+        </w:tc>
+        <w:tc>
+          <w:tcPr>
+            <w:tcW w:type="dxa" w:w="2409"/>
+            <w:vAlign w:val="center"/>
+          </w:tcPr>
+          <w:p>
+            <w:pPr>
+              <w:bidi w:val="1"/>
+              <w:jc w:val="right"/>
+              <w:spacing w:before="40" w:after="40"/>
+            </w:pPr>
+            <w:r>
+              <w:rPr>
+                <w:rFonts w:ascii="Arial" w:hAnsi="Arial"/>
+                <w:color w:val="1A1A1A"/>
+                <w:sz w:val="19"/>
+                <w:rtl w:val="1"/>
+                <w:cs/>
+              </w:rPr>
+              <w:t>4</w:t>
+            </w:r>
+          </w:p>
+        </w:tc>
+      </w:tr>
+      <w:tr>
+        <w:tc>
+          <w:tcPr>
+            <w:tcW w:type="dxa" w:w="2409"/>
+            <w:vAlign w:val="center"/>
+            <w:shd w:val="clear" w:color="auto" w:fill="F5F5F5"/>
+          </w:tcPr>
+          <w:p>
+            <w:pPr>
+              <w:bidi w:val="1"/>
+              <w:jc w:val="right"/>
+              <w:spacing w:before="40" w:after="40"/>
+            </w:pPr>
+            <w:r>
+              <w:rPr>
+                <w:rFonts w:ascii="Arial" w:hAnsi="Arial"/>
+                <w:color w:val="1A1A1A"/>
+                <w:sz w:val="19"/>
+                <w:rtl w:val="1"/>
+                <w:cs/>
+              </w:rPr>
+              <w:t>losses</w:t>
+            </w:r>
+          </w:p>
+        </w:tc>
+        <w:tc>
+          <w:tcPr>
+            <w:tcW w:type="dxa" w:w="2409"/>
+            <w:vAlign w:val="center"/>
+            <w:shd w:val="clear" w:color="auto" w:fill="F5F5F5"/>
+          </w:tcPr>
+          <w:p>
+            <w:pPr>
+              <w:bidi w:val="1"/>
+              <w:jc w:val="right"/>
+              <w:spacing w:before="40" w:after="40"/>
+            </w:pPr>
+            <w:r>
+              <w:rPr>
+                <w:rFonts w:ascii="Arial" w:hAnsi="Arial"/>
+                <w:color w:val="1A1A1A"/>
+                <w:sz w:val="19"/>
+                <w:rtl w:val="1"/>
+                <w:cs/>
+              </w:rPr>
+              <w:t>INTEGER</w:t>
+            </w:r>
+          </w:p>
+        </w:tc>
+        <w:tc>
+          <w:tcPr>
+            <w:tcW w:type="dxa" w:w="2409"/>
+            <w:vAlign w:val="center"/>
+            <w:shd w:val="clear" w:color="auto" w:fill="F5F5F5"/>
+          </w:tcPr>
+          <w:p>
+            <w:pPr>
+              <w:bidi w:val="1"/>
+              <w:jc w:val="right"/>
+              <w:spacing w:before="40" w:after="40"/>
+            </w:pPr>
+            <w:r>
+              <w:rPr>
+                <w:rFonts w:ascii="Arial" w:hAnsi="Arial"/>
+                <w:color w:val="1A1A1A"/>
+                <w:sz w:val="19"/>
+                <w:rtl w:val="1"/>
+                <w:cs/>
+              </w:rPr>
+              <w:t>&gt;= 0</w:t>
+            </w:r>
+          </w:p>
+        </w:tc>
+        <w:tc>
+          <w:tcPr>
+            <w:tcW w:type="dxa" w:w="2409"/>
+            <w:vAlign w:val="center"/>
+            <w:shd w:val="clear" w:color="auto" w:fill="F5F5F5"/>
+          </w:tcPr>
+          <w:p>
+            <w:pPr>
+              <w:bidi w:val="1"/>
+              <w:jc w:val="right"/>
+              <w:spacing w:before="40" w:after="40"/>
+            </w:pPr>
+            <w:r>
+              <w:rPr>
+                <w:rFonts w:ascii="Arial" w:hAnsi="Arial"/>
+                <w:color w:val="1A1A1A"/>
+                <w:sz w:val="19"/>
+                <w:rtl w:val="1"/>
+                <w:cs/>
+              </w:rPr>
+              <w:t>2</w:t>
+            </w:r>
+          </w:p>
+        </w:tc>
+      </w:tr>
+      <w:tr>
+        <w:tc>
+          <w:tcPr>
+            <w:tcW w:type="dxa" w:w="2409"/>
+            <w:vAlign w:val="center"/>
+          </w:tcPr>
+          <w:p>
+            <w:pPr>
+              <w:bidi w:val="1"/>
+              <w:jc w:val="right"/>
+              <w:spacing w:before="40" w:after="40"/>
+            </w:pPr>
+            <w:r>
+              <w:rPr>
+                <w:rFonts w:ascii="Arial" w:hAnsi="Arial"/>
+                <w:color w:val="1A1A1A"/>
+                <w:sz w:val="19"/>
+                <w:rtl w:val="1"/>
+                <w:cs/>
+              </w:rPr>
+              <w:t>pushes</w:t>
+            </w:r>
+          </w:p>
+        </w:tc>
+        <w:tc>
+          <w:tcPr>
+            <w:tcW w:type="dxa" w:w="2409"/>
+            <w:vAlign w:val="center"/>
+          </w:tcPr>
+          <w:p>
+            <w:pPr>
+              <w:bidi w:val="1"/>
+              <w:jc w:val="right"/>
+              <w:spacing w:before="40" w:after="40"/>
+            </w:pPr>
+            <w:r>
+              <w:rPr>
+                <w:rFonts w:ascii="Arial" w:hAnsi="Arial"/>
+                <w:color w:val="1A1A1A"/>
+                <w:sz w:val="19"/>
+                <w:rtl w:val="1"/>
+                <w:cs/>
+              </w:rPr>
+              <w:t>INTEGER</w:t>
+            </w:r>
+          </w:p>
+        </w:tc>
+        <w:tc>
+          <w:tcPr>
+            <w:tcW w:type="dxa" w:w="2409"/>
+            <w:vAlign w:val="center"/>
+          </w:tcPr>
+          <w:p>
+            <w:pPr>
+              <w:bidi w:val="1"/>
+              <w:jc w:val="right"/>
+              <w:spacing w:before="40" w:after="40"/>
+            </w:pPr>
+            <w:r>
+              <w:rPr>
+                <w:rFonts w:ascii="Arial" w:hAnsi="Arial"/>
+                <w:color w:val="1A1A1A"/>
+                <w:sz w:val="19"/>
+                <w:rtl w:val="1"/>
+                <w:cs/>
+              </w:rPr>
+              <w:t>&gt;= 0</w:t>
+            </w:r>
+          </w:p>
+        </w:tc>
+        <w:tc>
+          <w:tcPr>
+            <w:tcW w:type="dxa" w:w="2409"/>
+            <w:vAlign w:val="center"/>
+          </w:tcPr>
+          <w:p>
+            <w:pPr>
+              <w:bidi w:val="1"/>
+              <w:jc w:val="right"/>
+              <w:spacing w:before="40" w:after="40"/>
+            </w:pPr>
+            <w:r>
+              <w:rPr>
+                <w:rFonts w:ascii="Arial" w:hAnsi="Arial"/>
+                <w:color w:val="1A1A1A"/>
+                <w:sz w:val="19"/>
+                <w:rtl w:val="1"/>
+                <w:cs/>
+              </w:rPr>
+              <w:t>1</w:t>
+            </w:r>
+          </w:p>
+        </w:tc>
+      </w:tr>
+    </w:tbl>
+    <w:p/>
+    <w:p>
+      <w:pPr>
+        <w:bidi w:val="1"/>
+        <w:jc w:val="right"/>
+        <w:spacing w:before="20" w:after="60" w:line="276" w:lineRule="auto"/>
+      </w:pPr>
+      <w:r>
+        <w:rPr>
+          <w:rFonts w:ascii="Arial" w:hAnsi="Arial"/>
+          <w:sz w:val="22"/>
+          <w:rtl w:val="1"/>
+          <w:cs/>
+        </w:rPr>
+        <w:t>SQLite פועל במצב WAL (Write-Ahead Log) – כתיבות אטומיות מובנות, עמיד בפני קריסה.</w:t>
+      </w:r>
+    </w:p>
+    <w:p>
+      <w:pPr>
+        <w:bidi w:val="1"/>
+        <w:pStyle w:val="Heading3"/>
+        <w:jc w:val="right"/>
+        <w:spacing w:before="100" w:after="40"/>
+      </w:pPr>
+      <w:r>
+        <w:rPr>
+          <w:rFonts w:ascii="Arial" w:hAnsi="Arial"/>
+          <w:rtl w:val="1"/>
+          <w:cs/>
+        </w:rPr>
+        <w:t>2.8.2 קובץ server_rsa.pem</w:t>
+      </w:r>
+    </w:p>
+    <w:p>
+      <w:pPr>
+        <w:bidi w:val="1"/>
+        <w:jc w:val="right"/>
+        <w:spacing w:before="20" w:after="60" w:line="276" w:lineRule="auto"/>
+      </w:pPr>
+      <w:r>
+        <w:rPr>
+          <w:rFonts w:ascii="Arial" w:hAnsi="Arial"/>
+          <w:sz w:val="22"/>
+          <w:rtl w:val="1"/>
+          <w:cs/>
+        </w:rPr>
+        <w:t>מפתח RSA פרטי בפורמט PEM. הרשאות 0o600 (קריאה/כתיבה לבעל בלבד). נוצר אוטומטית בריצה ראשונה.</w:t>
+      </w:r>
+    </w:p>
+    <w:p>
+      <w:pPr>
+        <w:bidi w:val="1"/>
+        <w:pStyle w:val="Heading3"/>
+        <w:jc w:val="right"/>
+        <w:spacing w:before="100" w:after="40"/>
+      </w:pPr>
+      <w:r>
+        <w:rPr>
+          <w:rFonts w:ascii="Arial" w:hAnsi="Arial"/>
+          <w:rtl w:val="1"/>
+          <w:cs/>
+        </w:rPr>
+        <w:t>2.8.3 מבני נתונים בזיכרון</w:t>
+      </w:r>
+    </w:p>
+    <w:p>
+      <w:pPr>
+        <w:bidi w:val="1"/>
+        <w:pStyle w:val="ListBullet"/>
+        <w:jc w:val="right"/>
+        <w:spacing w:before="20" w:after="20" w:line="252" w:lineRule="auto"/>
+      </w:pPr>
+      <w:r>
+        <w:rPr>
+          <w:rFonts w:ascii="Arial" w:hAnsi="Arial"/>
+          <w:sz w:val="22"/>
+          <w:rtl w:val="1"/>
+          <w:cs/>
+        </w:rPr>
+        <w:t>BlackjackServer._clients : List[ClientHandler]</w:t>
+      </w:r>
+    </w:p>
+    <w:p>
+      <w:pPr>
+        <w:bidi w:val="1"/>
+        <w:pStyle w:val="ListBullet"/>
+        <w:jc w:val="right"/>
+        <w:spacing w:before="20" w:after="20" w:line="252" w:lineRule="auto"/>
+      </w:pPr>
+      <w:r>
+        <w:rPr>
+          <w:rFonts w:ascii="Arial" w:hAnsi="Arial"/>
+          <w:sz w:val="22"/>
+          <w:rtl w:val="1"/>
+          <w:cs/>
+        </w:rPr>
+        <w:t>BlackjackServer._online : Dict[str, ClientHandler]</w:t>
+      </w:r>
+    </w:p>
+    <w:p>
+      <w:pPr>
+        <w:bidi w:val="1"/>
+        <w:pStyle w:val="ListBullet"/>
+        <w:jc w:val="right"/>
+        <w:spacing w:before="20" w:after="20" w:line="252" w:lineRule="auto"/>
+      </w:pPr>
+      <w:r>
+        <w:rPr>
+          <w:rFonts w:ascii="Arial" w:hAnsi="Arial"/>
+          <w:sz w:val="22"/>
+          <w:rtl w:val="1"/>
+          <w:cs/>
+        </w:rPr>
+        <w:t>Table._players : List[Player]</w:t>
+      </w:r>
+    </w:p>
+    <w:p>
+      <w:pPr>
+        <w:bidi w:val="1"/>
+        <w:pStyle w:val="ListBullet"/>
+        <w:jc w:val="right"/>
+        <w:spacing w:before="20" w:after="20" w:line="252" w:lineRule="auto"/>
+      </w:pPr>
+      <w:r>
+        <w:rPr>
+          <w:rFonts w:ascii="Arial" w:hAnsi="Arial"/>
+          <w:sz w:val="22"/>
+          <w:rtl w:val="1"/>
+          <w:cs/>
+        </w:rPr>
+        <w:t>Deck._cards : List[Card]</w:t>
+      </w:r>
+    </w:p>
+    <w:p>
+      <w:pPr>
+        <w:bidi w:val="1"/>
+        <w:pStyle w:val="ListBullet"/>
+        <w:jc w:val="right"/>
+        <w:spacing w:before="20" w:after="20" w:line="252" w:lineRule="auto"/>
+      </w:pPr>
+      <w:r>
+        <w:rPr>
+          <w:rFonts w:ascii="Arial" w:hAnsi="Arial"/>
+          <w:sz w:val="22"/>
+          <w:rtl w:val="1"/>
+          <w:cs/>
+        </w:rPr>
+        <w:t>AppController._queue : queue.Queue</w:t>
+      </w:r>
+    </w:p>
+    <w:p>
+      <w:pPr>
+        <w:bidi w:val="1"/>
+        <w:pStyle w:val="Heading2"/>
+        <w:jc w:val="right"/>
+        <w:spacing w:before="160" w:after="60"/>
+        <w:pBdr>
+          <w:bottom w:val="single" w:sz="4" w:space="1" w:color="000000"/>
+        </w:pBdr>
+      </w:pPr>
+      <w:r>
+        <w:rPr>
+          <w:rFonts w:ascii="Arial" w:hAnsi="Arial"/>
+          <w:rtl w:val="1"/>
+          <w:cs/>
+        </w:rPr>
+        <w:t>2.9 סקירת חולשות ואיומים</w:t>
+      </w:r>
+    </w:p>
+    <w:p>
+      <w:pPr>
+        <w:bidi w:val="1"/>
+        <w:pStyle w:val="Heading3"/>
+        <w:jc w:val="right"/>
+        <w:spacing w:before="100" w:after="40"/>
+      </w:pPr>
+      <w:r>
+        <w:rPr>
+          <w:rFonts w:ascii="Arial" w:hAnsi="Arial"/>
+          <w:rtl w:val="1"/>
+          <w:cs/>
+        </w:rPr>
+        <w:t>2.9.1 שכבת האפליקציה</w:t>
       </w:r>
     </w:p>
     <w:tbl>
@@ -11446,7 +12527,7 @@
                 <w:rtl w:val="1"/>
                 <w:cs/>
               </w:rPr>
-              <w:t>שדה</w:t>
+              <w:t>איום</w:t>
             </w:r>
           </w:p>
         </w:tc>
@@ -11471,7 +12552,7 @@
                 <w:rtl w:val="1"/>
                 <w:cs/>
               </w:rPr>
-              <w:t>טיפוס</w:t>
+              <w:t>רלוונטי?</w:t>
             </w:r>
           </w:p>
         </w:tc>
@@ -11496,7 +12577,7 @@
                 <w:rtl w:val="1"/>
                 <w:cs/>
               </w:rPr>
-              <w:t>דוגמה</w:t>
+              <w:t>פתרון</w:t>
             </w:r>
           </w:p>
         </w:tc>
@@ -11522,7 +12603,7 @@
                 <w:rtl w:val="1"/>
                 <w:cs/>
               </w:rPr>
-              <w:t>username</w:t>
+              <w:t>SQL Injection</w:t>
             </w:r>
           </w:p>
         </w:tc>
@@ -11546,7 +12627,7 @@
                 <w:rtl w:val="1"/>
                 <w:cs/>
               </w:rPr>
-              <w:t>str (3-16 תווים, A-Za-z0-9_)</w:t>
+              <w:t>כן – SQLite בשימוש</w:t>
             </w:r>
           </w:p>
         </w:tc>
@@ -11570,734 +12651,7 @@
                 <w:rtl w:val="1"/>
                 <w:cs/>
               </w:rPr>
-              <w:t>"alice"</w:t>
-            </w:r>
-          </w:p>
-        </w:tc>
-      </w:tr>
-      <w:tr>
-        <w:tc>
-          <w:tcPr>
-            <w:tcW w:type="dxa" w:w="3213"/>
-            <w:vAlign w:val="center"/>
-          </w:tcPr>
-          <w:p>
-            <w:pPr>
-              <w:bidi w:val="1"/>
-              <w:jc w:val="right"/>
-              <w:spacing w:before="40" w:after="40"/>
-            </w:pPr>
-            <w:r>
-              <w:rPr>
-                <w:rFonts w:ascii="Arial" w:hAnsi="Arial"/>
-                <w:color w:val="1A1A1A"/>
-                <w:sz w:val="19"/>
-                <w:rtl w:val="1"/>
-                <w:cs/>
-              </w:rPr>
-              <w:t>password_hash</w:t>
-            </w:r>
-          </w:p>
-        </w:tc>
-        <w:tc>
-          <w:tcPr>
-            <w:tcW w:type="dxa" w:w="3213"/>
-            <w:vAlign w:val="center"/>
-          </w:tcPr>
-          <w:p>
-            <w:pPr>
-              <w:bidi w:val="1"/>
-              <w:jc w:val="right"/>
-              <w:spacing w:before="40" w:after="40"/>
-            </w:pPr>
-            <w:r>
-              <w:rPr>
-                <w:rFonts w:ascii="Arial" w:hAnsi="Arial"/>
-                <w:color w:val="1A1A1A"/>
-                <w:sz w:val="19"/>
-                <w:rtl w:val="1"/>
-                <w:cs/>
-              </w:rPr>
-              <w:t>str (salt_b64$hash_b64)</w:t>
-            </w:r>
-          </w:p>
-        </w:tc>
-        <w:tc>
-          <w:tcPr>
-            <w:tcW w:type="dxa" w:w="3213"/>
-            <w:vAlign w:val="center"/>
-          </w:tcPr>
-          <w:p>
-            <w:pPr>
-              <w:bidi w:val="1"/>
-              <w:jc w:val="right"/>
-              <w:spacing w:before="40" w:after="40"/>
-            </w:pPr>
-            <w:r>
-              <w:rPr>
-                <w:rFonts w:ascii="Arial" w:hAnsi="Arial"/>
-                <w:color w:val="1A1A1A"/>
-                <w:sz w:val="19"/>
-                <w:rtl w:val="1"/>
-                <w:cs/>
-              </w:rPr>
-              <w:t>"k4Ja…$g2Cv…"</w:t>
-            </w:r>
-          </w:p>
-        </w:tc>
-      </w:tr>
-      <w:tr>
-        <w:tc>
-          <w:tcPr>
-            <w:tcW w:type="dxa" w:w="3213"/>
-            <w:vAlign w:val="center"/>
-            <w:shd w:val="clear" w:color="auto" w:fill="F5F5F5"/>
-          </w:tcPr>
-          <w:p>
-            <w:pPr>
-              <w:bidi w:val="1"/>
-              <w:jc w:val="right"/>
-              <w:spacing w:before="40" w:after="40"/>
-            </w:pPr>
-            <w:r>
-              <w:rPr>
-                <w:rFonts w:ascii="Arial" w:hAnsi="Arial"/>
-                <w:color w:val="1A1A1A"/>
-                <w:sz w:val="19"/>
-                <w:rtl w:val="1"/>
-                <w:cs/>
-              </w:rPr>
-              <w:t>credits</w:t>
-            </w:r>
-          </w:p>
-        </w:tc>
-        <w:tc>
-          <w:tcPr>
-            <w:tcW w:type="dxa" w:w="3213"/>
-            <w:vAlign w:val="center"/>
-            <w:shd w:val="clear" w:color="auto" w:fill="F5F5F5"/>
-          </w:tcPr>
-          <w:p>
-            <w:pPr>
-              <w:bidi w:val="1"/>
-              <w:jc w:val="right"/>
-              <w:spacing w:before="40" w:after="40"/>
-            </w:pPr>
-            <w:r>
-              <w:rPr>
-                <w:rFonts w:ascii="Arial" w:hAnsi="Arial"/>
-                <w:color w:val="1A1A1A"/>
-                <w:sz w:val="19"/>
-                <w:rtl w:val="1"/>
-                <w:cs/>
-              </w:rPr>
-              <w:t>int &gt;= 0</w:t>
-            </w:r>
-          </w:p>
-        </w:tc>
-        <w:tc>
-          <w:tcPr>
-            <w:tcW w:type="dxa" w:w="3213"/>
-            <w:vAlign w:val="center"/>
-            <w:shd w:val="clear" w:color="auto" w:fill="F5F5F5"/>
-          </w:tcPr>
-          <w:p>
-            <w:pPr>
-              <w:bidi w:val="1"/>
-              <w:jc w:val="right"/>
-              <w:spacing w:before="40" w:after="40"/>
-            </w:pPr>
-            <w:r>
-              <w:rPr>
-                <w:rFonts w:ascii="Arial" w:hAnsi="Arial"/>
-                <w:color w:val="1A1A1A"/>
-                <w:sz w:val="19"/>
-                <w:rtl w:val="1"/>
-                <w:cs/>
-              </w:rPr>
-              <w:t>9750</w:t>
-            </w:r>
-          </w:p>
-        </w:tc>
-      </w:tr>
-      <w:tr>
-        <w:tc>
-          <w:tcPr>
-            <w:tcW w:type="dxa" w:w="3213"/>
-            <w:vAlign w:val="center"/>
-          </w:tcPr>
-          <w:p>
-            <w:pPr>
-              <w:bidi w:val="1"/>
-              <w:jc w:val="right"/>
-              <w:spacing w:before="40" w:after="40"/>
-            </w:pPr>
-            <w:r>
-              <w:rPr>
-                <w:rFonts w:ascii="Arial" w:hAnsi="Arial"/>
-                <w:color w:val="1A1A1A"/>
-                <w:sz w:val="19"/>
-                <w:rtl w:val="1"/>
-                <w:cs/>
-              </w:rPr>
-              <w:t>wins</w:t>
-            </w:r>
-          </w:p>
-        </w:tc>
-        <w:tc>
-          <w:tcPr>
-            <w:tcW w:type="dxa" w:w="3213"/>
-            <w:vAlign w:val="center"/>
-          </w:tcPr>
-          <w:p>
-            <w:pPr>
-              <w:bidi w:val="1"/>
-              <w:jc w:val="right"/>
-              <w:spacing w:before="40" w:after="40"/>
-            </w:pPr>
-            <w:r>
-              <w:rPr>
-                <w:rFonts w:ascii="Arial" w:hAnsi="Arial"/>
-                <w:color w:val="1A1A1A"/>
-                <w:sz w:val="19"/>
-                <w:rtl w:val="1"/>
-                <w:cs/>
-              </w:rPr>
-              <w:t>int &gt;= 0</w:t>
-            </w:r>
-          </w:p>
-        </w:tc>
-        <w:tc>
-          <w:tcPr>
-            <w:tcW w:type="dxa" w:w="3213"/>
-            <w:vAlign w:val="center"/>
-          </w:tcPr>
-          <w:p>
-            <w:pPr>
-              <w:bidi w:val="1"/>
-              <w:jc w:val="right"/>
-              <w:spacing w:before="40" w:after="40"/>
-            </w:pPr>
-            <w:r>
-              <w:rPr>
-                <w:rFonts w:ascii="Arial" w:hAnsi="Arial"/>
-                <w:color w:val="1A1A1A"/>
-                <w:sz w:val="19"/>
-                <w:rtl w:val="1"/>
-                <w:cs/>
-              </w:rPr>
-              <w:t>4</w:t>
-            </w:r>
-          </w:p>
-        </w:tc>
-      </w:tr>
-      <w:tr>
-        <w:tc>
-          <w:tcPr>
-            <w:tcW w:type="dxa" w:w="3213"/>
-            <w:vAlign w:val="center"/>
-            <w:shd w:val="clear" w:color="auto" w:fill="F5F5F5"/>
-          </w:tcPr>
-          <w:p>
-            <w:pPr>
-              <w:bidi w:val="1"/>
-              <w:jc w:val="right"/>
-              <w:spacing w:before="40" w:after="40"/>
-            </w:pPr>
-            <w:r>
-              <w:rPr>
-                <w:rFonts w:ascii="Arial" w:hAnsi="Arial"/>
-                <w:color w:val="1A1A1A"/>
-                <w:sz w:val="19"/>
-                <w:rtl w:val="1"/>
-                <w:cs/>
-              </w:rPr>
-              <w:t>losses</w:t>
-            </w:r>
-          </w:p>
-        </w:tc>
-        <w:tc>
-          <w:tcPr>
-            <w:tcW w:type="dxa" w:w="3213"/>
-            <w:vAlign w:val="center"/>
-            <w:shd w:val="clear" w:color="auto" w:fill="F5F5F5"/>
-          </w:tcPr>
-          <w:p>
-            <w:pPr>
-              <w:bidi w:val="1"/>
-              <w:jc w:val="right"/>
-              <w:spacing w:before="40" w:after="40"/>
-            </w:pPr>
-            <w:r>
-              <w:rPr>
-                <w:rFonts w:ascii="Arial" w:hAnsi="Arial"/>
-                <w:color w:val="1A1A1A"/>
-                <w:sz w:val="19"/>
-                <w:rtl w:val="1"/>
-                <w:cs/>
-              </w:rPr>
-              <w:t>int &gt;= 0</w:t>
-            </w:r>
-          </w:p>
-        </w:tc>
-        <w:tc>
-          <w:tcPr>
-            <w:tcW w:type="dxa" w:w="3213"/>
-            <w:vAlign w:val="center"/>
-            <w:shd w:val="clear" w:color="auto" w:fill="F5F5F5"/>
-          </w:tcPr>
-          <w:p>
-            <w:pPr>
-              <w:bidi w:val="1"/>
-              <w:jc w:val="right"/>
-              <w:spacing w:before="40" w:after="40"/>
-            </w:pPr>
-            <w:r>
-              <w:rPr>
-                <w:rFonts w:ascii="Arial" w:hAnsi="Arial"/>
-                <w:color w:val="1A1A1A"/>
-                <w:sz w:val="19"/>
-                <w:rtl w:val="1"/>
-                <w:cs/>
-              </w:rPr>
-              <w:t>2</w:t>
-            </w:r>
-          </w:p>
-        </w:tc>
-      </w:tr>
-      <w:tr>
-        <w:tc>
-          <w:tcPr>
-            <w:tcW w:type="dxa" w:w="3213"/>
-            <w:vAlign w:val="center"/>
-          </w:tcPr>
-          <w:p>
-            <w:pPr>
-              <w:bidi w:val="1"/>
-              <w:jc w:val="right"/>
-              <w:spacing w:before="40" w:after="40"/>
-            </w:pPr>
-            <w:r>
-              <w:rPr>
-                <w:rFonts w:ascii="Arial" w:hAnsi="Arial"/>
-                <w:color w:val="1A1A1A"/>
-                <w:sz w:val="19"/>
-                <w:rtl w:val="1"/>
-                <w:cs/>
-              </w:rPr>
-              <w:t>pushes</w:t>
-            </w:r>
-          </w:p>
-        </w:tc>
-        <w:tc>
-          <w:tcPr>
-            <w:tcW w:type="dxa" w:w="3213"/>
-            <w:vAlign w:val="center"/>
-          </w:tcPr>
-          <w:p>
-            <w:pPr>
-              <w:bidi w:val="1"/>
-              <w:jc w:val="right"/>
-              <w:spacing w:before="40" w:after="40"/>
-            </w:pPr>
-            <w:r>
-              <w:rPr>
-                <w:rFonts w:ascii="Arial" w:hAnsi="Arial"/>
-                <w:color w:val="1A1A1A"/>
-                <w:sz w:val="19"/>
-                <w:rtl w:val="1"/>
-                <w:cs/>
-              </w:rPr>
-              <w:t>int &gt;= 0</w:t>
-            </w:r>
-          </w:p>
-        </w:tc>
-        <w:tc>
-          <w:tcPr>
-            <w:tcW w:type="dxa" w:w="3213"/>
-            <w:vAlign w:val="center"/>
-          </w:tcPr>
-          <w:p>
-            <w:pPr>
-              <w:bidi w:val="1"/>
-              <w:jc w:val="right"/>
-              <w:spacing w:before="40" w:after="40"/>
-            </w:pPr>
-            <w:r>
-              <w:rPr>
-                <w:rFonts w:ascii="Arial" w:hAnsi="Arial"/>
-                <w:color w:val="1A1A1A"/>
-                <w:sz w:val="19"/>
-                <w:rtl w:val="1"/>
-                <w:cs/>
-              </w:rPr>
-              <w:t>1</w:t>
-            </w:r>
-          </w:p>
-        </w:tc>
-      </w:tr>
-    </w:tbl>
-    <w:p/>
-    <w:p>
-      <w:pPr>
-        <w:bidi w:val="1"/>
-        <w:jc w:val="right"/>
-        <w:spacing w:before="20" w:after="60" w:line="276" w:lineRule="auto"/>
-      </w:pPr>
-      <w:r>
-        <w:rPr>
-          <w:rFonts w:ascii="Arial" w:hAnsi="Arial"/>
-          <w:sz w:val="22"/>
-          <w:rtl w:val="1"/>
-          <w:cs/>
-        </w:rPr>
-        <w:t>כתיבה אטומית: נכתב ל‑profiles.json.tmp ואז os.replace.</w:t>
-      </w:r>
-    </w:p>
-    <w:p>
-      <w:pPr>
-        <w:bidi w:val="1"/>
-        <w:pStyle w:val="Heading3"/>
-        <w:jc w:val="right"/>
-        <w:spacing w:before="100" w:after="40"/>
-      </w:pPr>
-      <w:r>
-        <w:rPr>
-          <w:rFonts w:ascii="Arial" w:hAnsi="Arial"/>
-          <w:rtl w:val="1"/>
-          <w:cs/>
-        </w:rPr>
-        <w:t>2.8.2 קובץ server_rsa.pem</w:t>
-      </w:r>
-    </w:p>
-    <w:p>
-      <w:pPr>
-        <w:bidi w:val="1"/>
-        <w:jc w:val="right"/>
-        <w:spacing w:before="20" w:after="60" w:line="276" w:lineRule="auto"/>
-      </w:pPr>
-      <w:r>
-        <w:rPr>
-          <w:rFonts w:ascii="Arial" w:hAnsi="Arial"/>
-          <w:sz w:val="22"/>
-          <w:rtl w:val="1"/>
-          <w:cs/>
-        </w:rPr>
-        <w:t>מפתח RSA פרטי בפורמט PEM. הרשאות 0o600 (קריאה/כתיבה לבעל בלבד). נוצר אוטומטית בריצה ראשונה.</w:t>
-      </w:r>
-    </w:p>
-    <w:p>
-      <w:pPr>
-        <w:bidi w:val="1"/>
-        <w:pStyle w:val="Heading3"/>
-        <w:jc w:val="right"/>
-        <w:spacing w:before="100" w:after="40"/>
-      </w:pPr>
-      <w:r>
-        <w:rPr>
-          <w:rFonts w:ascii="Arial" w:hAnsi="Arial"/>
-          <w:rtl w:val="1"/>
-          <w:cs/>
-        </w:rPr>
-        <w:t>2.8.3 מבני נתונים בזיכרון</w:t>
-      </w:r>
-    </w:p>
-    <w:p>
-      <w:pPr>
-        <w:bidi w:val="1"/>
-        <w:pStyle w:val="ListBullet"/>
-        <w:jc w:val="right"/>
-        <w:spacing w:before="20" w:after="20" w:line="252" w:lineRule="auto"/>
-      </w:pPr>
-      <w:r>
-        <w:rPr>
-          <w:rFonts w:ascii="Arial" w:hAnsi="Arial"/>
-          <w:sz w:val="22"/>
-          <w:rtl w:val="1"/>
-          <w:cs/>
-        </w:rPr>
-        <w:t>ProfileManager.profiles : Dict[str, UserProfile]</w:t>
-      </w:r>
-    </w:p>
-    <w:p>
-      <w:pPr>
-        <w:bidi w:val="1"/>
-        <w:pStyle w:val="ListBullet"/>
-        <w:jc w:val="right"/>
-        <w:spacing w:before="20" w:after="20" w:line="252" w:lineRule="auto"/>
-      </w:pPr>
-      <w:r>
-        <w:rPr>
-          <w:rFonts w:ascii="Arial" w:hAnsi="Arial"/>
-          <w:sz w:val="22"/>
-          <w:rtl w:val="1"/>
-          <w:cs/>
-        </w:rPr>
-        <w:t>BlackjackServer._clients : List[ClientHandler]</w:t>
-      </w:r>
-    </w:p>
-    <w:p>
-      <w:pPr>
-        <w:bidi w:val="1"/>
-        <w:pStyle w:val="ListBullet"/>
-        <w:jc w:val="right"/>
-        <w:spacing w:before="20" w:after="20" w:line="252" w:lineRule="auto"/>
-      </w:pPr>
-      <w:r>
-        <w:rPr>
-          <w:rFonts w:ascii="Arial" w:hAnsi="Arial"/>
-          <w:sz w:val="22"/>
-          <w:rtl w:val="1"/>
-          <w:cs/>
-        </w:rPr>
-        <w:t>BlackjackServer._online : Dict[str, ClientHandler]</w:t>
-      </w:r>
-    </w:p>
-    <w:p>
-      <w:pPr>
-        <w:bidi w:val="1"/>
-        <w:pStyle w:val="ListBullet"/>
-        <w:jc w:val="right"/>
-        <w:spacing w:before="20" w:after="20" w:line="252" w:lineRule="auto"/>
-      </w:pPr>
-      <w:r>
-        <w:rPr>
-          <w:rFonts w:ascii="Arial" w:hAnsi="Arial"/>
-          <w:sz w:val="22"/>
-          <w:rtl w:val="1"/>
-          <w:cs/>
-        </w:rPr>
-        <w:t>Table._players : List[Player]</w:t>
-      </w:r>
-    </w:p>
-    <w:p>
-      <w:pPr>
-        <w:bidi w:val="1"/>
-        <w:pStyle w:val="ListBullet"/>
-        <w:jc w:val="right"/>
-        <w:spacing w:before="20" w:after="20" w:line="252" w:lineRule="auto"/>
-      </w:pPr>
-      <w:r>
-        <w:rPr>
-          <w:rFonts w:ascii="Arial" w:hAnsi="Arial"/>
-          <w:sz w:val="22"/>
-          <w:rtl w:val="1"/>
-          <w:cs/>
-        </w:rPr>
-        <w:t>Deck._cards : List[Card]</w:t>
-      </w:r>
-    </w:p>
-    <w:p>
-      <w:pPr>
-        <w:bidi w:val="1"/>
-        <w:pStyle w:val="ListBullet"/>
-        <w:jc w:val="right"/>
-        <w:spacing w:before="20" w:after="20" w:line="252" w:lineRule="auto"/>
-      </w:pPr>
-      <w:r>
-        <w:rPr>
-          <w:rFonts w:ascii="Arial" w:hAnsi="Arial"/>
-          <w:sz w:val="22"/>
-          <w:rtl w:val="1"/>
-          <w:cs/>
-        </w:rPr>
-        <w:t>AppController._queue : queue.Queue</w:t>
-      </w:r>
-    </w:p>
-    <w:p>
-      <w:pPr>
-        <w:bidi w:val="1"/>
-        <w:pStyle w:val="Heading2"/>
-        <w:jc w:val="right"/>
-        <w:spacing w:before="160" w:after="60"/>
-        <w:pBdr>
-          <w:bottom w:val="single" w:sz="4" w:space="1" w:color="000000"/>
-        </w:pBdr>
-      </w:pPr>
-      <w:r>
-        <w:rPr>
-          <w:rFonts w:ascii="Arial" w:hAnsi="Arial"/>
-          <w:rtl w:val="1"/>
-          <w:cs/>
-        </w:rPr>
-        <w:t>2.9 סקירת חולשות ואיומים</w:t>
-      </w:r>
-    </w:p>
-    <w:p>
-      <w:pPr>
-        <w:bidi w:val="1"/>
-        <w:pStyle w:val="Heading3"/>
-        <w:jc w:val="right"/>
-        <w:spacing w:before="100" w:after="40"/>
-      </w:pPr>
-      <w:r>
-        <w:rPr>
-          <w:rFonts w:ascii="Arial" w:hAnsi="Arial"/>
-          <w:rtl w:val="1"/>
-          <w:cs/>
-        </w:rPr>
-        <w:t>2.9.1 שכבת האפליקציה</w:t>
-      </w:r>
-    </w:p>
-    <w:tbl>
-      <w:tblPr>
-        <w:tblStyle w:val="TableGrid"/>
-        <w:tblW w:type="auto" w:w="0"/>
-        <w:jc w:val="center"/>
-        <w:tblLook w:firstColumn="1" w:firstRow="1" w:lastColumn="0" w:lastRow="0" w:noHBand="0" w:noVBand="1" w:val="04A0"/>
-      </w:tblPr>
-      <w:tblGrid>
-        <w:gridCol w:w="3024"/>
-        <w:gridCol w:w="3024"/>
-        <w:gridCol w:w="3024"/>
-      </w:tblGrid>
-      <w:tr>
-        <w:tc>
-          <w:tcPr>
-            <w:tcW w:type="dxa" w:w="3213"/>
-            <w:vAlign w:val="center"/>
-            <w:shd w:val="clear" w:color="auto" w:fill="D0D0D0"/>
-          </w:tcPr>
-          <w:p>
-            <w:pPr>
-              <w:bidi w:val="1"/>
-              <w:jc w:val="right"/>
-              <w:spacing w:before="40" w:after="40"/>
-            </w:pPr>
-            <w:r>
-              <w:rPr>
-                <w:rFonts w:ascii="Arial" w:hAnsi="Arial"/>
-                <w:b/>
-                <w:color w:val="1A1A1A"/>
-                <w:sz w:val="19"/>
-                <w:rtl w:val="1"/>
-                <w:cs/>
-              </w:rPr>
-              <w:t>איום</w:t>
-            </w:r>
-          </w:p>
-        </w:tc>
-        <w:tc>
-          <w:tcPr>
-            <w:tcW w:type="dxa" w:w="3213"/>
-            <w:vAlign w:val="center"/>
-            <w:shd w:val="clear" w:color="auto" w:fill="D0D0D0"/>
-          </w:tcPr>
-          <w:p>
-            <w:pPr>
-              <w:bidi w:val="1"/>
-              <w:jc w:val="right"/>
-              <w:spacing w:before="40" w:after="40"/>
-            </w:pPr>
-            <w:r>
-              <w:rPr>
-                <w:rFonts w:ascii="Arial" w:hAnsi="Arial"/>
-                <w:b/>
-                <w:color w:val="1A1A1A"/>
-                <w:sz w:val="19"/>
-                <w:rtl w:val="1"/>
-                <w:cs/>
-              </w:rPr>
-              <w:t>רלוונטי?</w:t>
-            </w:r>
-          </w:p>
-        </w:tc>
-        <w:tc>
-          <w:tcPr>
-            <w:tcW w:type="dxa" w:w="3213"/>
-            <w:vAlign w:val="center"/>
-            <w:shd w:val="clear" w:color="auto" w:fill="D0D0D0"/>
-          </w:tcPr>
-          <w:p>
-            <w:pPr>
-              <w:bidi w:val="1"/>
-              <w:jc w:val="right"/>
-              <w:spacing w:before="40" w:after="40"/>
-            </w:pPr>
-            <w:r>
-              <w:rPr>
-                <w:rFonts w:ascii="Arial" w:hAnsi="Arial"/>
-                <w:b/>
-                <w:color w:val="1A1A1A"/>
-                <w:sz w:val="19"/>
-                <w:rtl w:val="1"/>
-                <w:cs/>
-              </w:rPr>
-              <w:t>פתרון</w:t>
-            </w:r>
-          </w:p>
-        </w:tc>
-      </w:tr>
-      <w:tr>
-        <w:tc>
-          <w:tcPr>
-            <w:tcW w:type="dxa" w:w="3213"/>
-            <w:vAlign w:val="center"/>
-            <w:shd w:val="clear" w:color="auto" w:fill="F5F5F5"/>
-          </w:tcPr>
-          <w:p>
-            <w:pPr>
-              <w:bidi w:val="1"/>
-              <w:jc w:val="right"/>
-              <w:spacing w:before="40" w:after="40"/>
-            </w:pPr>
-            <w:r>
-              <w:rPr>
-                <w:rFonts w:ascii="Arial" w:hAnsi="Arial"/>
-                <w:color w:val="1A1A1A"/>
-                <w:sz w:val="19"/>
-                <w:rtl w:val="1"/>
-                <w:cs/>
-              </w:rPr>
-              <w:t>SQL Injection</w:t>
-            </w:r>
-          </w:p>
-        </w:tc>
-        <w:tc>
-          <w:tcPr>
-            <w:tcW w:type="dxa" w:w="3213"/>
-            <w:vAlign w:val="center"/>
-            <w:shd w:val="clear" w:color="auto" w:fill="F5F5F5"/>
-          </w:tcPr>
-          <w:p>
-            <w:pPr>
-              <w:bidi w:val="1"/>
-              <w:jc w:val="right"/>
-              <w:spacing w:before="40" w:after="40"/>
-            </w:pPr>
-            <w:r>
-              <w:rPr>
-                <w:rFonts w:ascii="Arial" w:hAnsi="Arial"/>
-                <w:color w:val="1A1A1A"/>
-                <w:sz w:val="19"/>
-                <w:rtl w:val="1"/>
-                <w:cs/>
-              </w:rPr>
-              <w:t>לא – אין DB יחסית</w:t>
-            </w:r>
-          </w:p>
-        </w:tc>
-        <w:tc>
-          <w:tcPr>
-            <w:tcW w:type="dxa" w:w="3213"/>
-            <w:vAlign w:val="center"/>
-            <w:shd w:val="clear" w:color="auto" w:fill="F5F5F5"/>
-          </w:tcPr>
-          <w:p>
-            <w:pPr>
-              <w:bidi w:val="1"/>
-              <w:jc w:val="right"/>
-              <w:spacing w:before="40" w:after="40"/>
-            </w:pPr>
-            <w:r>
-              <w:rPr>
-                <w:rFonts w:ascii="Arial" w:hAnsi="Arial"/>
-                <w:color w:val="1A1A1A"/>
-                <w:sz w:val="19"/>
-                <w:rtl w:val="1"/>
-                <w:cs/>
-              </w:rPr>
-              <w:t>–</w:t>
+              <w:t>כל שאילתה משתמשת בפרמטרים (?) ולא בשרשור מחרוזות; אין קלט משתמש שמוכנס ישירות ל‑SQL</w:t>
             </w:r>
           </w:p>
         </w:tc>
@@ -13757,7 +14111,34 @@
           <w:rtl w:val="1"/>
           <w:cs/>
         </w:rPr>
-        <w:t xml:space="preserve"> טוען/שומר profiles.json; רישום, אימות, שינוי קרדיטים, עדכון תוצאות.</w:t>
+        <w:t xml:space="preserve"> ממשק לבסיס הנתונים SQLite (profiles.db); רישום, אימות, שינוי קרדיטים, עדכון תוצאות.</w:t>
+      </w:r>
+    </w:p>
+    <w:p>
+      <w:pPr>
+        <w:bidi w:val="1"/>
+        <w:pStyle w:val="ListBullet"/>
+        <w:jc w:val="right"/>
+        <w:spacing w:before="20" w:after="20" w:line="252" w:lineRule="auto"/>
+      </w:pPr>
+      <w:r>
+        <w:rPr>
+          <w:rFonts w:ascii="Arial" w:hAnsi="Arial"/>
+          <w:b/>
+          <w:sz w:val="22"/>
+          <w:rtl w:val="1"/>
+          <w:cs/>
+        </w:rPr>
+        <w:t>תכונות:</w:t>
+      </w:r>
+      <w:r>
+        <w:rPr>
+          <w:rFonts w:ascii="Arial" w:hAnsi="Arial"/>
+          <w:sz w:val="22"/>
+          <w:rtl w:val="1"/>
+          <w:cs/>
+        </w:rPr>
+        <w:t xml:space="preserve"> _conn: sqlite3.Connection, _lock: RLock.</w:t>
       </w:r>
     </w:p>
     <w:p>
@@ -16689,7 +17070,7 @@
                 <w:rtl w:val="1"/>
                 <w:cs/>
               </w:rPr>
-              <w:t>profiles.json קיבל רשומה; GUI עבר לשולחן</w:t>
+              <w:t>רשומה נוצרה ב‑profiles.db; GUI עבר לשולחן</w:t>
             </w:r>
           </w:p>
         </w:tc>
@@ -19062,7 +19443,7 @@
                 <w:color w:val="1A1A1A"/>
                 <w:sz w:val="17"/>
               </w:rPr>
-              <w:t xml:space="preserve">    ├── profiles.json</w:t>
+              <w:t xml:space="preserve">    ├── profiles.db</w:t>
             </w:r>
           </w:p>
         </w:tc>

</xml_diff>

<commit_message>
Update server and client code with natural naming and improved documentation
Refactor internal class and method names for clarity, update docstrings and comments for improved readability, and adjust protocol constants.

Replit-Commit-Author: Agent
Replit-Commit-Session-Id: 0f7ed1f8-bcb2-4642-98d6-71d98ba108b2
Replit-Commit-Checkpoint-Type: full_checkpoint
Replit-Commit-Event-Id: f4f927b2-a13e-4d32-974d-71454e895abd
Replit-Helium-Checkpoint-Created: true
</commit_message>
<xml_diff>
--- a/blackjack/תיק_פרויקט.docx
+++ b/blackjack/תיק_פרויקט.docx
@@ -12455,7 +12455,7 @@
           <w:rtl w:val="1"/>
           <w:cs/>
         </w:rPr>
-        <w:t>AppController._queue : queue.Queue</w:t>
+        <w:t>AppController._msg_queue : queue.Queue</w:t>
       </w:r>
     </w:p>
     <w:p>
@@ -13012,7 +13012,7 @@
                 <w:rtl w:val="1"/>
                 <w:cs/>
               </w:rPr>
-              <w:t>_require_auth; snapshot_for מסתיר קלף נעלם</w:t>
+              <w:t>_must_be_logged_in; snapshot_for מסתיר קלף נעלם</w:t>
             </w:r>
           </w:p>
         </w:tc>
@@ -13610,7 +13610,7 @@
           <w:rtl w:val="1"/>
           <w:cs/>
         </w:rPr>
-        <w:t xml:space="preserve"> קלף בודד, immutable.</w:t>
+        <w:t xml:space="preserve"> קלף בודד, immutable – לא ניתן לשנות אחרי יצירה.</w:t>
       </w:r>
     </w:p>
     <w:p>
@@ -13664,7 +13664,7 @@
           <w:rtl w:val="1"/>
           <w:cs/>
         </w:rPr>
-        <w:t xml:space="preserve"> ולידציה; base_value; is_ace; to_dict/from_dict.</w:t>
+        <w:t xml:space="preserve"> ולידציה; point_value; is_ace; to_dict/from_dict.</w:t>
       </w:r>
     </w:p>
     <w:p>
@@ -13734,7 +13734,7 @@
           <w:rtl w:val="1"/>
           <w:cs/>
         </w:rPr>
-        <w:t xml:space="preserve"> _cards: list[Card], num_decks: int.</w:t>
+        <w:t xml:space="preserve"> _cards: list[Card], _num_decks: int.</w:t>
       </w:r>
     </w:p>
     <w:p>
@@ -13761,7 +13761,7 @@
           <w:rtl w:val="1"/>
           <w:cs/>
         </w:rPr>
-        <w:t xml:space="preserve"> reshuffle() – Fisher-Yates + secrets.randbelow; draw() → Card; __len__.</w:t>
+        <w:t xml:space="preserve"> shuffle() – Fisher-Yates + secrets.randbelow (קריפטוגרפי); draw() → Card; __len__.</w:t>
       </w:r>
     </w:p>
     <w:p>
@@ -13804,7 +13804,7 @@
           <w:rtl w:val="1"/>
           <w:cs/>
         </w:rPr>
-        <w:t xml:space="preserve"> יד של שחקן או דילר עם חישוב ערך חכם.</w:t>
+        <w:t xml:space="preserve"> יד של שחקן או דילר עם חישוב ערך חכם לאסים.</w:t>
       </w:r>
     </w:p>
     <w:p>
@@ -13874,7 +13874,7 @@
           <w:rtl w:val="1"/>
           <w:cs/>
         </w:rPr>
-        <w:t xml:space="preserve"> עטיפה ל‑Fernet לערוץ סימטרי.</w:t>
+        <w:t xml:space="preserve"> עטיפה ל‑Fernet – ערוץ סימטרי מוצפן לכל חיבור TCP.</w:t>
       </w:r>
     </w:p>
     <w:p>
@@ -13944,7 +13944,7 @@
           <w:rtl w:val="1"/>
           <w:cs/>
         </w:rPr>
-        <w:t xml:space="preserve"> מפתחות RSA-2048 של השרת.</w:t>
+        <w:t xml:space="preserve"> מפתחות RSA-2048 של השרת לחילוף מפתח session.</w:t>
       </w:r>
     </w:p>
     <w:p>
@@ -14014,7 +14014,7 @@
           <w:rtl w:val="1"/>
           <w:cs/>
         </w:rPr>
-        <w:t xml:space="preserve"> רשומת משתמש.</w:t>
+        <w:t xml:space="preserve"> ייצוג בזיכרון של חשבון שחקן אחד.</w:t>
       </w:r>
     </w:p>
     <w:p>
@@ -14068,7 +14068,7 @@
           <w:rtl w:val="1"/>
           <w:cs/>
         </w:rPr>
-        <w:t xml:space="preserve"> games_played; wl_ratio; to_public_dict().</w:t>
+        <w:t xml:space="preserve"> games_played; win_loss_ratio; to_dict().</w:t>
       </w:r>
     </w:p>
     <w:p>
@@ -14111,7 +14111,7 @@
           <w:rtl w:val="1"/>
           <w:cs/>
         </w:rPr>
-        <w:t xml:space="preserve"> ממשק לבסיס הנתונים SQLite (profiles.db); רישום, אימות, שינוי קרדיטים, עדכון תוצאות.</w:t>
+        <w:t xml:space="preserve"> ממשק ל‑SQLite (profiles.db); רישום, אימות, שינוי קרדיטים, עדכון תוצאות – בטוח ל‑threads.</w:t>
       </w:r>
     </w:p>
     <w:p>
@@ -14165,7 +14165,7 @@
           <w:rtl w:val="1"/>
           <w:cs/>
         </w:rPr>
-        <w:t xml:space="preserve"> register(u,p); authenticate(u,p); adjust_credits; record_result; get.</w:t>
+        <w:t xml:space="preserve"> register(u,p); authenticate(u,p); adjust_credits; record_result; get; _fetch.</w:t>
       </w:r>
     </w:p>
     <w:p>
@@ -14208,7 +14208,7 @@
           <w:rtl w:val="1"/>
           <w:cs/>
         </w:rPr>
-        <w:t xml:space="preserve"> enum של חמשת השלבים – WAITING, BETTING, PLAYING, DEALER, RESULTS.</w:t>
+        <w:t xml:space="preserve"> enum של חמשת שלבי הסבב – WAITING, BETTING, PLAYING, DEALER, RESULTS.</w:t>
       </w:r>
     </w:p>
     <w:p>
@@ -14224,7 +14224,7 @@
           <w:rtl w:val="1"/>
           <w:cs/>
         </w:rPr>
-        <w:t>Table (server/game.py)</w:t>
+        <w:t>RoundResult (server/game.py)</w:t>
       </w:r>
     </w:p>
     <w:p>
@@ -14251,7 +14251,23 @@
           <w:rtl w:val="1"/>
           <w:cs/>
         </w:rPr>
-        <w:t xml:space="preserve"> מכונת מצבים של שולחן בלאק‑ג'ק.</w:t>
+        <w:t xml:space="preserve"> dataclass עם תוצאת סבב לשחקן אחד (username, outcome, payout).</w:t>
+      </w:r>
+    </w:p>
+    <w:p>
+      <w:pPr>
+        <w:bidi w:val="1"/>
+        <w:pStyle w:val="Heading4"/>
+        <w:jc w:val="right"/>
+        <w:spacing w:before="60" w:after="20"/>
+      </w:pPr>
+      <w:r>
+        <w:rPr>
+          <w:rFonts w:ascii="Arial" w:hAnsi="Arial"/>
+          <w:rtl w:val="1"/>
+          <w:cs/>
+        </w:rPr>
+        <w:t>Table (server/game.py)</w:t>
       </w:r>
     </w:p>
     <w:p>
@@ -14269,7 +14285,7 @@
           <w:rtl w:val="1"/>
           <w:cs/>
         </w:rPr>
-        <w:t>תכונות:</w:t>
+        <w:t>תפקיד:</w:t>
       </w:r>
       <w:r>
         <w:rPr>
@@ -14278,7 +14294,7 @@
           <w:rtl w:val="1"/>
           <w:cs/>
         </w:rPr>
-        <w:t xml:space="preserve"> _players, _dealer, _deck, _phase, _lock: RLock, callbacks.</w:t>
+        <w:t xml:space="preserve"> מכונת מצבים של שולחן הבלאק‑ג'ק – מנהלת שחקנים, הימורים ותורות.</w:t>
       </w:r>
     </w:p>
     <w:p>
@@ -14296,6 +14312,33 @@
           <w:rtl w:val="1"/>
           <w:cs/>
         </w:rPr>
+        <w:t>תכונות:</w:t>
+      </w:r>
+      <w:r>
+        <w:rPr>
+          <w:rFonts w:ascii="Arial" w:hAnsi="Arial"/>
+          <w:sz w:val="22"/>
+          <w:rtl w:val="1"/>
+          <w:cs/>
+        </w:rPr>
+        <w:t xml:space="preserve"> _players, _dealer, _deck, _phase, lock: RLock, callbacks.</w:t>
+      </w:r>
+    </w:p>
+    <w:p>
+      <w:pPr>
+        <w:bidi w:val="1"/>
+        <w:pStyle w:val="ListBullet"/>
+        <w:jc w:val="right"/>
+        <w:spacing w:before="20" w:after="20" w:line="252" w:lineRule="auto"/>
+      </w:pPr>
+      <w:r>
+        <w:rPr>
+          <w:rFonts w:ascii="Arial" w:hAnsi="Arial"/>
+          <w:b/>
+          <w:sz w:val="22"/>
+          <w:rtl w:val="1"/>
+          <w:cs/>
+        </w:rPr>
         <w:t>פעולות:</w:t>
       </w:r>
       <w:r>
@@ -14305,7 +14348,7 @@
           <w:rtl w:val="1"/>
           <w:cs/>
         </w:rPr>
-        <w:t xml:space="preserve"> add_player; place_bet; player_action; _start_round_locked; _run_dealer_locked; _resolve_locked; snapshot_for(username).</w:t>
+        <w:t xml:space="preserve"> add_player; remove_player; place_bet; handle_action; _begin_round; _advance_turn; _dealer_turn; _score_round; reset_for_next_round; snapshot_for(username).</w:t>
       </w:r>
     </w:p>
     <w:p>
@@ -14348,7 +14391,7 @@
           <w:rtl w:val="1"/>
           <w:cs/>
         </w:rPr>
-        <w:t xml:space="preserve"> thread אחד לכל לקוח.</w:t>
+        <w:t xml:space="preserve"> thread אחד לכל לקוח – מחזיק socket וסשן מוצפן.</w:t>
       </w:r>
     </w:p>
     <w:p>
@@ -14375,7 +14418,7 @@
           <w:rtl w:val="1"/>
           <w:cs/>
         </w:rPr>
-        <w:t xml:space="preserve"> run(); _handshake(); _main_loop(); _dispatch(); _handle_login/register(); send(); shutdown().</w:t>
+        <w:t xml:space="preserve"> run(); _handshake(); _message_loop(); _handle(); _on_login/register(); send(); shutdown().</w:t>
       </w:r>
     </w:p>
     <w:p>
@@ -14418,7 +14461,7 @@
           <w:rtl w:val="1"/>
           <w:cs/>
         </w:rPr>
-        <w:t xml:space="preserve"> listening socket, accept loop, broadcasts, תזמון סבב.</w:t>
+        <w:t xml:space="preserve"> שרת ראשי – מקבל חיבורים, מחזיק שולחן, מתאם broadcasts.</w:t>
       </w:r>
     </w:p>
     <w:p>
@@ -14445,7 +14488,7 @@
           <w:rtl w:val="1"/>
           <w:cs/>
         </w:rPr>
-        <w:t xml:space="preserve"> serve_forever(); stop(); on_client_authenticated; on_client_disconnected; handle_place_bet; handle_action; handle_chat; _broadcast_state.</w:t>
+        <w:t xml:space="preserve"> serve_forever(); stop(); is_online; on_player_joined; on_player_left; on_bet; on_action; on_chat; _broadcast; _push_profile.</w:t>
       </w:r>
     </w:p>
     <w:p>
@@ -14461,7 +14504,7 @@
           <w:rtl w:val="1"/>
           <w:cs/>
         </w:rPr>
-        <w:t>BlackjackClient (client/network.py)</w:t>
+        <w:t>ServerConnection (client/network.py)</w:t>
       </w:r>
     </w:p>
     <w:p>
@@ -14488,7 +14531,7 @@
           <w:rtl w:val="1"/>
           <w:cs/>
         </w:rPr>
-        <w:t xml:space="preserve"> שכבת רשת בלקוח כולל thread קבלה.</w:t>
+        <w:t xml:space="preserve"> חיבור מוצפן מהלקוח לשרת, כולל thread האזנה ברקע.</w:t>
       </w:r>
     </w:p>
     <w:p>
@@ -14515,7 +14558,7 @@
           <w:rtl w:val="1"/>
           <w:cs/>
         </w:rPr>
-        <w:t xml:space="preserve"> connect(); _handshake(); send(); _recv_loop(); close().</w:t>
+        <w:t xml:space="preserve"> connect(); _handshake(); send(); _listen(); close().</w:t>
       </w:r>
     </w:p>
     <w:p>
@@ -14558,7 +14601,7 @@
           <w:rtl w:val="1"/>
           <w:cs/>
         </w:rPr>
-        <w:t xml:space="preserve"> בקר ראשי – מחבר בין רשת ל‑GUI.</w:t>
+        <w:t xml:space="preserve"> בקר ראשי – מחבר בין רשת ל‑GUI, מנהל מעברי מסך.</w:t>
       </w:r>
     </w:p>
     <w:p>
@@ -14585,7 +14628,7 @@
           <w:rtl w:val="1"/>
           <w:cs/>
         </w:rPr>
-        <w:t xml:space="preserve"> run(); send(); do_login; do_register; do_logout; _enqueue_message; _drain_messages; _handle_message; _show_login/_show_table.</w:t>
+        <w:t xml:space="preserve"> run(); send(); connect; login; register; logout; _on_server_message; _process_messages; _route_message; _show_login/_show_table.</w:t>
       </w:r>
     </w:p>
     <w:p>
@@ -14628,7 +14671,7 @@
           <w:rtl w:val="1"/>
           <w:cs/>
         </w:rPr>
-        <w:t xml:space="preserve"> סורק הודעות צ'אט עם Gemini.</w:t>
+        <w:t xml:space="preserve"> סינון צ'אט עם Gemini – מחזיר (allowed, reason) לכל הודעה.</w:t>
       </w:r>
     </w:p>
     <w:p>
@@ -14655,7 +14698,7 @@
           <w:rtl w:val="1"/>
           <w:cs/>
         </w:rPr>
-        <w:t xml:space="preserve"> check(message) → (allowed, reason).</w:t>
+        <w:t xml:space="preserve"> check(message) → (bool, str).</w:t>
       </w:r>
     </w:p>
     <w:p>
@@ -14698,7 +14741,7 @@
           <w:rtl w:val="1"/>
           <w:cs/>
         </w:rPr>
-        <w:t xml:space="preserve"> לוח בקרה גרפי לשרת.</w:t>
+        <w:t xml:space="preserve"> לוח בקרה גרפי לשרת – שחקנים, לוג, סטטוס משחק.</w:t>
       </w:r>
     </w:p>
     <w:p>
@@ -14725,7 +14768,7 @@
           <w:rtl w:val="1"/>
           <w:cs/>
         </w:rPr>
-        <w:t xml:space="preserve"> run(); _poll() כל 400ms; _kick_player(); _on_stop(); _refresh_players().</w:t>
+        <w:t xml:space="preserve"> run(); _poll() כל 400ms; _kick(username); _on_stop_click(); _update_player_list().</w:t>
       </w:r>
     </w:p>
     <w:p>
@@ -14856,7 +14899,7 @@
                 <w:color w:val="1A1A1A"/>
                 <w:sz w:val="17"/>
               </w:rPr>
-              <w:t xml:space="preserve">    total = sum(c.base_value for c in self._cards)   # all aces = 1</w:t>
+              <w:t xml:space="preserve">    total = sum(c.point_value for c in self._cards)  # all aces start as 1</w:t>
             </w:r>
           </w:p>
         </w:tc>
@@ -15038,7 +15081,7 @@
                 <w:color w:val="1A1A1A"/>
                 <w:sz w:val="17"/>
               </w:rPr>
-              <w:t>def reshuffle(self) -&gt; None:</w:t>
+              <w:t>def shuffle(self) -&gt; None:</w:t>
             </w:r>
           </w:p>
         </w:tc>
@@ -15104,7 +15147,7 @@
                 <w:color w:val="1A1A1A"/>
                 <w:sz w:val="17"/>
               </w:rPr>
-              <w:t xml:space="preserve">        for _ in range(self.num_decks)</w:t>
+              <w:t xml:space="preserve">        for _ in range(self._num_decks)</w:t>
             </w:r>
           </w:p>
         </w:tc>
@@ -15192,7 +15235,7 @@
                 <w:color w:val="1A1A1A"/>
                 <w:sz w:val="17"/>
               </w:rPr>
-              <w:t xml:space="preserve">    # Fisher-Yates with secrets.randbelow</w:t>
+              <w:t xml:space="preserve">    # Fisher-Yates with secrets.randbelow — קריפטוגרפי, לא ניתן לחיזוי</w:t>
             </w:r>
           </w:p>
         </w:tc>
@@ -18054,7 +18097,7 @@
                 <w:rtl w:val="1"/>
                 <w:cs/>
               </w:rPr>
-              <w:t>נוסף טיפול ב‑on_client_disconnected</w:t>
+              <w:t>נוסף טיפול ב‑on_player_left</w:t>
             </w:r>
           </w:p>
         </w:tc>

</xml_diff>

<commit_message>
Make project documentation more casual and update outdated references
Update internal references and rename outdated variables and functions across the project.

Replit-Commit-Author: Agent
Replit-Commit-Session-Id: 314dd189-f794-409f-8656-103e076d5671
Replit-Commit-Checkpoint-Type: full_checkpoint
Replit-Commit-Event-Id: 134382f4-5530-490c-98a1-020381e7fccc
Replit-Helium-Checkpoint-Created: true
</commit_message>
<xml_diff>
--- a/blackjack/תיק_פרויקט.docx
+++ b/blackjack/תיק_פרויקט.docx
@@ -183,7 +183,7 @@
           <w:rtl w:val="1"/>
           <w:cs/>
         </w:rPr>
-        <w:t>המוצר המוגמר כולל:</w:t>
+        <w:t>מה שנבנה בסופו של דבר:</w:t>
       </w:r>
     </w:p>
     <w:p>
@@ -210,7 +210,7 @@
           <w:rtl w:val="1"/>
           <w:cs/>
         </w:rPr>
-        <w:t xml:space="preserve"> – מקבל חיבורים, מנהל את חוקי המשחק, שומר פרופילי שחקנים ושומר נתונים לדיסק.</w:t>
+        <w:t xml:space="preserve"> – מקבל חיבורים, מנהל את חוקי המשחק, שומר פרופילי שחקנים ומחזיק הכול ב‑SQLite על הדיסק.</w:t>
       </w:r>
     </w:p>
     <w:p>
@@ -264,7 +264,7 @@
           <w:rtl w:val="1"/>
           <w:cs/>
         </w:rPr>
-        <w:t xml:space="preserve"> – חלון ניהול נפרד: רשימת שחקנים מחוברים, כפתור Kick, לוג צבעוני, סטטוס משחק ומונה הודעות Gemini.</w:t>
+        <w:t xml:space="preserve"> – חלון ניהול נפרד: רשימת שחקנים מחוברים, כפתור Kick לכל שחקן, לוג צבעוני ושלב המשחק הנוכחי.</w:t>
       </w:r>
     </w:p>
     <w:p>
@@ -282,7 +282,7 @@
           <w:rtl w:val="1"/>
           <w:cs/>
         </w:rPr>
-        <w:t>סינון צ'אט בינה מלאכותית (ChatModerator)</w:t>
+        <w:t>סינון צ'אט עם AI (ChatModerator)</w:t>
       </w:r>
       <w:r>
         <w:rPr>
@@ -291,7 +291,7 @@
           <w:rtl w:val="1"/>
           <w:cs/>
         </w:rPr>
-        <w:t xml:space="preserve"> – שולח כל הודעת צ'אט ל‑Gemini 2.5 Flash לפני שידורה. אם המפתח לא מוגדר, המשחק ממשיך לעבוד רגיל.</w:t>
+        <w:t xml:space="preserve"> – כל הודעת צ'אט עוברת דרך Gemini 2.5 Flash לפני שידורה. אם המפתח לא מוגדר, המשחק עובד בלעדיו בלי בעיה.</w:t>
       </w:r>
     </w:p>
     <w:p>
@@ -345,7 +345,7 @@
           <w:rtl w:val="1"/>
           <w:cs/>
         </w:rPr>
-        <w:t xml:space="preserve"> – סיסמאות מגובבות (PBKDF2), כל פעולה מחייבת הזדהות עם השרת.</w:t>
+        <w:t xml:space="preserve"> – סיסמאות מגובבות (PBKDF2), כל פעולה מחייבת שהשחקן מחובר ומאומת.</w:t>
       </w:r>
     </w:p>
     <w:p>
@@ -362,7 +362,7 @@
           <w:rtl w:val="1"/>
           <w:cs/>
         </w:rPr>
-        <w:t>מדוע בחרתי בפרויקט זה:</w:t>
+        <w:t>למה בחרתי בבלאק‑ג'ק:</w:t>
       </w:r>
       <w:r>
         <w:rPr>
@@ -371,7 +371,7 @@
           <w:rtl w:val="1"/>
           <w:cs/>
         </w:rPr>
-        <w:t xml:space="preserve"> בלאק‑ג'ק פשוט מספיק בחוקיו כדי שהמיקוד יישאר בנושאי החלופה – תקשורת, ריבוי לקוחות, שמירת מצב והגנת סייבר – אך מורכב מספיק כדי לדרוש מכונת מצבים, סנכרון בין שחקנים ולוגיקה של קלפים.</w:t>
+        <w:t xml:space="preserve"> הוא פשוט מספיק בחוקיו כדי שהמיקוד יישאר בנושאי החלופה – תקשורת, ריבוי לקוחות, שמירת מצב והגנת סייבר – אבל מורכב מספיק כדי לדרוש מכונת מצבים, סנכרון בין שחקנים ולוגיקת קלפים אמיתית.</w:t>
       </w:r>
     </w:p>
     <w:p>
@@ -388,7 +388,7 @@
           <w:rtl w:val="1"/>
           <w:cs/>
         </w:rPr>
-        <w:t>אתגרים שצפיתי:</w:t>
+        <w:t>אתגרים שידעתי שיחכו לי:</w:t>
       </w:r>
     </w:p>
     <w:p>
@@ -405,7 +405,7 @@
           <w:rtl w:val="1"/>
           <w:cs/>
         </w:rPr>
-        <w:t>תכנון פרוטוקול תקשורת שמתמודד עם הזרם הבלתי מוגדר של TCP.</w:t>
+        <w:t>לתכנן פרוטוקול תקשורת שמתמודד עם הזרם הבלתי מוגדר של TCP.</w:t>
       </w:r>
     </w:p>
     <w:p>
@@ -422,7 +422,7 @@
           <w:rtl w:val="1"/>
           <w:cs/>
         </w:rPr>
-        <w:t>ניהול ריבוי לקוחות במקביל בעזרת threads בלי race conditions.</w:t>
+        <w:t>לנהל ריבוי לקוחות בו‑זמנית עם threads בלי race conditions.</w:t>
       </w:r>
     </w:p>
     <w:p>
@@ -439,7 +439,7 @@
           <w:rtl w:val="1"/>
           <w:cs/>
         </w:rPr>
-        <w:t>מימוש נכון של לחיצת יד הצפנה אסימטרית–סימטרית וגיבוב סיסמאות.</w:t>
+        <w:t>לממש נכון לחיצת יד הצפנה אסימטרית–סימטרית וגיבוב סיסמאות.</w:t>
       </w:r>
     </w:p>
     <w:p>
@@ -456,7 +456,7 @@
           <w:rtl w:val="1"/>
           <w:cs/>
         </w:rPr>
-        <w:t>בניית מכונת מצבים שלא מאפשרת פעולה מחוץ לתור.</w:t>
+        <w:t>לבנות מכונת מצבים שפשוט לא מאפשרת פעולה מחוץ לתור.</w:t>
       </w:r>
     </w:p>
     <w:p>
@@ -488,7 +488,7 @@
           <w:rtl w:val="1"/>
           <w:cs/>
         </w:rPr>
-        <w:t>המערכת מיועדת לשני קהלים:</w:t>
+        <w:t>הפרויקט מכוון לשני קהלים:</w:t>
       </w:r>
     </w:p>
     <w:p>
@@ -506,7 +506,7 @@
           <w:rtl w:val="1"/>
           <w:cs/>
         </w:rPr>
-        <w:t>משתמשי קצה</w:t>
+        <w:t>שחקנים</w:t>
       </w:r>
       <w:r>
         <w:rPr>
@@ -515,7 +515,7 @@
           <w:rtl w:val="1"/>
           <w:cs/>
         </w:rPr>
-        <w:t xml:space="preserve"> – נערים ומבוגרים שרוצים משחק קלפים חברתי ברשת מקומית, בלי תשלום אמיתי.</w:t>
+        <w:t xml:space="preserve"> – כל אחד שרוצה משחק קלפים חברתי ברשת מקומית, בלי תשלום אמיתי.</w:t>
       </w:r>
     </w:p>
     <w:p>
@@ -542,7 +542,7 @@
           <w:rtl w:val="1"/>
           <w:cs/>
         </w:rPr>
-        <w:t xml:space="preserve"> – להדגמת עקרונות תקשורת מאובטחת, ריבוי לקוחות ואחסון מאובטח.</w:t>
+        <w:t xml:space="preserve"> – להדגמה חיה של הצפנה, threads, sockets ואחסון מאובטח.</w:t>
       </w:r>
     </w:p>
     <w:p>
@@ -575,7 +575,7 @@
           <w:rtl w:val="1"/>
           <w:cs/>
         </w:rPr>
-        <w:t>לאפשר למספר שחקנים לשחק בלאק‑ג'ק בו‑זמנית סביב שולחן אחד.</w:t>
+        <w:t>כמה שחקנים יכולים לשחק ביחד סביב אותו שולחן, בו‑זמנית.</w:t>
       </w:r>
     </w:p>
     <w:p>
@@ -592,7 +592,7 @@
           <w:rtl w:val="1"/>
           <w:cs/>
         </w:rPr>
-        <w:t>לאפשר הרשמה, התחברות ושמירת פרופיל (קרדיטים, ניצחונות, הפסדים, יחס W/L).</w:t>
+        <w:t>כל שחקן יכול להירשם, להתחבר ולראות את הפרופיל שלו (קרדיטים, ניצחונות, הפסדים, יחס W/L).</w:t>
       </w:r>
     </w:p>
     <w:p>
@@ -609,7 +609,7 @@
           <w:rtl w:val="1"/>
           <w:cs/>
         </w:rPr>
-        <w:t>להבטיח שכל התקשורת בין הלקוח לשרת מוצפנת ומאומתת.</w:t>
+        <w:t>כל התקשורת בין הלקוח לשרת מוצפנת ומאומתת – לא ניתן לקרוא אותה ב‑tcpdump.</w:t>
       </w:r>
     </w:p>
     <w:p>
@@ -626,7 +626,7 @@
           <w:rtl w:val="1"/>
           <w:cs/>
         </w:rPr>
-        <w:t>למנוע לקוח זדוני מלהשפיע על שחקנים אחרים או לזייף יתרה.</w:t>
+        <w:t>לקוח זדוני לא יכול להשפיע על שחקנים אחרים ולא לזייף יתרה.</w:t>
       </w:r>
     </w:p>
     <w:p>
@@ -643,7 +643,7 @@
           <w:rtl w:val="1"/>
           <w:cs/>
         </w:rPr>
-        <w:t>ממשק משתמש ברור ונוח.</w:t>
+        <w:t>ממשק פשוט וברור – גם מישהו שלא יודע כלום יוכל להתחיל לשחק.</w:t>
       </w:r>
     </w:p>
     <w:p>
@@ -660,7 +660,7 @@
           <w:rtl w:val="1"/>
           <w:cs/>
         </w:rPr>
-        <w:t>שמירת נתוני משתמשים בין הפעלות שרת.</w:t>
+        <w:t>פרופילים נשמרים בין הפעלות – השרת יכול להיסגר ולהיפתח מחדש בלי לאבד נתונים.</w:t>
       </w:r>
     </w:p>
     <w:p>
@@ -703,7 +703,7 @@
           <w:rtl w:val="1"/>
           <w:cs/>
         </w:rPr>
-        <w:t xml:space="preserve"> משחקי קלפים מקוונים קיימים הם בדרך כלל "קופסה שחורה" סגורה או דורשים תשתית ענן יקרה.</w:t>
+        <w:t xml:space="preserve"> רוב משחקי הקלפים המקוונים הם "קופסה שחורה" סגורה, או דורשים תשתית ענן ותשלום חודשי.</w:t>
       </w:r>
     </w:p>
     <w:p>
@@ -739,7 +739,7 @@
           <w:rtl w:val="1"/>
           <w:cs/>
         </w:rPr>
-        <w:t>חוויית משחק חברתית מקומית, בלי הרשמה לשירות חיצוני.</w:t>
+        <w:t>משחק חברתי ברשת מקומית, ללא הרשמה לאף שירות חיצוני.</w:t>
       </w:r>
     </w:p>
     <w:p>
@@ -757,7 +757,7 @@
           <w:rtl w:val="1"/>
           <w:cs/>
         </w:rPr>
-        <w:t>סביבת לימוד להבנת הצפנה, threads ו‑sockets.</w:t>
+        <w:t>סביבת לימוד מצוינת להבנת הצפנה, threads ו‑sockets על TCP גולמי.</w:t>
       </w:r>
     </w:p>
     <w:p>
@@ -775,7 +775,7 @@
           <w:rtl w:val="1"/>
           <w:cs/>
         </w:rPr>
-        <w:t>פרופילי משתמש שנשמרים בין הפעלות.</w:t>
+        <w:t>פרופילים נשמרים בין הפעלות – לא מאבדים את הנתונים כשסוגרים את השרת.</w:t>
       </w:r>
     </w:p>
     <w:p>
@@ -793,7 +793,7 @@
           <w:rtl w:val="1"/>
           <w:cs/>
         </w:rPr>
-        <w:t>שירותים:</w:t>
+        <w:t>שירותים שהמערכת מספקת:</w:t>
       </w:r>
       <w:r>
         <w:rPr>
@@ -802,7 +802,7 @@
           <w:rtl w:val="1"/>
           <w:cs/>
         </w:rPr>
-        <w:t xml:space="preserve"> הרשמה/התחברות, הימור, חלוקת קלפים, פעולות שחקן (Hit/Stand/Double), משחק דילר, חישוב תוצאות ותשלום, צ'אט, רענון מצב שולחן בזמן אמת.</w:t>
+        <w:t xml:space="preserve"> הרשמה/התחברות, הימור, חלוקת קלפים, Hit/Stand/Double, משחק דילר אוטומטי, חישוב תוצאות ותשלום, צ'אט, ורענון מצב שולחן בזמן אמת לכל שחקן.</w:t>
       </w:r>
     </w:p>
     <w:p>
@@ -1144,7 +1144,7 @@
           <w:rtl w:val="1"/>
           <w:cs/>
         </w:rPr>
-        <w:t xml:space="preserve">הפתרון שלי שונה בכך שהוא </w:t>
+        <w:t xml:space="preserve">הפרויקט שלי שונה: </w:t>
       </w:r>
       <w:r>
         <w:rPr>
@@ -1173,7 +1173,7 @@
           <w:rtl w:val="1"/>
           <w:cs/>
         </w:rPr>
-        <w:t>לחיצת יד מוצפנת שכתובה ידנית</w:t>
+        <w:t>לחיצת יד מוצפנת שכתבתי ידנית</w:t>
       </w:r>
       <w:r>
         <w:rPr>
@@ -1182,7 +1182,7 @@
           <w:rtl w:val="1"/>
           <w:cs/>
         </w:rPr>
-        <w:t xml:space="preserve"> ושמירת פרופילים ב‑SQLite מקומי – כך שכל שכבה ניתנת לקריאה ולהבנה.</w:t>
+        <w:t xml:space="preserve"> ושמירת פרופילים ב‑SQLite מקומי – כך שאפשר לקרוא ולהבין כל שכבה בעצמך.</w:t>
       </w:r>
     </w:p>
     <w:p>
@@ -1214,7 +1214,7 @@
           <w:rtl w:val="1"/>
           <w:cs/>
         </w:rPr>
-        <w:t>הפרויקט כולו ב‑</w:t>
+        <w:t>הכול ב‑</w:t>
       </w:r>
       <w:r>
         <w:rPr>
@@ -1233,7 +1233,7 @@
           <w:rtl w:val="1"/>
           <w:cs/>
         </w:rPr>
-        <w:t xml:space="preserve">. רוב הספריות סטנדרטיות (socket, threading, sqlite3, struct, secrets, hmac, hashlib, tkinter). ספריות חיצוניות: </w:t>
+        <w:t xml:space="preserve">. מרבית הספריות מגיעות עם Python (socket, threading, sqlite3, struct, secrets, hmac, hashlib, tkinter). שתי ספריות חיצוניות בלבד: </w:t>
       </w:r>
       <w:r>
         <w:rPr>
@@ -1271,7 +1271,7 @@
           <w:rtl w:val="1"/>
           <w:cs/>
         </w:rPr>
-        <w:t xml:space="preserve"> (Gemini AI לסינון צ'אט).</w:t>
+        <w:t xml:space="preserve"> (Gemini לסינון צ'אט).</w:t>
       </w:r>
     </w:p>
     <w:p>
@@ -1288,7 +1288,7 @@
           <w:rtl w:val="1"/>
           <w:cs/>
         </w:rPr>
-        <w:t>מגבלות:</w:t>
+        <w:t>מה לא מתאים לפרויקט הזה:</w:t>
       </w:r>
     </w:p>
     <w:p>
@@ -1305,7 +1305,7 @@
           <w:rtl w:val="1"/>
           <w:cs/>
         </w:rPr>
-        <w:t>מיועד לרשת מקומית אמינה; לא לאינטרנט פתוח (אין תעודת CA, אין הגנת DDoS מתוחכמת).</w:t>
+        <w:t>הוא לא בשביל אינטרנט פתוח – אין תעודת CA ואין הגנת DDoS מתוחכמת. מיועד לרשת מקומית.</w:t>
       </w:r>
     </w:p>
     <w:p>
@@ -1322,7 +1322,7 @@
           <w:rtl w:val="1"/>
           <w:cs/>
         </w:rPr>
-        <w:t>GUI מבוסס Tkinter דורש מערכת הפעלה עם תמיכה גרפית.</w:t>
+        <w:t>Tkinter דורש מערכת הפעלה עם תמיכה גרפית – לא יעבוד על שרת headless ללא X.</w:t>
       </w:r>
     </w:p>
     <w:p>
@@ -1355,7 +1355,7 @@
           <w:rtl w:val="1"/>
           <w:cs/>
         </w:rPr>
-        <w:t>מה הפרויקט כולל:</w:t>
+        <w:t>מה יש בפרויקט:</w:t>
       </w:r>
     </w:p>
     <w:p>
@@ -1372,7 +1372,7 @@
           <w:rtl w:val="1"/>
           <w:cs/>
         </w:rPr>
-        <w:t>תקשורת TCP sockets ובניית פרוטוקול מותאם אישית.</w:t>
+        <w:t>תקשורת TCP sockets ופרוטוקול הודעות מותאם.</w:t>
       </w:r>
     </w:p>
     <w:p>
@@ -1389,7 +1389,7 @@
           <w:rtl w:val="1"/>
           <w:cs/>
         </w:rPr>
-        <w:t>ריבוי לקוחות בעזרת threads.</w:t>
+        <w:t>ריבוי לקוחות מקביל עם threads.</w:t>
       </w:r>
     </w:p>
     <w:p>
@@ -1406,7 +1406,7 @@
           <w:rtl w:val="1"/>
           <w:cs/>
         </w:rPr>
-        <w:t>הצפנה היברידית (RSA-2048 + Fernet/AES-128) ולחיצת יד.</w:t>
+        <w:t>הצפנה היברידית (RSA-2048 + Fernet/AES-128) ולחיצת יד מלאה.</w:t>
       </w:r>
     </w:p>
     <w:p>
@@ -1423,7 +1423,7 @@
           <w:rtl w:val="1"/>
           <w:cs/>
         </w:rPr>
-        <w:t>גיבוב סיסמאות (PBKDF2-HMAC-SHA256 עם salt).</w:t>
+        <w:t>גיבוב סיסמאות (PBKDF2-HMAC-SHA256 + salt ייחודי לכל משתמש).</w:t>
       </w:r>
     </w:p>
     <w:p>
@@ -1440,7 +1440,7 @@
           <w:rtl w:val="1"/>
           <w:cs/>
         </w:rPr>
-        <w:t>שמירת נתונים במסד נתונים SQLite.</w:t>
+        <w:t>מסד נתונים SQLite לשמירת פרופילים.</w:t>
       </w:r>
     </w:p>
     <w:p>
@@ -1457,7 +1457,7 @@
           <w:rtl w:val="1"/>
           <w:cs/>
         </w:rPr>
-        <w:t>ממשק משתמש גרפי ב‑Tkinter.</w:t>
+        <w:t>ממשק גרפי ב‑Tkinter לשחקנים ולמנהל השרת.</w:t>
       </w:r>
     </w:p>
     <w:p>
@@ -1474,7 +1474,7 @@
           <w:rtl w:val="1"/>
           <w:cs/>
         </w:rPr>
-        <w:t>מכונת מצבים למשחק רב‑שלבי.</w:t>
+        <w:t>מכונת מצבים ל‑5 שלבי הסבב.</w:t>
       </w:r>
     </w:p>
     <w:p>
@@ -1491,7 +1491,7 @@
           <w:rtl w:val="1"/>
           <w:cs/>
         </w:rPr>
-        <w:t>מה הפרויקט לא כולל:</w:t>
+        <w:t>מה אין בפרויקט (ובכוונה):</w:t>
       </w:r>
     </w:p>
     <w:p>
@@ -1508,7 +1508,7 @@
           <w:rtl w:val="1"/>
           <w:cs/>
         </w:rPr>
-        <w:t>תשלומים אמיתיים או כסף.</w:t>
+        <w:t>כסף אמיתי או תשלומים.</w:t>
       </w:r>
     </w:p>
     <w:p>
@@ -1525,7 +1525,7 @@
           <w:rtl w:val="1"/>
           <w:cs/>
         </w:rPr>
-        <w:t>אחסון בענן / שרתים מבוזרים.</w:t>
+        <w:t>שרתים בענן או מבנה מבוזר.</w:t>
       </w:r>
     </w:p>
     <w:p>
@@ -1542,7 +1542,7 @@
           <w:rtl w:val="1"/>
           <w:cs/>
         </w:rPr>
-        <w:t>תאימות לדפדפן / WebSockets / מובייל.</w:t>
+        <w:t>דפדפן / WebSockets / אפליקציה מובייל.</w:t>
       </w:r>
     </w:p>
     <w:p>
@@ -1559,7 +1559,7 @@
           <w:rtl w:val="1"/>
           <w:cs/>
         </w:rPr>
-        <w:t>גרפיקה תלת‑ממדית.</w:t>
+        <w:t>גרפיקה מיוחדת מעבר לקלפים שמצוירים ב‑Tkinter.</w:t>
       </w:r>
     </w:p>
     <w:p>
@@ -1610,7 +1610,7 @@
           <w:rtl w:val="1"/>
           <w:cs/>
         </w:rPr>
-        <w:t>המערכת בנויה משני יישומים:</w:t>
+        <w:t>המערכת מורכבת משני יישומים נפרדים:</w:t>
       </w:r>
     </w:p>
     <w:p>
@@ -1637,7 +1637,7 @@
           <w:rtl w:val="1"/>
           <w:cs/>
         </w:rPr>
-        <w:t xml:space="preserve"> – בריצה ראשונה יוצר זוג מפתחות RSA, מאזין על פורט 5050, ומנהל חיבורי שחקנים בתהליכונים נפרדים.</w:t>
+        <w:t xml:space="preserve"> – בריצה ראשונה יוצר זוג מפתחות RSA ומאזין על פורט 5050. לכל לקוח שמתחבר נפתח thread נפרד.</w:t>
       </w:r>
     </w:p>
     <w:p>
@@ -1664,7 +1664,7 @@
           <w:rtl w:val="1"/>
           <w:cs/>
         </w:rPr>
-        <w:t xml:space="preserve"> – חלון Tkinter שמתחבר לשרת, מבצע לחיצת יד מוצפנת, ומציג מסך התחברות ומסך שולחן.</w:t>
+        <w:t xml:space="preserve"> – חלון Tkinter שמתחבר לשרת, מבצע לחיצת יד מוצפנת, ואז עובר למסך ההתחברות ומשם לשולחן.</w:t>
       </w:r>
     </w:p>
     <w:p>
@@ -1680,7 +1680,7 @@
           <w:rtl w:val="1"/>
           <w:cs/>
         </w:rPr>
-        <w:t>1.2.2 יכולות לפי סוג משתמש</w:t>
+        <w:t>1.2.2 מה השחקן יכול לעשות</w:t>
       </w:r>
     </w:p>
     <w:p>
@@ -1715,7 +1715,7 @@
           <w:rtl w:val="1"/>
           <w:cs/>
         </w:rPr>
-        <w:t>. יכולותיו:</w:t>
+        <w:t>. אלה הפעולות שהוא יכול לבצע:</w:t>
       </w:r>
     </w:p>
     <w:p>
@@ -1732,7 +1732,7 @@
           <w:rtl w:val="1"/>
           <w:cs/>
         </w:rPr>
-        <w:t>הרשמה (יצירת פרופיל עם 10,000 קרדיטים).</w:t>
+        <w:t>להירשם (נפתח פרופיל עם 10,000 קרדיטים).</w:t>
       </w:r>
     </w:p>
     <w:p>
@@ -1749,7 +1749,7 @@
           <w:rtl w:val="1"/>
           <w:cs/>
         </w:rPr>
-        <w:t>התחברות.</w:t>
+        <w:t>להתחבר לשרת קיים.</w:t>
       </w:r>
     </w:p>
     <w:p>
@@ -1766,7 +1766,7 @@
           <w:rtl w:val="1"/>
           <w:cs/>
         </w:rPr>
-        <w:t>הצטרפות לשולחן.</w:t>
+        <w:t>להצטרף לשולחן ולשחק עם השחקנים האחרים.</w:t>
       </w:r>
     </w:p>
     <w:p>
@@ -1783,7 +1783,7 @@
           <w:rtl w:val="1"/>
           <w:cs/>
         </w:rPr>
-        <w:t>הימור בכל סבב.</w:t>
+        <w:t>להמר בתחילת כל סבב.</w:t>
       </w:r>
     </w:p>
     <w:p>
@@ -1800,7 +1800,7 @@
           <w:rtl w:val="1"/>
           <w:cs/>
         </w:rPr>
-        <w:t>Hit, Stand, Double.</w:t>
+        <w:t>לבחור Hit, Stand, או Double בתורו.</w:t>
       </w:r>
     </w:p>
     <w:p>
@@ -1817,7 +1817,7 @@
           <w:rtl w:val="1"/>
           <w:cs/>
         </w:rPr>
-        <w:t>צפייה בקלפי הדילר ושחקנים אחרים.</w:t>
+        <w:t>לראות את קלפי הדילר ושל שחקנים אחרים בשולחן.</w:t>
       </w:r>
     </w:p>
     <w:p>
@@ -1834,7 +1834,7 @@
           <w:rtl w:val="1"/>
           <w:cs/>
         </w:rPr>
-        <w:t>צפייה בפרופיל ובסטטיסטיקה.</w:t>
+        <w:t>לעקוב אחר הפרופיל שלו – קרדיטים, ניצחונות, הפסדים ויחס W/L.</w:t>
       </w:r>
     </w:p>
     <w:p>
@@ -1851,7 +1851,7 @@
           <w:rtl w:val="1"/>
           <w:cs/>
         </w:rPr>
-        <w:t>צ'אט עם שחקנים אחרים.</w:t>
+        <w:t>לשוחח בצ'אט עם שחקנים אחרים.</w:t>
       </w:r>
     </w:p>
     <w:p>
@@ -1868,7 +1868,7 @@
           <w:rtl w:val="1"/>
           <w:cs/>
         </w:rPr>
-        <w:t>התנתקות.</w:t>
+        <w:t>להתנתק.</w:t>
       </w:r>
     </w:p>
     <w:p>
@@ -3923,7 +3923,7 @@
                 <w:rtl w:val="1"/>
                 <w:cs/>
               </w:rPr>
-              <w:t>RLock ב‑Table וב‑ProfileManager; כל פעולה תחת with self._lock</w:t>
+              <w:t>RLock ב‑Table וב‑ProfileManager; כל פעולה משנה‑מצב תחת with self._lock</w:t>
             </w:r>
           </w:p>
         </w:tc>
@@ -3994,7 +3994,7 @@
                 <w:rtl w:val="1"/>
                 <w:cs/>
               </w:rPr>
-              <w:t>החיבור נסגר בנימוס; הלקוח מציג "Failed to connect"</w:t>
+              <w:t>החיבור נסגר בנימוס; הלקוח מציג הודעת שגיאה</w:t>
             </w:r>
           </w:p>
         </w:tc>
@@ -4044,7 +4044,7 @@
                 <w:rtl w:val="1"/>
                 <w:cs/>
               </w:rPr>
-              <w:t>SQLite WAL mode – כתיבות אטומיות מובנות</w:t>
+              <w:t>SQLite WAL mode – כתיבות אטומיות</w:t>
             </w:r>
           </w:p>
         </w:tc>
@@ -4213,7 +4213,7 @@
                 <w:rtl w:val="1"/>
                 <w:cs/>
               </w:rPr>
-              <w:t>ממומש ב‑AppController._enqueue_message</w:t>
+              <w:t>ממומש ב‑AppController._on_server_message / _process_messages</w:t>
             </w:r>
           </w:p>
         </w:tc>
@@ -5071,7 +5071,7 @@
           <w:rtl w:val="1"/>
           <w:cs/>
         </w:rPr>
-        <w:t xml:space="preserve"> חלון Tkinter בזמן אמת: IP/פורט, רשימת שחקנים, Kick, לוג, שלב משחק, מונה Gemini, עצירת שרת.</w:t>
+        <w:t xml:space="preserve"> חלון Tkinter בזמן אמת: IP/פורט, רשימת שחקנים מחוברים, Kick, לוג צבעוני, שלב המשחק, ועצירת השרת.</w:t>
       </w:r>
     </w:p>
     <w:p>
@@ -5098,7 +5098,7 @@
           <w:rtl w:val="1"/>
           <w:cs/>
         </w:rPr>
-        <w:t xml:space="preserve"> Tk window, root.after() כל 400ms, גישה ל‑_online_usernames תחת lock.</w:t>
+        <w:t xml:space="preserve"> Tk window, root.after() כל 400ms, גישה ל‑_online תחת lock.</w:t>
       </w:r>
     </w:p>
     <w:p>
@@ -5125,7 +5125,7 @@
           <w:rtl w:val="1"/>
           <w:cs/>
         </w:rPr>
-        <w:t xml:space="preserve"> ServerApp, _PlayerRow, BlackjackServer.</w:t>
+        <w:t xml:space="preserve"> ServerApp, PlayerRow, BlackjackServer.</w:t>
       </w:r>
     </w:p>
     <w:p>
@@ -5211,7 +5211,7 @@
           <w:rtl w:val="1"/>
           <w:cs/>
         </w:rPr>
-        <w:t xml:space="preserve"> socket.connect, serialization, SecureChannel.generate, encrypt_session_key.</w:t>
+        <w:t xml:space="preserve"> socket.connect, SecureChannel.generate, encrypt_session_key.</w:t>
       </w:r>
     </w:p>
     <w:p>
@@ -5238,7 +5238,7 @@
           <w:rtl w:val="1"/>
           <w:cs/>
         </w:rPr>
-        <w:t xml:space="preserve"> BlackjackClient, SecureChannel.</w:t>
+        <w:t xml:space="preserve"> ServerConnection, SecureChannel.</w:t>
       </w:r>
     </w:p>
     <w:p>
@@ -5281,7 +5281,7 @@
           <w:rtl w:val="1"/>
           <w:cs/>
         </w:rPr>
-        <w:t xml:space="preserve"> שדות שם וסיסמה, שני כפתורים, הצגת תשובת שרת.</w:t>
+        <w:t xml:space="preserve"> שדות שם וסיסמה, שני כפתורים (Login ו‑Register), תשובת השרת מוצגת מתחת.</w:t>
       </w:r>
     </w:p>
     <w:p>
@@ -5308,7 +5308,7 @@
           <w:rtl w:val="1"/>
           <w:cs/>
         </w:rPr>
-        <w:t xml:space="preserve"> ttk.Frame, submit, טיפול בשגיאה.</w:t>
+        <w:t xml:space="preserve"> ttk.Frame, שליחת בקשה, טיפול בשגיאה.</w:t>
       </w:r>
     </w:p>
     <w:p>
@@ -5335,7 +5335,7 @@
           <w:rtl w:val="1"/>
           <w:cs/>
         </w:rPr>
-        <w:t xml:space="preserve"> LoginFrame, AppController.</w:t>
+        <w:t xml:space="preserve"> ConnectFrame, LoginFrame, AppController.</w:t>
       </w:r>
     </w:p>
     <w:p>
@@ -5378,7 +5378,7 @@
           <w:rtl w:val="1"/>
           <w:cs/>
         </w:rPr>
-        <w:t xml:space="preserve"> אזור דילר, אזור שחקנים, פרופיל אישי, שדה הימור, כפתורי פעולה.</w:t>
+        <w:t xml:space="preserve"> אזור דילר, אזור שחקנים עם הדגשה ל"(you)", פרופיל אישי בסרגל עליון, שדה הימור, כפתורי פעולה.</w:t>
       </w:r>
     </w:p>
     <w:p>
@@ -5405,7 +5405,7 @@
           <w:rtl w:val="1"/>
           <w:cs/>
         </w:rPr>
-        <w:t xml:space="preserve"> ציור קלף, סימון "(you)", איפשור/נטרול כפתורים לפי שלב.</w:t>
+        <w:t xml:space="preserve"> ציור קלף (_card_label), איפשור/נטרול כפתורים לפי שלב (_refresh_buttons).</w:t>
       </w:r>
     </w:p>
     <w:p>
@@ -5475,7 +5475,7 @@
           <w:rtl w:val="1"/>
           <w:cs/>
         </w:rPr>
-        <w:t xml:space="preserve"> הודעות מהרשת מגיעות ב‑thread רקע. נדחפות לתור, ה‑GUI מנקה ב‑root.after(0,...).</w:t>
+        <w:t xml:space="preserve"> הודעות מהרשת מגיעות ב‑thread רקע. נדחפות לתור, ה‑GUI מנקה אותן ב‑root.after(0,...) על ה‑main thread.</w:t>
       </w:r>
     </w:p>
     <w:p>
@@ -5502,7 +5502,7 @@
           <w:rtl w:val="1"/>
           <w:cs/>
         </w:rPr>
-        <w:t xml:space="preserve"> queue.Queue, callback, _drain_messages.</w:t>
+        <w:t xml:space="preserve"> queue.Queue, _on_server_message, _process_messages.</w:t>
       </w:r>
     </w:p>
     <w:p>
@@ -5572,7 +5572,7 @@
           <w:rtl w:val="1"/>
           <w:cs/>
         </w:rPr>
-        <w:t xml:space="preserve"> לחיצה מתורגמת להודעה מוצפנת לשרת.</w:t>
+        <w:t xml:space="preserve"> לחיצה מתורגמת להודעה מוצפנת שנשלחת לשרת.</w:t>
       </w:r>
     </w:p>
     <w:p>
@@ -5599,7 +5599,7 @@
           <w:rtl w:val="1"/>
           <w:cs/>
         </w:rPr>
-        <w:t xml:space="preserve"> ולידציה לפני שליחה, BlackjackClient.send, טיפול בכשל רשת.</w:t>
+        <w:t xml:space="preserve"> ולידציה לפני שליחה, ServerConnection.send, טיפול בכשל רשת.</w:t>
       </w:r>
     </w:p>
     <w:p>
@@ -5626,7 +5626,7 @@
           <w:rtl w:val="1"/>
           <w:cs/>
         </w:rPr>
-        <w:t xml:space="preserve"> TableFrame, AppController, BlackjackClient.</w:t>
+        <w:t xml:space="preserve"> TableFrame, AppController, ServerConnection.</w:t>
       </w:r>
     </w:p>
     <w:p>
@@ -5688,7 +5688,7 @@
           <w:rtl w:val="1"/>
           <w:cs/>
         </w:rPr>
-        <w:t xml:space="preserve">המערכת בארכיטקטורת </w:t>
+        <w:t xml:space="preserve">הפרויקט בנוי על </w:t>
       </w:r>
       <w:r>
         <w:rPr>
@@ -5698,7 +5698,7 @@
           <w:rtl w:val="1"/>
           <w:cs/>
         </w:rPr>
-        <w:t>לקוח‑שרת עם שרת מרכזי אחד</w:t>
+        <w:t>לקוח‑שרת קלאסי עם שרת מרכזי אחד</w:t>
       </w:r>
       <w:r>
         <w:rPr>
@@ -5707,7 +5707,7 @@
           <w:rtl w:val="1"/>
           <w:cs/>
         </w:rPr>
-        <w:t xml:space="preserve">. כל הקלפים, הקופה והכללים מנוהלים על ידי השרת. הלקוחות מציגים מצב ושולחים בקשות פעולה – הם </w:t>
+        <w:t xml:space="preserve">. כל הקלפים, הקופה, הכללים והחשבונות מנוהלים בשרת בלבד. הלקוח מציג את המצב ושולח פעולות – הוא </w:t>
       </w:r>
       <w:r>
         <w:rPr>
@@ -5717,7 +5717,7 @@
           <w:rtl w:val="1"/>
           <w:cs/>
         </w:rPr>
-        <w:t>לא מקור האמת</w:t>
+        <w:t>אף פעם לא מקור האמת</w:t>
       </w:r>
       <w:r>
         <w:rPr>
@@ -8216,7 +8216,7 @@
           <w:rtl w:val="1"/>
           <w:cs/>
         </w:rPr>
-        <w:t>בעיה:</w:t>
+        <w:t>הבעיה:</w:t>
       </w:r>
       <w:r>
         <w:rPr>
@@ -8225,7 +8225,7 @@
           <w:rtl w:val="1"/>
           <w:cs/>
         </w:rPr>
-        <w:t xml:space="preserve"> אס שווה 1 או 11 – יש לבחור את הצירוף המרבי שלא חוצה 21.</w:t>
+        <w:t xml:space="preserve"> אס שווה 1 או 11 – צריך לבחור את הצירוף שמקסם את הערך בלי לחצות 21.</w:t>
       </w:r>
     </w:p>
     <w:tbl>
@@ -8386,7 +8386,7 @@
                 <w:rtl w:val="1"/>
                 <w:cs/>
               </w:rPr>
-              <w:t>יקר</w:t>
+              <w:t>יקר ומסורבל</w:t>
             </w:r>
           </w:p>
         </w:tc>
@@ -8411,7 +8411,7 @@
                 <w:rtl w:val="1"/>
                 <w:cs/>
               </w:rPr>
-              <w:t>ספירת אסים כ‑1, "שדרוג" כל עוד לא חוצה 21</w:t>
+              <w:t>ספירת אסים כ‑1, "שדרוג" כל עוד לא חוצים 21</w:t>
             </w:r>
           </w:p>
         </w:tc>
@@ -8457,7 +8457,7 @@
                 <w:rtl w:val="1"/>
                 <w:cs/>
               </w:rPr>
-              <w:t>פשוט, מקובל בקזינו</w:t>
+              <w:t>פשוט, בדיוק מה שקזינואים עושים</w:t>
             </w:r>
           </w:p>
         </w:tc>
@@ -8478,7 +8478,7 @@
           <w:rtl w:val="1"/>
           <w:cs/>
         </w:rPr>
-        <w:t>נבחר:</w:t>
+        <w:t>הבחירה:</w:t>
       </w:r>
       <w:r>
         <w:rPr>
@@ -8520,7 +8520,7 @@
           <w:rtl w:val="1"/>
           <w:cs/>
         </w:rPr>
-        <w:t>בעיה:</w:t>
+        <w:t>הבעיה:</w:t>
       </w:r>
       <w:r>
         <w:rPr>
@@ -8529,7 +8529,7 @@
           <w:rtl w:val="1"/>
           <w:cs/>
         </w:rPr>
-        <w:t xml:space="preserve"> סדר קלפים שלא ניתן לחיזוי.</w:t>
+        <w:t xml:space="preserve"> סדר הקלפים חייב להיות בלתי ניתן לחיזוי.</w:t>
       </w:r>
     </w:p>
     <w:tbl>
@@ -8590,7 +8590,7 @@
                 <w:rtl w:val="1"/>
                 <w:cs/>
               </w:rPr>
-              <w:t>בעיה</w:t>
+              <w:t>הבעיה איתו</w:t>
             </w:r>
           </w:p>
         </w:tc>
@@ -8640,7 +8640,7 @@
                 <w:rtl w:val="1"/>
                 <w:cs/>
               </w:rPr>
-              <w:t>Mersenne Twister – ניתן לחיזוי לאחר 624 ערכים</w:t>
+              <w:t>Mersenne Twister – ניתן לחיזוי אחרי 624 ערכים</w:t>
             </w:r>
           </w:p>
         </w:tc>
@@ -8688,7 +8688,7 @@
                 <w:rtl w:val="1"/>
                 <w:cs/>
               </w:rPr>
-              <w:t>מקור אקראי קריפטוגרפי, לא ניתן לחיזוי</w:t>
+              <w:t>מקור אקראי קריפטוגרפי (/dev/urandom), לא ניתן לחיזוי</w:t>
             </w:r>
           </w:p>
         </w:tc>
@@ -8709,7 +8709,7 @@
           <w:rtl w:val="1"/>
           <w:cs/>
         </w:rPr>
-        <w:t>נבחר:</w:t>
+        <w:t>הבחירה:</w:t>
       </w:r>
       <w:r>
         <w:rPr>
@@ -8718,7 +8718,7 @@
           <w:rtl w:val="1"/>
           <w:cs/>
         </w:rPr>
-        <w:t xml:space="preserve"> Fisher-Yates עם secrets.randbelow. ראה common/deck.py → Deck.reshuffle.</w:t>
+        <w:t xml:space="preserve"> Fisher-Yates עם secrets.randbelow. ראה common/deck.py → Deck.shuffle.</w:t>
       </w:r>
     </w:p>
     <w:p>
@@ -8751,7 +8751,7 @@
           <w:rtl w:val="1"/>
           <w:cs/>
         </w:rPr>
-        <w:t>בעיה:</w:t>
+        <w:t>הבעיה:</w:t>
       </w:r>
       <w:r>
         <w:rPr>
@@ -8760,7 +8760,7 @@
           <w:rtl w:val="1"/>
           <w:cs/>
         </w:rPr>
-        <w:t xml:space="preserve"> אחסון בטוח שלא יאפשר שחזור אם הקובץ ייגנב.</w:t>
+        <w:t xml:space="preserve"> צריך לאחסן סיסמאות כך שאם מישהו יגנוב את הקובץ, הוא לא יוכל לשחזר אותן.</w:t>
       </w:r>
     </w:p>
     <w:tbl>
@@ -8821,7 +8821,7 @@
                 <w:rtl w:val="1"/>
                 <w:cs/>
               </w:rPr>
-              <w:t>בעיה</w:t>
+              <w:t>הבעיה איתו</w:t>
             </w:r>
           </w:p>
         </w:tc>
@@ -8847,7 +8847,7 @@
                 <w:rtl w:val="1"/>
                 <w:cs/>
               </w:rPr>
-              <w:t>MD5/SHA-1 פשוט</w:t>
+              <w:t>MD5 / SHA-1 פשוט</w:t>
             </w:r>
           </w:p>
         </w:tc>
@@ -8871,7 +8871,7 @@
                 <w:rtl w:val="1"/>
                 <w:cs/>
               </w:rPr>
-              <w:t>מהיר מדי, פגיע למילון ו‑rainbow tables</w:t>
+              <w:t>מהיר מדי – מיליוני ניחושים בשנייה, פגיע ל‑rainbow tables</w:t>
             </w:r>
           </w:p>
         </w:tc>
@@ -8919,7 +8919,7 @@
                 <w:rtl w:val="1"/>
                 <w:cs/>
               </w:rPr>
-              <w:t>200,000 איטרציות, כל ניחוש דורש עבודה יקרה</w:t>
+              <w:t>200,000 איטרציות – כל ניחוש בודד עולה המון זמן</w:t>
             </w:r>
           </w:p>
         </w:tc>
@@ -8940,7 +8940,7 @@
           <w:rtl w:val="1"/>
           <w:cs/>
         </w:rPr>
-        <w:t>נבחר:</w:t>
+        <w:t>הבחירה:</w:t>
       </w:r>
       <w:r>
         <w:rPr>
@@ -8949,7 +8949,7 @@
           <w:rtl w:val="1"/>
           <w:cs/>
         </w:rPr>
-        <w:t xml:space="preserve"> PBKDF2-HMAC-SHA256, 200,000 איטרציות, salt ייחודי לכל משתמש. חלק מ‑hashlib הסטנדרטית. ראה common/crypto.py.</w:t>
+        <w:t xml:space="preserve"> PBKDF2-HMAC-SHA256, 200,000 איטרציות, salt אקראי ייחודי לכל משתמש. חלק מ‑hashlib הסטנדרטית. ראה common/crypto.py.</w:t>
       </w:r>
     </w:p>
     <w:p>
@@ -8982,7 +8982,7 @@
           <w:rtl w:val="1"/>
           <w:cs/>
         </w:rPr>
-        <w:t>בעיה:</w:t>
+        <w:t>הבעיה:</w:t>
       </w:r>
       <w:r>
         <w:rPr>
@@ -8991,7 +8991,7 @@
           <w:rtl w:val="1"/>
           <w:cs/>
         </w:rPr>
-        <w:t xml:space="preserve"> TCP מספק זרם בתים, לא הודעות.</w:t>
+        <w:t xml:space="preserve"> TCP מספק זרם בתים רציף, לא הודעות מסודרות. צריך לדעת איפה הודעה אחת נגמרת והבאה מתחילה.</w:t>
       </w:r>
     </w:p>
     <w:tbl>
@@ -9052,7 +9052,7 @@
                 <w:rtl w:val="1"/>
                 <w:cs/>
               </w:rPr>
-              <w:t>יתרונות/חסרונות</w:t>
+              <w:t>הערה</w:t>
             </w:r>
           </w:p>
         </w:tc>
@@ -9078,7 +9078,7 @@
                 <w:rtl w:val="1"/>
                 <w:cs/>
               </w:rPr>
-              <w:t>delimiter (n\)</w:t>
+              <w:t>delimiter (\\n)</w:t>
             </w:r>
           </w:p>
         </w:tc>
@@ -9102,7 +9102,7 @@
                 <w:rtl w:val="1"/>
                 <w:cs/>
               </w:rPr>
-              <w:t>עלול להופיע בתוכן</w:t>
+              <w:t>עלול להופיע בתוך תוכן מוצפן</w:t>
             </w:r>
           </w:p>
         </w:tc>
@@ -9150,7 +9150,7 @@
                 <w:rtl w:val="1"/>
                 <w:cs/>
               </w:rPr>
-              <w:t>בינארי בטוח, פשוט, ניתן להגביל גודל</w:t>
+              <w:t>בינארי בטוח, פשוט, מאפשר הגבלת גודל לפני קריאה</w:t>
             </w:r>
           </w:p>
         </w:tc>
@@ -9171,7 +9171,7 @@
           <w:rtl w:val="1"/>
           <w:cs/>
         </w:rPr>
-        <w:t>נבחר:</w:t>
+        <w:t>הבחירה:</w:t>
       </w:r>
       <w:r>
         <w:rPr>
@@ -9180,7 +9180,7 @@
           <w:rtl w:val="1"/>
           <w:cs/>
         </w:rPr>
-        <w:t xml:space="preserve"> length-prefix big-endian 4 בתים + מגבלת 64 KB. ראה common/protocol.py.</w:t>
+        <w:t xml:space="preserve"> length-prefix big-endian 4 בתים + מגבלת 64 KB לפני כל קריאה. ראה common/protocol.py.</w:t>
       </w:r>
     </w:p>
     <w:p>
@@ -9213,7 +9213,7 @@
           <w:rtl w:val="1"/>
           <w:cs/>
         </w:rPr>
-        <w:t>בעיה:</w:t>
+        <w:t>הבעיה:</w:t>
       </w:r>
       <w:r>
         <w:rPr>
@@ -9222,7 +9222,7 @@
           <w:rtl w:val="1"/>
           <w:cs/>
         </w:rPr>
-        <w:t xml:space="preserve"> שחקנים עשויים לשלוח הודעות פוגעניות. רשימת מילים שחורות לא מספיקה – מחמיצה ניסוחים יצירתיים.</w:t>
+        <w:t xml:space="preserve"> שחקנים יכולים לשלוח הודעות פוגעניות. רשימת מילים שחורות לא מספיקה – קל מדי לעקוף אותה עם ניסוחים יצירתיים.</w:t>
       </w:r>
     </w:p>
     <w:tbl>
@@ -9283,7 +9283,7 @@
                 <w:rtl w:val="1"/>
                 <w:cs/>
               </w:rPr>
-              <w:t>חסרון</w:t>
+              <w:t>החיסרון</w:t>
             </w:r>
           </w:p>
         </w:tc>
@@ -9381,7 +9381,7 @@
                 <w:rtl w:val="1"/>
                 <w:cs/>
               </w:rPr>
-              <w:t>תלות נוספת</w:t>
+              <w:t>תלות חיצונית נוספת</w:t>
             </w:r>
           </w:p>
         </w:tc>
@@ -9431,7 +9431,7 @@
                 <w:rtl w:val="1"/>
                 <w:cs/>
               </w:rPr>
-              <w:t>מבין הקשר, עברית ואנגלית, מהיר</w:t>
+              <w:t>מבין הקשר, עברית ואנגלית, מהיר, ה‑API מוכן</w:t>
             </w:r>
           </w:p>
         </w:tc>
@@ -9452,7 +9452,7 @@
           <w:rtl w:val="1"/>
           <w:cs/>
         </w:rPr>
-        <w:t>נבחר:</w:t>
+        <w:t>הבחירה:</w:t>
       </w:r>
       <w:r>
         <w:rPr>
@@ -9461,7 +9461,7 @@
           <w:rtl w:val="1"/>
           <w:cs/>
         </w:rPr>
-        <w:t xml:space="preserve"> Gemini 2.5 Flash עם ה‑system prompt:</w:t>
+        <w:t xml:space="preserve"> Gemini 2.5 Flash עם ה‑system prompt הבא:</w:t>
       </w:r>
     </w:p>
     <w:p>
@@ -9515,7 +9515,7 @@
           <w:rtl w:val="1"/>
           <w:cs/>
         </w:rPr>
-        <w:t>. אם ה‑API לא זמין – ההודעה עוברת (pass-through mode).</w:t>
+        <w:t>. שאר השחקנים לא רואים כלום. אם ה‑API לא זמין – ההודעה עוברת כברירת מחדל (pass-through mode).</w:t>
       </w:r>
     </w:p>
     <w:p>
@@ -9649,7 +9649,7 @@
                 <w:color w:val="1A1A1A"/>
                 <w:sz w:val="17"/>
               </w:rPr>
-              <w:t xml:space="preserve">    self._server.handle_chat(self, text)</w:t>
+              <w:t xml:space="preserve">    self._server.on_chat(self, text)</w:t>
             </w:r>
           </w:p>
         </w:tc>
@@ -9706,7 +9706,7 @@
           <w:rtl w:val="1"/>
           <w:cs/>
         </w:rPr>
-        <w:t>ניהול חבילות: pip.</w:t>
+        <w:t>חבילות: pip install cryptography google-genai.</w:t>
       </w:r>
     </w:p>
     <w:p>
@@ -9723,7 +9723,7 @@
           <w:rtl w:val="1"/>
           <w:cs/>
         </w:rPr>
-        <w:t>חבילות: cryptography, google-genai.</w:t>
+        <w:t>git לניהול גרסאות.</w:t>
       </w:r>
     </w:p>
     <w:p>
@@ -9740,24 +9740,7 @@
           <w:rtl w:val="1"/>
           <w:cs/>
         </w:rPr>
-        <w:t>git לניהול גרסאות.</w:t>
-      </w:r>
-    </w:p>
-    <w:p>
-      <w:pPr>
-        <w:bidi w:val="1"/>
-        <w:pStyle w:val="ListBullet"/>
-        <w:jc w:val="right"/>
-        <w:spacing w:before="20" w:after="20" w:line="252" w:lineRule="auto"/>
-      </w:pPr>
-      <w:r>
-        <w:rPr>
-          <w:rFonts w:ascii="Arial" w:hAnsi="Arial"/>
-          <w:sz w:val="22"/>
-          <w:rtl w:val="1"/>
-          <w:cs/>
-        </w:rPr>
-        <w:t>בדיקות: הרצה ידנית של שרת ושני לקוחות; tcpdump לוידוא הצפנה; ls -l לבדיקת הרשאות.</w:t>
+        <w:t>בדיקות ידניות: שרת + שני לקוחות בו‑זמנית; tcpdump לוידוא שהתעבורה מוצפנת; ls -l לוידוא הרשאות PEM.</w:t>
       </w:r>
     </w:p>
     <w:p>
@@ -9819,7 +9802,7 @@
           <w:rtl w:val="1"/>
           <w:cs/>
         </w:rPr>
-        <w:t xml:space="preserve"> 4 בתים big-endian (אורך) + n בתים גוף. מגבלה: 0 &lt; n ≤ 65,536.</w:t>
+        <w:t xml:space="preserve"> 4 בתים big-endian (אורך) + n בתים גוף. מגבלה: 0 &lt; n ≤ 65,536 – כל ניסיון לשלוח יותר סוגר את החיבור.</w:t>
       </w:r>
     </w:p>
     <w:p>
@@ -9846,7 +9829,7 @@
           <w:rtl w:val="1"/>
           <w:cs/>
         </w:rPr>
-        <w:t xml:space="preserve"> עד סיום handshake – JSON גלוי. לאחר מכן – פלט Fernet (כולל HMAC).</w:t>
+        <w:t xml:space="preserve"> לפני סיום handshake – JSON גלוי. לאחר מכן – פלט Fernet (מוצפן + HMAC אוטומטי).</w:t>
       </w:r>
     </w:p>
     <w:p>
@@ -9873,7 +9856,25 @@
           <w:rtl w:val="1"/>
           <w:cs/>
         </w:rPr>
-        <w:t xml:space="preserve"> JSON עם המבנה {"type": "...", "data": {...}}. סוג ההודעה חייב להיות מתוך רשימה סגורה.</w:t>
+        <w:t xml:space="preserve"> JSON עם המבנה </w:t>
+      </w:r>
+      <w:r>
+        <w:rPr>
+          <w:rFonts w:ascii="Courier New" w:hAnsi="Courier New"/>
+          <w:sz w:val="18"/>
+          <w:rtl w:val="1"/>
+          <w:cs/>
+        </w:rPr>
+        <w:t>{"type": "...", "data": {...}}</w:t>
+      </w:r>
+      <w:r>
+        <w:rPr>
+          <w:rFonts w:ascii="Arial" w:hAnsi="Arial"/>
+          <w:sz w:val="22"/>
+          <w:rtl w:val="1"/>
+          <w:cs/>
+        </w:rPr>
+        <w:t>. סוג ההודעה חייב להיות מתוך רשימה סגורה – שאר הסוגים נדחים.</w:t>
       </w:r>
     </w:p>
     <w:p>
@@ -12577,7 +12578,7 @@
                 <w:rtl w:val="1"/>
                 <w:cs/>
               </w:rPr>
-              <w:t>פתרון</w:t>
+              <w:t>מה נעשה</w:t>
             </w:r>
           </w:p>
         </w:tc>
@@ -12627,7 +12628,7 @@
                 <w:rtl w:val="1"/>
                 <w:cs/>
               </w:rPr>
-              <w:t>כן – SQLite בשימוש</w:t>
+              <w:t>כן</w:t>
             </w:r>
           </w:p>
         </w:tc>
@@ -12651,7 +12652,7 @@
                 <w:rtl w:val="1"/>
                 <w:cs/>
               </w:rPr>
-              <w:t>כל שאילתה משתמשת בפרמטרים (?) ולא בשרשור מחרוזות; אין קלט משתמש שמוכנס ישירות ל‑SQL</w:t>
+              <w:t>כל שאילתה משתמשת בפרמטרים (?) – אין שרשור מחרוזות עם קלט משתמש</w:t>
             </w:r>
           </w:p>
         </w:tc>
@@ -12722,7 +12723,7 @@
                 <w:rtl w:val="1"/>
                 <w:cs/>
               </w:rPr>
-              <w:t>PBKDF2 + salt; hmac.compare_digest; הודעה גנרית; השהיה דמה; מניעת login כפול</w:t>
+              <w:t>PBKDF2 + salt; hmac.compare_digest (constant-time); הודעת שגיאה גנרית; מניעת login כפול</w:t>
             </w:r>
           </w:p>
         </w:tc>
@@ -12796,7 +12797,7 @@
                 <w:rtl w:val="1"/>
                 <w:cs/>
               </w:rPr>
-              <w:t>RSA-2048 + OAEP + Fernet; שינוי בית אחד זורק חריגה מיידית</w:t>
+              <w:t>RSA-2048 + OAEP + Fernet; שינוי בית אחד בחבילה זורק חריגה מיידית</w:t>
             </w:r>
           </w:p>
         </w:tc>
@@ -12867,7 +12868,7 @@
                 <w:rtl w:val="1"/>
                 <w:cs/>
               </w:rPr>
-              <w:t>מגבלת 64 KB; thread לכל לקוח; socket timeout</w:t>
+              <w:t>מגבלת 64 KB לפני קריאה; thread לכל לקוח; socket timeout</w:t>
             </w:r>
           </w:p>
         </w:tc>
@@ -12941,7 +12942,7 @@
                 <w:rtl w:val="1"/>
                 <w:cs/>
               </w:rPr>
-              <w:t>parser קפדני; VALID_TYPES; ProtocolError סוגר חיבור</w:t>
+              <w:t>parser קפדני עם רשימה סגורה; ProtocolError סוגר חיבור</w:t>
             </w:r>
           </w:p>
         </w:tc>
@@ -12966,7 +12967,7 @@
                 <w:rtl w:val="1"/>
                 <w:cs/>
               </w:rPr>
-              <w:t>גישה לנתוני משתמש אחר</w:t>
+              <w:t>גישה לנתוני שחקן אחר</w:t>
             </w:r>
           </w:p>
         </w:tc>
@@ -13012,7 +13013,7 @@
                 <w:rtl w:val="1"/>
                 <w:cs/>
               </w:rPr>
-              <w:t>_must_be_logged_in; snapshot_for מסתיר קלף נעלם</w:t>
+              <w:t>_must_be_logged_in; snapshot_for מסתיר את הקלף הנעלם של הדילר</w:t>
             </w:r>
           </w:p>
         </w:tc>
@@ -13038,7 +13039,7 @@
                 <w:rtl w:val="1"/>
                 <w:cs/>
               </w:rPr>
-              <w:t>Randomness חלש</w:t>
+              <w:t>אקראיות חלשה</w:t>
             </w:r>
           </w:p>
         </w:tc>
@@ -13086,7 +13087,7 @@
                 <w:rtl w:val="1"/>
                 <w:cs/>
               </w:rPr>
-              <w:t>secrets.randbelow (/dev/urandom), לא random</w:t>
+              <w:t>secrets.randbelow (/dev/urandom), לא random רגיל</w:t>
             </w:r>
           </w:p>
         </w:tc>
@@ -13157,7 +13158,7 @@
                 <w:rtl w:val="1"/>
                 <w:cs/>
               </w:rPr>
-              <w:t>רק כמשתנה סביבה; לא בקוד ולא בלוג</w:t>
+              <w:t>רק כמשתנה סביבה; לא בקוד, לא בלוג, לא ב‑git</w:t>
             </w:r>
           </w:p>
         </w:tc>
@@ -13194,7 +13195,7 @@
           <w:rtl w:val="1"/>
           <w:cs/>
         </w:rPr>
-        <w:t>TCP – לחיצת יד משולשת מנוהלת על ידי מערכת ההפעלה.</w:t>
+        <w:t>TCP – לחיצת היד המשולשת מנוהלת על ידי מערכת ההפעלה; אין מה להוסיף כאן.</w:t>
       </w:r>
     </w:p>
     <w:p>
@@ -13211,7 +13212,7 @@
           <w:rtl w:val="1"/>
           <w:cs/>
         </w:rPr>
-        <w:t>הצפנה: hybrid handshake (RSA + Fernet) – סודיות + שלמות ללא TLS.</w:t>
+        <w:t>הצפנה: hybrid handshake (RSA + Fernet) – סודיות + שלמות, בלי להזדקק ל‑TLS מלא.</w:t>
       </w:r>
     </w:p>
     <w:p>
@@ -13228,7 +13229,7 @@
           <w:rtl w:val="1"/>
           <w:cs/>
         </w:rPr>
-        <w:t>recv_exact מבטיח שלא נקרא חצי הודעה.</w:t>
+        <w:t>_read_exactly מבטיח שלא נקרא חצי הודעה, גם כשה‑socket מחזיר פחות בתים ממה שביקשנו.</w:t>
       </w:r>
     </w:p>
     <w:p>
@@ -14787,7 +14788,7 @@
           <w:rtl w:val="1"/>
           <w:cs/>
         </w:rPr>
-        <w:t>3.2 קטעי קוד מרכזיים</w:t>
+        <w:t>3.2 קטעי קוד מרכזיים – כאן אפשר לראות את העקרונות בפעולה</w:t>
       </w:r>
     </w:p>
     <w:p>
@@ -16926,7 +16927,7 @@
           <w:rtl w:val="1"/>
           <w:cs/>
         </w:rPr>
-        <w:t>3.3.1 בדיקות שתוכננו</w:t>
+        <w:t>3.3.1 בדיקות שתוכננו מראש</w:t>
       </w:r>
     </w:p>
     <w:tbl>
@@ -16989,7 +16990,7 @@
                 <w:rtl w:val="1"/>
                 <w:cs/>
               </w:rPr>
-              <w:t>מטרה</w:t>
+              <w:t>מה בדקתי</w:t>
             </w:r>
           </w:p>
         </w:tc>
@@ -17039,7 +17040,7 @@
                 <w:rtl w:val="1"/>
                 <w:cs/>
               </w:rPr>
-              <w:t>בעיות ופתרון</w:t>
+              <w:t>באגים שנתקלתי בהם</w:t>
             </w:r>
           </w:p>
         </w:tc>
@@ -17113,7 +17114,7 @@
                 <w:rtl w:val="1"/>
                 <w:cs/>
               </w:rPr>
-              <w:t>רשומה נוצרה ב‑profiles.db; GUI עבר לשולחן</w:t>
+              <w:t>רשומה נוצרה ב‑profiles.db; GUI עבר ישר לשולחן</w:t>
             </w:r>
           </w:p>
         </w:tc>
@@ -17185,7 +17186,7 @@
                 <w:rtl w:val="1"/>
                 <w:cs/>
               </w:rPr>
-              <w:t>מניעת רישום כפול</w:t>
+              <w:t>רישום כפול של אותו שם</w:t>
             </w:r>
           </w:p>
         </w:tc>
@@ -17305,7 +17306,7 @@
                 <w:rtl w:val="1"/>
                 <w:cs/>
               </w:rPr>
-              <w:t>"Invalid username or password" (גנרי)</w:t>
+              <w:t>"Invalid username or password" (גנרי, לא חושף אם המשתמש קיים)</w:t>
             </w:r>
           </w:p>
         </w:tc>
@@ -17329,7 +17330,7 @@
                 <w:rtl w:val="1"/>
                 <w:cs/>
               </w:rPr>
-              <w:t>בגרסה ראשונה חשף "unknown user"; תוקן</w:t>
+              <w:t>בגרסה ראשונה חשפתי "unknown user"; תוקן</w:t>
             </w:r>
           </w:p>
         </w:tc>
@@ -17377,7 +17378,7 @@
                 <w:rtl w:val="1"/>
                 <w:cs/>
               </w:rPr>
-              <w:t>login כפול</w:t>
+              <w:t>login כפול מאותו שחקן</w:t>
             </w:r>
           </w:p>
         </w:tc>
@@ -17400,7 +17401,7 @@
                 <w:rtl w:val="1"/>
                 <w:cs/>
               </w:rPr>
-              <w:t>"User already logged in"; חיבור א' לא הופרע</w:t>
+              <w:t>"User already logged in"; החיבור הראשון לא הופרע</w:t>
             </w:r>
           </w:p>
         </w:tc>
@@ -17473,7 +17474,7 @@
                 <w:rtl w:val="1"/>
                 <w:cs/>
               </w:rPr>
-              <w:t>משחק מלא לשניים</w:t>
+              <w:t>משחק מלא לשני שחקנים</w:t>
             </w:r>
           </w:p>
         </w:tc>
@@ -17497,7 +17498,7 @@
                 <w:rtl w:val="1"/>
                 <w:cs/>
               </w:rPr>
-              <w:t>היתרות עודכנו נכון</w:t>
+              <w:t>היתרות עודכנו נכון; 3:2 על בלאק‑ג'ק</w:t>
             </w:r>
           </w:p>
         </w:tc>
@@ -17521,7 +17522,7 @@
                 <w:rtl w:val="1"/>
                 <w:cs/>
               </w:rPr>
-              <w:t>תשלום 3:2 לבלאק‑ג'ק – תוקן מ‑1:1</w:t>
+              <w:t>בהתחלה שילמתי 1:1 על בלאק‑ג'ק; תוקן</w:t>
             </w:r>
           </w:p>
         </w:tc>
@@ -17761,7 +17762,7 @@
                 <w:rtl w:val="1"/>
                 <w:cs/>
               </w:rPr>
-              <w:t>האזנה לרשת</w:t>
+              <w:t>האזנה לתעבורה עם tcpdump</w:t>
             </w:r>
           </w:p>
         </w:tc>
@@ -17784,7 +17785,7 @@
                 <w:rtl w:val="1"/>
                 <w:cs/>
               </w:rPr>
-              <w:t>אחרי handshake – רעש בינארי בלבד</w:t>
+              <w:t>אחרי handshake – רעש בינארי בלבד, לא קריא</w:t>
             </w:r>
           </w:p>
         </w:tc>
@@ -17881,7 +17882,7 @@
                 <w:rtl w:val="1"/>
                 <w:cs/>
               </w:rPr>
-              <w:t>חיבור נסגר, שרת המשיך</w:t>
+              <w:t>חיבור נסגר אוטומטית, שרת המשיך לעבוד</w:t>
             </w:r>
           </w:p>
         </w:tc>
@@ -17905,7 +17906,7 @@
                 <w:rtl w:val="1"/>
                 <w:cs/>
               </w:rPr>
-              <w:t>recv_frame מוסיף בדיקה לפני הקצאה</w:t>
+              <w:t>recv_frame בודק את הגודל לפני הקצאת מאגר</w:t>
             </w:r>
           </w:p>
         </w:tc>
@@ -17953,7 +17954,7 @@
                 <w:rtl w:val="1"/>
                 <w:cs/>
               </w:rPr>
-              <w:t>persistence אחרי restart</w:t>
+              <w:t>הפעלה מחדש של השרת</w:t>
             </w:r>
           </w:p>
         </w:tc>
@@ -17976,7 +17977,7 @@
                 <w:rtl w:val="1"/>
                 <w:cs/>
               </w:rPr>
-              <w:t>קרדיטים ונתונים נשמרו</w:t>
+              <w:t>קרדיטים וניצחונות נשמרו</w:t>
             </w:r>
           </w:p>
         </w:tc>
@@ -18073,7 +18074,7 @@
                 <w:rtl w:val="1"/>
                 <w:cs/>
               </w:rPr>
-              <w:t>תור עבר הלאה; הימור נחשב הפסד</w:t>
+              <w:t>התור עבר אוטומטית הלאה; הימור נחשב הפסד</w:t>
             </w:r>
           </w:p>
         </w:tc>
@@ -18145,7 +18146,7 @@
                 <w:rtl w:val="1"/>
                 <w:cs/>
               </w:rPr>
-              <w:t>ולידציית שם משתמש</w:t>
+              <w:t>שם משתמש עם תווים מיוחדים</w:t>
             </w:r>
           </w:p>
         </w:tc>
@@ -18211,7 +18212,7 @@
           <w:rtl w:val="1"/>
           <w:cs/>
         </w:rPr>
-        <w:t>3.3.2 בדיקות נוספות</w:t>
+        <w:t>3.3.2 בדיקות שנוספו בהמשך</w:t>
       </w:r>
     </w:p>
     <w:tbl>
@@ -18274,7 +18275,7 @@
                 <w:rtl w:val="1"/>
                 <w:cs/>
               </w:rPr>
-              <w:t>מטרה</w:t>
+              <w:t>מה בדקתי</w:t>
             </w:r>
           </w:p>
         </w:tc>
@@ -18324,7 +18325,7 @@
                 <w:rtl w:val="1"/>
                 <w:cs/>
               </w:rPr>
-              <w:t>בעיות ופתרון</w:t>
+              <w:t>באגים שנתקלתי בהם</w:t>
             </w:r>
           </w:p>
         </w:tc>
@@ -18470,7 +18471,7 @@
                 <w:rtl w:val="1"/>
                 <w:cs/>
               </w:rPr>
-              <w:t>הרשאות PEM</w:t>
+              <w:t>הרשאות קובץ PEM</w:t>
             </w:r>
           </w:p>
         </w:tc>
@@ -18516,7 +18517,7 @@
                 <w:rtl w:val="1"/>
                 <w:cs/>
               </w:rPr>
-              <w:t>בתחילה 644; נוסף os.chmod לאחר שמירה</w:t>
+              <w:t>בהתחלה נשמר עם 644; נוסף os.chmod מיד אחרי השמירה</w:t>
             </w:r>
           </w:p>
         </w:tc>
@@ -18566,7 +18567,7 @@
                 <w:rtl w:val="1"/>
                 <w:cs/>
               </w:rPr>
-              <w:t>JSON שגוי אחרי handshake</w:t>
+              <w:t>JSON לא תקין אחרי handshake</w:t>
             </w:r>
           </w:p>
         </w:tc>
@@ -18662,7 +18663,7 @@
                 <w:rtl w:val="1"/>
                 <w:cs/>
               </w:rPr>
-              <w:t>10 לקוחות בו זמנית</w:t>
+              <w:t>10 לקוחות בו‑זמנית</w:t>
             </w:r>
           </w:p>
         </w:tc>
@@ -18758,7 +18759,7 @@
                 <w:rtl w:val="1"/>
                 <w:cs/>
               </w:rPr>
-              <w:t>secrets vs random</w:t>
+              <w:t>בדיקת אקראיות (secrets vs random)</w:t>
             </w:r>
           </w:p>
         </w:tc>
@@ -18854,7 +18855,7 @@
                 <w:rtl w:val="1"/>
                 <w:cs/>
               </w:rPr>
-              <w:t>אובדן רשת</w:t>
+              <w:t>ניתוק רשת פתאומי</w:t>
             </w:r>
           </w:p>
         </w:tc>
@@ -18877,7 +18878,7 @@
                 <w:rtl w:val="1"/>
                 <w:cs/>
               </w:rPr>
-              <w:t>"Connection lost"; חזרה למסך התחברות</w:t>
+              <w:t>"Connection lost"; חזרה למסך ההתחברות</w:t>
             </w:r>
           </w:p>
         </w:tc>
@@ -18931,7 +18932,7 @@
           <w:rtl w:val="1"/>
           <w:cs/>
         </w:rPr>
-        <w:t>4. מדריך למשתמש</w:t>
+        <w:t>4. מדריך למשתמש – איך מריצים את הפרויקט</w:t>
       </w:r>
     </w:p>
     <w:p>
@@ -19581,7 +19582,7 @@
           <w:rtl w:val="1"/>
           <w:cs/>
         </w:rPr>
-        <w:t>Linux / macOS / Windows.</w:t>
+        <w:t>Linux / macOS / Windows עם ממשק גרפי.</w:t>
       </w:r>
     </w:p>
     <w:p>
@@ -19598,7 +19599,7 @@
           <w:rtl w:val="1"/>
           <w:cs/>
         </w:rPr>
-        <w:t>pip פעיל.</w:t>
+        <w:t>pip זמין.</w:t>
       </w:r>
     </w:p>
     <w:p>
@@ -19615,7 +19616,7 @@
           <w:rtl w:val="1"/>
           <w:cs/>
         </w:rPr>
-        <w:t>רשת מקומית בה השרת והלקוחות יכולים לראות זה את זה.</w:t>
+        <w:t>רשת מקומית שבה השרת והלקוחות יכולים לתקשר.</w:t>
       </w:r>
     </w:p>
     <w:p>
@@ -19681,7 +19682,7 @@
           <w:rtl w:val="1"/>
           <w:cs/>
         </w:rPr>
-        <w:t>Tkinter כלול ב‑Python. בלינוקס אפשר שצריך:</w:t>
+        <w:t>Tkinter מגיע עם Python. בלינוקס, אם הוא לא מותקן:</w:t>
       </w:r>
     </w:p>
     <w:tbl>
@@ -19731,7 +19732,7 @@
           <w:rtl w:val="1"/>
           <w:cs/>
         </w:rPr>
-        <w:t xml:space="preserve">סינון צ'אט Gemini הוא </w:t>
+        <w:t xml:space="preserve">סינון הצ'אט עם Gemini הוא </w:t>
       </w:r>
       <w:r>
         <w:rPr>
@@ -19741,7 +19742,7 @@
           <w:rtl w:val="1"/>
           <w:cs/>
         </w:rPr>
-        <w:t>אופציונלי</w:t>
+        <w:t>אופציונלי לחלוטין</w:t>
       </w:r>
       <w:r>
         <w:rPr>
@@ -19750,7 +19751,7 @@
           <w:rtl w:val="1"/>
           <w:cs/>
         </w:rPr>
-        <w:t>. ללא GEMINI_API_KEY כל הודעה עוברת. להפעלה:</w:t>
+        <w:t xml:space="preserve"> – אם לא מגדירים מפתח, כל הודעה עוברת. כדי להפעיל:</w:t>
       </w:r>
     </w:p>
     <w:tbl>
@@ -19822,7 +19823,7 @@
           <w:rtl w:val="1"/>
           <w:cs/>
         </w:rPr>
-        <w:t>4.2.3 נתונים התחלתיים</w:t>
+        <w:t>4.2.3 מה קורה בפעם הראשונה</w:t>
       </w:r>
     </w:p>
     <w:p>
@@ -19839,7 +19840,7 @@
           <w:rtl w:val="1"/>
           <w:cs/>
         </w:rPr>
-        <w:t>אין משתמש ברירת מחדל – כל שחקן נרשם בעצמו.</w:t>
+        <w:t>אין חשבונות מוגדרים מראש – כל שחקן נרשם בעצמו.</w:t>
       </w:r>
     </w:p>
     <w:p>
@@ -19856,7 +19857,7 @@
           <w:rtl w:val="1"/>
           <w:cs/>
         </w:rPr>
-        <w:t xml:space="preserve">קרדיטים ראשוניים: </w:t>
+        <w:t xml:space="preserve">כל חשבון חדש מקבל </w:t>
       </w:r>
       <w:r>
         <w:rPr>
@@ -19866,7 +19867,7 @@
           <w:rtl w:val="1"/>
           <w:cs/>
         </w:rPr>
-        <w:t>10,000</w:t>
+        <w:t>10,000 קרדיטים</w:t>
       </w:r>
       <w:r>
         <w:rPr>
@@ -19911,7 +19912,7 @@
           <w:rtl w:val="1"/>
           <w:cs/>
         </w:rPr>
-        <w:t>.</w:t>
+        <w:t xml:space="preserve"> קרדיטים לסבב.</w:t>
       </w:r>
     </w:p>
     <w:p>
@@ -19927,7 +19928,7 @@
           <w:rtl w:val="1"/>
           <w:cs/>
         </w:rPr>
-        <w:t>4.2.4 רשת</w:t>
+        <w:t>4.2.4 הגדרת כתובת הרשת</w:t>
       </w:r>
     </w:p>
     <w:p>
@@ -19961,7 +19962,7 @@
           <w:rtl w:val="1"/>
           <w:cs/>
         </w:rPr>
-        <w:t>לשינוי:</w:t>
+        <w:t>לחיבור ממחשב אחר:</w:t>
       </w:r>
     </w:p>
     <w:tbl>
@@ -20011,7 +20012,7 @@
           <w:rtl w:val="1"/>
           <w:cs/>
         </w:rPr>
-        <w:t>4.2.5 דרישות חומרה מינימליות</w:t>
+        <w:t>4.2.5 דרישות חומרה</w:t>
       </w:r>
     </w:p>
     <w:p>
@@ -20027,7 +20028,7 @@
           <w:rtl w:val="1"/>
           <w:cs/>
         </w:rPr>
-        <w:t>מחשב 1 GHz, 512 MB RAM, פחות מ‑5 MB מקום פנוי.</w:t>
+        <w:t>מינימום: מחשב 1 GHz, 512 MB RAM, פחות מ‑5 MB מקום פנוי. כמעט כל מחשב יעבוד.</w:t>
       </w:r>
     </w:p>
     <w:p>
@@ -20079,7 +20080,7 @@
           <w:rtl w:val="1"/>
           <w:cs/>
         </w:rPr>
-        <w:t>א. מצב טרמינל:</w:t>
+        <w:t>א. מצב טרמינל (פשוט):</w:t>
       </w:r>
     </w:p>
     <w:tbl>
@@ -20130,7 +20131,7 @@
           <w:rtl w:val="1"/>
           <w:cs/>
         </w:rPr>
-        <w:t>ב. מצב לוח בקרה גרפי:</w:t>
+        <w:t>ב. מצב לוח בקרה גרפי (מומלץ):</w:t>
       </w:r>
     </w:p>
     <w:tbl>
@@ -20180,7 +20181,7 @@
           <w:rtl w:val="1"/>
           <w:cs/>
         </w:rPr>
-        <w:t>לעצירה: Ctrl+C או כפתור Stop Server.</w:t>
+        <w:t>לעצירה: Ctrl+C בטרמינל, או כפתור "Stop Server" בלוח הבקרה.</w:t>
       </w:r>
     </w:p>
     <w:p>
@@ -20246,7 +20247,7 @@
           <w:rtl w:val="1"/>
           <w:cs/>
         </w:rPr>
-        <w:t>נפתח חלון התחברות. יש להזין שם וסיסמה וללחוץ Register (פעם ראשונה) או Login.</w:t>
+        <w:t>נפתח חלון עם שדה הכתובת. מזינים את IP השרת, לוחצים Join, ואז נרשמים או מתחברים.</w:t>
       </w:r>
     </w:p>
     <w:p>
@@ -20280,7 +20281,7 @@
           <w:rtl w:val="1"/>
           <w:cs/>
         </w:rPr>
-        <w:t>מסך התחברות:</w:t>
+        <w:t>מסך חיבור לשרת:</w:t>
       </w:r>
       <w:r>
         <w:rPr>
@@ -20289,7 +20290,7 @@
           <w:rtl w:val="1"/>
           <w:cs/>
         </w:rPr>
-        <w:t xml:space="preserve"> "הקלד שם משתמש וסיסמה. אם עדיין לא נרשמת, לחץ Register."</w:t>
+        <w:t xml:space="preserve"> כתובת ופורט. ברירת מחדל: 127.0.0.1:5050.</w:t>
       </w:r>
     </w:p>
     <w:p>
@@ -20307,7 +20308,7 @@
           <w:rtl w:val="1"/>
           <w:cs/>
         </w:rPr>
-        <w:t>מסך שולחן – תחילת סבב:</w:t>
+        <w:t>מסך התחברות:</w:t>
       </w:r>
       <w:r>
         <w:rPr>
@@ -20316,7 +20317,7 @@
           <w:rtl w:val="1"/>
           <w:cs/>
         </w:rPr>
-        <w:t xml:space="preserve"> "הקלד הימור ולחץ Place Bet."</w:t>
+        <w:t xml:space="preserve"> שם וסיסמה → Register (בפעם הראשונה) או Login.</w:t>
       </w:r>
     </w:p>
     <w:p>
@@ -20334,7 +20335,7 @@
           <w:rtl w:val="1"/>
           <w:cs/>
         </w:rPr>
-        <w:t>מסך שולחן – תורך:</w:t>
+        <w:t>שולחן – תחילת סבב:</w:t>
       </w:r>
       <w:r>
         <w:rPr>
@@ -20343,7 +20344,7 @@
           <w:rtl w:val="1"/>
           <w:cs/>
         </w:rPr>
-        <w:t xml:space="preserve"> "לחץ Hit לקלף נוסף, Stand לעצירה, Double להכפלת הימור."</w:t>
+        <w:t xml:space="preserve"> הזן הימור ולחץ Place Bet.</w:t>
       </w:r>
     </w:p>
     <w:p>
@@ -20361,7 +20362,7 @@
           <w:rtl w:val="1"/>
           <w:cs/>
         </w:rPr>
-        <w:t>שלב דילר:</w:t>
+        <w:t>שולחן – התורך:</w:t>
       </w:r>
       <w:r>
         <w:rPr>
@@ -20370,7 +20371,7 @@
           <w:rtl w:val="1"/>
           <w:cs/>
         </w:rPr>
-        <w:t xml:space="preserve"> "הקלף הנעלם נחשף; הדילר לוקח קלפים אוטומטית."</w:t>
+        <w:t xml:space="preserve"> Hit לקלף נוסף, Stand לעצירה, Double להכפלת הימור.</w:t>
       </w:r>
     </w:p>
     <w:p>
@@ -20388,7 +20389,7 @@
           <w:rtl w:val="1"/>
           <w:cs/>
         </w:rPr>
-        <w:t>תוצאה:</w:t>
+        <w:t>שלב דילר:</w:t>
       </w:r>
       <w:r>
         <w:rPr>
@@ -20397,7 +20398,7 @@
           <w:rtl w:val="1"/>
           <w:cs/>
         </w:rPr>
-        <w:t xml:space="preserve"> "באנר זהב = ניצחת; אדום = הפסדת; אפור = פוש."</w:t>
+        <w:t xml:space="preserve"> הקלף הנעלם נחשף; הדילר מושך קלפים אוטומטית לפי הכללים.</w:t>
       </w:r>
     </w:p>
     <w:p>
@@ -20415,7 +20416,7 @@
           <w:rtl w:val="1"/>
           <w:cs/>
         </w:rPr>
-        <w:t>לוח בקרה שרת:</w:t>
+        <w:t>תוצאה:</w:t>
       </w:r>
       <w:r>
         <w:rPr>
@@ -20424,7 +20425,34 @@
           <w:rtl w:val="1"/>
           <w:cs/>
         </w:rPr>
-        <w:t xml:space="preserve"> "רשימת שחקנים עם Kick, לוג, שלב משחק ומונה Gemini."</w:t>
+        <w:t xml:space="preserve"> באנר זהב = ניצחת; אדום = הפסדת; אפור = פוש (החזר הימור).</w:t>
+      </w:r>
+    </w:p>
+    <w:p>
+      <w:pPr>
+        <w:bidi w:val="1"/>
+        <w:pStyle w:val="ListBullet"/>
+        <w:jc w:val="right"/>
+        <w:spacing w:before="20" w:after="20" w:line="252" w:lineRule="auto"/>
+      </w:pPr>
+      <w:r>
+        <w:rPr>
+          <w:rFonts w:ascii="Arial" w:hAnsi="Arial"/>
+          <w:b/>
+          <w:sz w:val="22"/>
+          <w:rtl w:val="1"/>
+          <w:cs/>
+        </w:rPr>
+        <w:t>לוח בקרה לשרת:</w:t>
+      </w:r>
+      <w:r>
+        <w:rPr>
+          <w:rFonts w:ascii="Arial" w:hAnsi="Arial"/>
+          <w:sz w:val="22"/>
+          <w:rtl w:val="1"/>
+          <w:cs/>
+        </w:rPr>
+        <w:t xml:space="preserve"> רשימת שחקנים + Kick, לוג צבעוני ושלב המשחק הנוכחי.</w:t>
       </w:r>
     </w:p>
     <w:p>
@@ -21257,7 +21285,7 @@
           <w:rtl w:val="1"/>
           <w:cs/>
         </w:rPr>
-        <w:t>נספח א' – הסבר טכנולוגיות</w:t>
+        <w:t>נספח א' – הסבר קצר על הטכנולוגיות</w:t>
       </w:r>
     </w:p>
     <w:p>
@@ -21289,7 +21317,7 @@
           <w:rtl w:val="1"/>
           <w:cs/>
         </w:rPr>
-        <w:t>RSA הוא הצפנה אסימטרית – מפתח ציבורי ופרטי. כל מה שמוצפן עם הציבורי ניתן לפיענוח רק עם הפרטי. משמש פעם אחת לכל חיבור להעברת מפתח Fernet. OAEP מוסיף אקראיות ומונע מתקפות על RSA.</w:t>
+        <w:t>RSA היא הצפנה אסימטרית: מפתח ציבורי לכולם, מפתח פרטי רק לשרת. מה שמוצפן עם הציבורי – רק הפרטי יכול לפענח. בפרויקט הזה RSA משמש פעם אחת בלבד לכל חיבור – להעברת מפתח ה‑Fernet. OAEP מוסיף אקראיות לכל הצפנה ומונע מתקפות סטטיסטיות על RSA.</w:t>
       </w:r>
     </w:p>
     <w:p>
@@ -21321,7 +21349,7 @@
           <w:rtl w:val="1"/>
           <w:cs/>
         </w:rPr>
-        <w:t>מפרט המבוסס על AES-128-CBC + HMAC-SHA256. כל שינוי בבית אחד מזוהה בפענוח. כולל timestamp שמגלה הודעות "ישנות".</w:t>
+        <w:t>מפרט הצפנה המבוסס על AES-128-CBC + HMAC-SHA256. כל שינוי בבית אחד בחבילה מוביל לכישלון פענוח. כולל timestamp שמאפשר לגלות הודעות "ישנות" שנשלחו מחדש.</w:t>
       </w:r>
     </w:p>
     <w:p>
@@ -21353,7 +21381,7 @@
           <w:rtl w:val="1"/>
           <w:cs/>
         </w:rPr>
-        <w:t>הפעלה חוזרת של HMAC על הסיסמה ו‑salt. 200,000 איטרציות הופכות כל ניחוש ליקר, מה שמקשה על brute-force.</w:t>
+        <w:t>הפעלה חוזרת ומכוונת של HMAC על הסיסמה ו‑salt. 200,000 איטרציות הופכות כל ניחוש בודד לפעולה יקרה חישובית – מה שהופך brute-force לבלתי כדאי.</w:t>
       </w:r>
     </w:p>
     <w:p>
@@ -21385,7 +21413,7 @@
           <w:rtl w:val="1"/>
           <w:cs/>
         </w:rPr>
-        <w:t>מקנה זרם בתים אמין בין שני קצוות. אנחנו בונים מעליו פרוטוקול הודעות עם length-prefix.</w:t>
+        <w:t>מקנה זרם בתים אמין בין שני קצוות הרשת. לא כולל מסגור הודעות – את זה אנחנו בונים בעצמנו עם length-prefix.</w:t>
       </w:r>
     </w:p>
     <w:p>
@@ -21417,7 +21445,7 @@
           <w:rtl w:val="1"/>
           <w:cs/>
         </w:rPr>
-        <w:t>Thread הוא נתיב ביצוע נוסף. RLock מבטיח שרק thread אחד משנה נתון בזמן נתון.</w:t>
+        <w:t>Thread הוא נתיב ביצוע מקביל בתוך אותו תהליך. RLock (Reentrant Lock) מבטיח שרק thread אחד יכול לשנות נתון מסוים בכל רגע נתון, ומונע race conditions.</w:t>
       </w:r>
     </w:p>
     <w:p>
@@ -21449,7 +21477,7 @@
           <w:rtl w:val="1"/>
           <w:cs/>
         </w:rPr>
-        <w:t>מודל שפה גדול של Google. בפרויקט זה Gemini 2.5 Flash מסווג הודעות צ'אט כ‑ALLOW או BLOCK. אם ה‑API לא זמין, ChatModerator מאפשר מעבר כברירת מחדל.</w:t>
+        <w:t>מודל שפה גדול של Google. בפרויקט, Gemini 2.5 Flash מסווג כל הודעת צ'אט כ‑ALLOW או BLOCK תוך שניות. אם ה‑API לא מוגדר או לא זמין, ChatModerator פשוט מעביר את ההודעה הלאה בלי לחסום.</w:t>
       </w:r>
     </w:p>
     <w:p>

</xml_diff>